<commit_message>
Use admin web screenshots in usage handoff
The vendor-facing usage report needs to answer where app-visible items are modified inside the admin web, so the report now uses admin web captures with editability and gap markers instead of app screenshots.

Constraint: Existing unrelated security DOCX change was left unstaged.

Rejected: App screenshot centered report | modification locations are admin web surfaces.

Confidence: high

Scope-risk: narrow

Directive: Keep this report focused on admin web modification surfaces; use app screenshots only as secondary references when explicitly requested.

Tested: python-docx reported 31 paragraphs, 8 tables, and 6 inline shapes.

Tested: unzip confirmed 6 embedded word/media images in the DOCX.

Tested: LibreOffice converted the DOCX to PDF and pdftoppm rendered 7 pages; inspected title and user-operation rendered pages.

Not-tested: Microsoft Word manual round-trip.
</commit_message>
<xml_diff>
--- a/docs/delivery/support/아가야_관리자_사용보고서.docx
+++ b/docs/delivery/support/아가야_관리자_사용보고서.docx
@@ -11,7 +11,6 @@
         <w:rPr>
           <w:rFonts w:ascii="Arial" w:hAnsi="Arial" w:eastAsia="Apple SD Gothic Neo"/>
           <w:b/>
-          <w:color w:val="000000"/>
           <w:sz w:val="44"/>
         </w:rPr>
         <w:t>아가야 관리자 사용 보고서</w:t>
@@ -28,7 +27,7 @@
           <w:color w:val="505050"/>
           <w:sz w:val="24"/>
         </w:rPr>
-        <w:t>앱 화면별 수정 가능 여부 및 관리자 수정 위치</w:t>
+        <w:t>관리자 웹 화면별 수정 가능 여부 및 구현 확인표</w:t>
       </w:r>
     </w:p>
     <w:p>
@@ -48,7 +47,7 @@
           <w:b w:val="0"/>
           <w:sz w:val="20"/>
         </w:rPr>
-        <w:t>목적: 외주 개발사가 앱 화면의 각 표시 영역을 어떤 관리자 화면에서 수정 가능하게 해야 하는지 확인할 수 있도록, 실제 앱 캡처와 판정 마크를 함께 정리합니다.</w:t>
+        <w:t>목적: 외주 개발사가 앱에서 보이는 각 영역을 관리자 웹의 어떤 화면에서 수정 가능하게 해야 하는지 확인할 수 있도록, 관리자 웹 캡처와 판정 마크를 함께 정리합니다.</w:t>
       </w:r>
     </w:p>
     <w:tbl>
@@ -67,14 +66,14 @@
         </w:tblBorders>
       </w:tblPr>
       <w:tblGrid>
-        <w:gridCol w:w="3360"/>
-        <w:gridCol w:w="3360"/>
-        <w:gridCol w:w="3360"/>
+        <w:gridCol w:w="3408"/>
+        <w:gridCol w:w="3408"/>
+        <w:gridCol w:w="3408"/>
       </w:tblGrid>
       <w:tr>
         <w:tc>
           <w:tcPr>
-            <w:tcW w:type="dxa" w:w="1584"/>
+            <w:tcW w:type="dxa" w:w="1728"/>
             <w:tcMar>
               <w:top w:w="80" w:type="dxa"/>
               <w:bottom w:w="80" w:type="dxa"/>
@@ -100,7 +99,7 @@
         </w:tc>
         <w:tc>
           <w:tcPr>
-            <w:tcW w:type="dxa" w:w="2880"/>
+            <w:tcW w:type="dxa" w:w="3456"/>
             <w:tcMar>
               <w:top w:w="80" w:type="dxa"/>
               <w:bottom w:w="80" w:type="dxa"/>
@@ -126,7 +125,7 @@
         </w:tc>
         <w:tc>
           <w:tcPr>
-            <w:tcW w:type="dxa" w:w="5472"/>
+            <w:tcW w:type="dxa" w:w="5040"/>
             <w:tcMar>
               <w:top w:w="80" w:type="dxa"/>
               <w:bottom w:w="80" w:type="dxa"/>
@@ -154,7 +153,7 @@
       <w:tr>
         <w:tc>
           <w:tcPr>
-            <w:tcW w:type="dxa" w:w="1584"/>
+            <w:tcW w:type="dxa" w:w="1728"/>
             <w:tcMar>
               <w:top w:w="80" w:type="dxa"/>
               <w:bottom w:w="80" w:type="dxa"/>
@@ -172,7 +171,7 @@
               <w:rPr>
                 <w:rFonts w:ascii="Arial" w:hAnsi="Arial" w:eastAsia="Apple SD Gothic Neo"/>
                 <w:b w:val="0"/>
-                <w:sz w:val="17"/>
+                <w:sz w:val="16"/>
               </w:rPr>
               <w:t>수정 가능</w:t>
             </w:r>
@@ -180,7 +179,7 @@
         </w:tc>
         <w:tc>
           <w:tcPr>
-            <w:tcW w:type="dxa" w:w="2880"/>
+            <w:tcW w:type="dxa" w:w="3456"/>
             <w:tcMar>
               <w:top w:w="80" w:type="dxa"/>
               <w:bottom w:w="80" w:type="dxa"/>
@@ -198,15 +197,15 @@
               <w:rPr>
                 <w:rFonts w:ascii="Arial" w:hAnsi="Arial" w:eastAsia="Apple SD Gothic Neo"/>
                 <w:b w:val="0"/>
-                <w:sz w:val="17"/>
+                <w:sz w:val="16"/>
               </w:rPr>
-              <w:t>현재 또는 목표 관리자에서 직접 수정되어야 하는 항목</w:t>
+              <w:t>해당 관리자 웹 화면에서 수정 가능해야 함</w:t>
             </w:r>
           </w:p>
         </w:tc>
         <w:tc>
           <w:tcPr>
-            <w:tcW w:type="dxa" w:w="5472"/>
+            <w:tcW w:type="dxa" w:w="5040"/>
             <w:tcMar>
               <w:top w:w="80" w:type="dxa"/>
               <w:bottom w:w="80" w:type="dxa"/>
@@ -224,9 +223,9 @@
               <w:rPr>
                 <w:rFonts w:ascii="Arial" w:hAnsi="Arial" w:eastAsia="Apple SD Gothic Neo"/>
                 <w:b w:val="0"/>
-                <w:sz w:val="17"/>
+                <w:sz w:val="16"/>
               </w:rPr>
-              <w:t>관리자 화면/필드가 있는지 확인하고 없으면 추가</w:t>
+              <w:t>저장 필드/API/앱 반영 캡처 증빙</w:t>
             </w:r>
           </w:p>
         </w:tc>
@@ -234,7 +233,7 @@
       <w:tr>
         <w:tc>
           <w:tcPr>
-            <w:tcW w:type="dxa" w:w="1584"/>
+            <w:tcW w:type="dxa" w:w="1728"/>
             <w:tcMar>
               <w:top w:w="80" w:type="dxa"/>
               <w:bottom w:w="80" w:type="dxa"/>
@@ -252,7 +251,7 @@
               <w:rPr>
                 <w:rFonts w:ascii="Arial" w:hAnsi="Arial" w:eastAsia="Apple SD Gothic Neo"/>
                 <w:b w:val="0"/>
-                <w:sz w:val="17"/>
+                <w:sz w:val="16"/>
               </w:rPr>
               <w:t>보완 필요</w:t>
             </w:r>
@@ -260,7 +259,7 @@
         </w:tc>
         <w:tc>
           <w:tcPr>
-            <w:tcW w:type="dxa" w:w="2880"/>
+            <w:tcW w:type="dxa" w:w="3456"/>
             <w:tcMar>
               <w:top w:w="80" w:type="dxa"/>
               <w:bottom w:w="80" w:type="dxa"/>
@@ -278,15 +277,15 @@
               <w:rPr>
                 <w:rFonts w:ascii="Arial" w:hAnsi="Arial" w:eastAsia="Apple SD Gothic Neo"/>
                 <w:b w:val="0"/>
-                <w:sz w:val="17"/>
+                <w:sz w:val="16"/>
               </w:rPr>
-              <w:t>현재 앱 고정 또는 기능 분리가 부족해 관리자화가 필요한 항목</w:t>
+              <w:t>현재 화면만으로는 부족하거나 새 기능 필요</w:t>
             </w:r>
           </w:p>
         </w:tc>
         <w:tc>
           <w:tcPr>
-            <w:tcW w:type="dxa" w:w="5472"/>
+            <w:tcW w:type="dxa" w:w="5040"/>
             <w:tcMar>
               <w:top w:w="80" w:type="dxa"/>
               <w:bottom w:w="80" w:type="dxa"/>
@@ -304,9 +303,9 @@
               <w:rPr>
                 <w:rFonts w:ascii="Arial" w:hAnsi="Arial" w:eastAsia="Apple SD Gothic Neo"/>
                 <w:b w:val="0"/>
-                <w:sz w:val="17"/>
+                <w:sz w:val="16"/>
               </w:rPr>
-              <w:t>새 관리자 필드, 미리보기, 노출 제어 추가</w:t>
+              <w:t>필드 추가, 노출 제어, 미리보기, 문서/링크 관리 추가</w:t>
             </w:r>
           </w:p>
         </w:tc>
@@ -314,7 +313,7 @@
       <w:tr>
         <w:tc>
           <w:tcPr>
-            <w:tcW w:type="dxa" w:w="1584"/>
+            <w:tcW w:type="dxa" w:w="1728"/>
             <w:tcMar>
               <w:top w:w="80" w:type="dxa"/>
               <w:bottom w:w="80" w:type="dxa"/>
@@ -332,7 +331,7 @@
               <w:rPr>
                 <w:rFonts w:ascii="Arial" w:hAnsi="Arial" w:eastAsia="Apple SD Gothic Neo"/>
                 <w:b w:val="0"/>
-                <w:sz w:val="17"/>
+                <w:sz w:val="16"/>
               </w:rPr>
               <w:t>자동 계산/보정</w:t>
             </w:r>
@@ -340,7 +339,7 @@
         </w:tc>
         <w:tc>
           <w:tcPr>
-            <w:tcW w:type="dxa" w:w="2880"/>
+            <w:tcW w:type="dxa" w:w="3456"/>
             <w:tcMar>
               <w:top w:w="80" w:type="dxa"/>
               <w:bottom w:w="80" w:type="dxa"/>
@@ -358,15 +357,15 @@
               <w:rPr>
                 <w:rFonts w:ascii="Arial" w:hAnsi="Arial" w:eastAsia="Apple SD Gothic Neo"/>
                 <w:b w:val="0"/>
-                <w:sz w:val="17"/>
+                <w:sz w:val="16"/>
               </w:rPr>
-              <w:t>콘텐츠가 아니라 사용자 상태값 또는 기록값</w:t>
+              <w:t>콘텐츠가 아니라 사용자 상태값</w:t>
             </w:r>
           </w:p>
         </w:tc>
         <w:tc>
           <w:tcPr>
-            <w:tcW w:type="dxa" w:w="5472"/>
+            <w:tcW w:type="dxa" w:w="5040"/>
             <w:tcMar>
               <w:top w:w="80" w:type="dxa"/>
               <w:bottom w:w="80" w:type="dxa"/>
@@ -384,95 +383,20 @@
               <w:rPr>
                 <w:rFonts w:ascii="Arial" w:hAnsi="Arial" w:eastAsia="Apple SD Gothic Neo"/>
                 <w:b w:val="0"/>
-                <w:sz w:val="17"/>
+                <w:sz w:val="16"/>
               </w:rPr>
-              <w:t>운영자가 기준값을 보정할 수 있는 사용자 상세 화면 필요</w:t>
-            </w:r>
-          </w:p>
-        </w:tc>
-      </w:tr>
-      <w:tr>
-        <w:tc>
-          <w:tcPr>
-            <w:tcW w:type="dxa" w:w="1584"/>
-            <w:tcMar>
-              <w:top w:w="80" w:type="dxa"/>
-              <w:bottom w:w="80" w:type="dxa"/>
-              <w:start w:w="100" w:type="dxa"/>
-              <w:end w:w="100" w:type="dxa"/>
-            </w:tcMar>
-            <w:vAlign w:val="center"/>
-          </w:tcPr>
-          <w:p>
-            <w:pPr>
-              <w:spacing w:after="0"/>
-            </w:pPr>
-            <w:r/>
-            <w:r>
-              <w:rPr>
-                <w:rFonts w:ascii="Arial" w:hAnsi="Arial" w:eastAsia="Apple SD Gothic Neo"/>
-                <w:b w:val="0"/>
-                <w:sz w:val="17"/>
-              </w:rPr>
-              <w:t>사용자 기록</w:t>
-            </w:r>
-          </w:p>
-        </w:tc>
-        <w:tc>
-          <w:tcPr>
-            <w:tcW w:type="dxa" w:w="2880"/>
-            <w:tcMar>
-              <w:top w:w="80" w:type="dxa"/>
-              <w:bottom w:w="80" w:type="dxa"/>
-              <w:start w:w="100" w:type="dxa"/>
-              <w:end w:w="100" w:type="dxa"/>
-            </w:tcMar>
-            <w:vAlign w:val="center"/>
-          </w:tcPr>
-          <w:p>
-            <w:pPr>
-              <w:spacing w:after="0"/>
-            </w:pPr>
-            <w:r/>
-            <w:r>
-              <w:rPr>
-                <w:rFonts w:ascii="Arial" w:hAnsi="Arial" w:eastAsia="Apple SD Gothic Neo"/>
-                <w:b w:val="0"/>
-                <w:sz w:val="17"/>
-              </w:rPr>
-              <w:t>사용자 행동으로 생성되는 값</w:t>
-            </w:r>
-          </w:p>
-        </w:tc>
-        <w:tc>
-          <w:tcPr>
-            <w:tcW w:type="dxa" w:w="5472"/>
-            <w:tcMar>
-              <w:top w:w="80" w:type="dxa"/>
-              <w:bottom w:w="80" w:type="dxa"/>
-              <w:start w:w="100" w:type="dxa"/>
-              <w:end w:w="100" w:type="dxa"/>
-            </w:tcMar>
-            <w:vAlign w:val="center"/>
-          </w:tcPr>
-          <w:p>
-            <w:pPr>
-              <w:spacing w:after="0"/>
-            </w:pPr>
-            <w:r/>
-            <w:r>
-              <w:rPr>
-                <w:rFonts w:ascii="Arial" w:hAnsi="Arial" w:eastAsia="Apple SD Gothic Neo"/>
-                <w:b w:val="0"/>
-                <w:sz w:val="17"/>
-              </w:rPr>
-              <w:t>관리자 수정 정책 필요 시 별도 보정 기능 추가</w:t>
+              <w:t>사용자 상세에서 기준값 보정 가능해야 함</w:t>
             </w:r>
           </w:p>
         </w:tc>
       </w:tr>
     </w:tbl>
     <w:p/>
+    <w:p>
+      <w:r>
+        <w:br w:type="page"/>
+      </w:r>
+    </w:p>
     <w:p>
       <w:pPr>
         <w:pStyle w:val="Heading1"/>
@@ -484,14 +408,14 @@
           <w:color w:val="2E5C96"/>
           <w:sz w:val="30"/>
         </w:rPr>
-        <w:t>1. 홈 화면</w:t>
+        <w:t>1. 자산 관리 &gt; 주차별</w:t>
       </w:r>
     </w:p>
     <w:p>
       <w:r>
         <w:drawing>
           <wp:inline xmlns:a="http://schemas.openxmlformats.org/drawingml/2006/main" xmlns:pic="http://schemas.openxmlformats.org/drawingml/2006/picture">
-            <wp:extent cx="2331720" cy="5068252"/>
+            <wp:extent cx="6035040" cy="4149090"/>
             <wp:docPr id="1" name="Picture 1"/>
             <wp:cNvGraphicFramePr>
               <a:graphicFrameLocks noChangeAspect="1"/>
@@ -500,7 +424,7 @@
               <a:graphicData uri="http://schemas.openxmlformats.org/drawingml/2006/picture">
                 <pic:pic>
                   <pic:nvPicPr>
-                    <pic:cNvPr id="0" name="01-home.png"/>
+                    <pic:cNvPr id="0" name="01-admin-weeks.png"/>
                     <pic:cNvPicPr/>
                   </pic:nvPicPr>
                   <pic:blipFill>
@@ -512,7 +436,7 @@
                   <pic:spPr>
                     <a:xfrm>
                       <a:off x="0" y="0"/>
-                      <a:ext cx="2331720" cy="5068252"/>
+                      <a:ext cx="6035040" cy="4149090"/>
                     </a:xfrm>
                     <a:prstGeom prst="rect"/>
                   </pic:spPr>
@@ -539,15 +463,15 @@
         </w:tblBorders>
       </w:tblPr>
       <w:tblGrid>
-        <w:gridCol w:w="2520"/>
-        <w:gridCol w:w="2520"/>
-        <w:gridCol w:w="2520"/>
-        <w:gridCol w:w="2520"/>
+        <w:gridCol w:w="2556"/>
+        <w:gridCol w:w="2556"/>
+        <w:gridCol w:w="2556"/>
+        <w:gridCol w:w="2556"/>
       </w:tblGrid>
       <w:tr>
         <w:tc>
           <w:tcPr>
-            <w:tcW w:type="dxa" w:w="1944"/>
+            <w:tcW w:type="dxa" w:w="2448"/>
             <w:tcMar>
               <w:top w:w="80" w:type="dxa"/>
               <w:bottom w:w="80" w:type="dxa"/>
@@ -567,7 +491,7 @@
                 <w:b/>
                 <w:sz w:val="17"/>
               </w:rPr>
-              <w:t>앱 화면 요소</w:t>
+              <w:t>앱 반영 영역</w:t>
             </w:r>
           </w:p>
         </w:tc>
@@ -599,7 +523,7 @@
         </w:tc>
         <w:tc>
           <w:tcPr>
-            <w:tcW w:type="dxa" w:w="3240"/>
+            <w:tcW w:type="dxa" w:w="3024"/>
             <w:tcMar>
               <w:top w:w="80" w:type="dxa"/>
               <w:bottom w:w="80" w:type="dxa"/>
@@ -619,7 +543,7 @@
                 <w:b/>
                 <w:sz w:val="17"/>
               </w:rPr>
-              <w:t>관리자 수정 위치</w:t>
+              <w:t>관리자 웹 수정 위치</w:t>
             </w:r>
           </w:p>
         </w:tc>
@@ -653,7 +577,7 @@
       <w:tr>
         <w:tc>
           <w:tcPr>
-            <w:tcW w:type="dxa" w:w="1944"/>
+            <w:tcW w:type="dxa" w:w="2448"/>
             <w:tcMar>
               <w:top w:w="80" w:type="dxa"/>
               <w:bottom w:w="80" w:type="dxa"/>
@@ -671,9 +595,9 @@
               <w:rPr>
                 <w:rFonts w:ascii="Arial" w:hAnsi="Arial" w:eastAsia="Apple SD Gothic Neo"/>
                 <w:b w:val="0"/>
-                <w:sz w:val="17"/>
+                <w:sz w:val="16"/>
               </w:rPr>
-              <w:t>아기 말풍선 제목/본문</w:t>
+              <w:t>앱: 오늘 아기는요/오늘 엄마는요</w:t>
             </w:r>
           </w:p>
         </w:tc>
@@ -706,7 +630,7 @@
         </w:tc>
         <w:tc>
           <w:tcPr>
-            <w:tcW w:type="dxa" w:w="3240"/>
+            <w:tcW w:type="dxa" w:w="3024"/>
             <w:tcMar>
               <w:top w:w="80" w:type="dxa"/>
               <w:bottom w:w="80" w:type="dxa"/>
@@ -724,9 +648,9 @@
               <w:rPr>
                 <w:rFonts w:ascii="Arial" w:hAnsi="Arial" w:eastAsia="Apple SD Gothic Neo"/>
                 <w:b w:val="0"/>
-                <w:sz w:val="17"/>
+                <w:sz w:val="16"/>
               </w:rPr>
-              <w:t>자산 관리 &gt; 공통 풀 &gt; 홈 위안 풀</w:t>
+              <w:t>주차별 &gt; 상세 편집 &gt; 일별 본문</w:t>
             </w:r>
           </w:p>
         </w:tc>
@@ -750,9 +674,9 @@
               <w:rPr>
                 <w:rFonts w:ascii="Arial" w:hAnsi="Arial" w:eastAsia="Apple SD Gothic Neo"/>
                 <w:b w:val="0"/>
-                <w:sz w:val="17"/>
+                <w:sz w:val="16"/>
               </w:rPr>
-              <w:t>문구 템플릿 수정</w:t>
+              <w:t>아기/엄마 문구를 일차별로 분리 수정</w:t>
             </w:r>
           </w:p>
         </w:tc>
@@ -760,7 +684,7 @@
       <w:tr>
         <w:tc>
           <w:tcPr>
-            <w:tcW w:type="dxa" w:w="1944"/>
+            <w:tcW w:type="dxa" w:w="2448"/>
             <w:tcMar>
               <w:top w:w="80" w:type="dxa"/>
               <w:bottom w:w="80" w:type="dxa"/>
@@ -778,9 +702,9 @@
               <w:rPr>
                 <w:rFonts w:ascii="Arial" w:hAnsi="Arial" w:eastAsia="Apple SD Gothic Neo"/>
                 <w:b w:val="0"/>
-                <w:sz w:val="17"/>
+                <w:sz w:val="16"/>
               </w:rPr>
-              <w:t>아기 이미지</w:t>
+              <w:t>앱: 체크리스트</w:t>
             </w:r>
           </w:p>
         </w:tc>
@@ -813,7 +737,7 @@
         </w:tc>
         <w:tc>
           <w:tcPr>
-            <w:tcW w:type="dxa" w:w="3240"/>
+            <w:tcW w:type="dxa" w:w="3024"/>
             <w:tcMar>
               <w:top w:w="80" w:type="dxa"/>
               <w:bottom w:w="80" w:type="dxa"/>
@@ -831,9 +755,9 @@
               <w:rPr>
                 <w:rFonts w:ascii="Arial" w:hAnsi="Arial" w:eastAsia="Apple SD Gothic Neo"/>
                 <w:b w:val="0"/>
-                <w:sz w:val="17"/>
+                <w:sz w:val="16"/>
               </w:rPr>
-              <w:t>자산 관리 &gt; 주차별 &gt; 해당 주차 &gt; 이미지</w:t>
+              <w:t>주차별 &gt; 상세 편집 &gt; 체크리스트</w:t>
             </w:r>
           </w:p>
         </w:tc>
@@ -857,9 +781,9 @@
               <w:rPr>
                 <w:rFonts w:ascii="Arial" w:hAnsi="Arial" w:eastAsia="Apple SD Gothic Neo"/>
                 <w:b w:val="0"/>
-                <w:sz w:val="17"/>
+                <w:sz w:val="16"/>
               </w:rPr>
-              <w:t>주차별 대표 이미지 교체</w:t>
+              <w:t>항목 문구와 앱 노출 on/off</w:t>
             </w:r>
           </w:p>
         </w:tc>
@@ -867,7 +791,7 @@
       <w:tr>
         <w:tc>
           <w:tcPr>
-            <w:tcW w:type="dxa" w:w="1944"/>
+            <w:tcW w:type="dxa" w:w="2448"/>
             <w:tcMar>
               <w:top w:w="80" w:type="dxa"/>
               <w:bottom w:w="80" w:type="dxa"/>
@@ -885,116 +809,9 @@
               <w:rPr>
                 <w:rFonts w:ascii="Arial" w:hAnsi="Arial" w:eastAsia="Apple SD Gothic Neo"/>
                 <w:b w:val="0"/>
-                <w:sz w:val="17"/>
+                <w:sz w:val="16"/>
               </w:rPr>
-              <w:t>주차/임신일수/남은일수</w:t>
-            </w:r>
-          </w:p>
-        </w:tc>
-        <w:tc>
-          <w:tcPr>
-            <w:tcW w:type="dxa" w:w="1440"/>
-            <w:tcMar>
-              <w:top w:w="80" w:type="dxa"/>
-              <w:bottom w:w="80" w:type="dxa"/>
-              <w:start w:w="100" w:type="dxa"/>
-              <w:end w:w="100" w:type="dxa"/>
-            </w:tcMar>
-            <w:vAlign w:val="center"/>
-            <w:shd w:fill="E4ECFF"/>
-          </w:tcPr>
-          <w:p>
-            <w:pPr>
-              <w:spacing w:after="0"/>
-            </w:pPr>
-            <w:r/>
-            <w:r>
-              <w:rPr>
-                <w:rFonts w:ascii="Arial" w:hAnsi="Arial" w:eastAsia="Apple SD Gothic Neo"/>
-                <w:b/>
-                <w:sz w:val="17"/>
-              </w:rPr>
-              <w:t>자동 계산/보정</w:t>
-            </w:r>
-          </w:p>
-        </w:tc>
-        <w:tc>
-          <w:tcPr>
-            <w:tcW w:type="dxa" w:w="3240"/>
-            <w:tcMar>
-              <w:top w:w="80" w:type="dxa"/>
-              <w:bottom w:w="80" w:type="dxa"/>
-              <w:start w:w="100" w:type="dxa"/>
-              <w:end w:w="100" w:type="dxa"/>
-            </w:tcMar>
-            <w:vAlign w:val="center"/>
-          </w:tcPr>
-          <w:p>
-            <w:pPr>
-              <w:spacing w:after="0"/>
-            </w:pPr>
-            <w:r/>
-            <w:r>
-              <w:rPr>
-                <w:rFonts w:ascii="Arial" w:hAnsi="Arial" w:eastAsia="Apple SD Gothic Neo"/>
-                <w:b w:val="0"/>
-                <w:sz w:val="17"/>
-              </w:rPr>
-              <w:t>계정 &gt; 사용자 관리 &gt; 사용자 상세</w:t>
-            </w:r>
-          </w:p>
-        </w:tc>
-        <w:tc>
-          <w:tcPr>
-            <w:tcW w:type="dxa" w:w="3312"/>
-            <w:tcMar>
-              <w:top w:w="80" w:type="dxa"/>
-              <w:bottom w:w="80" w:type="dxa"/>
-              <w:start w:w="100" w:type="dxa"/>
-              <w:end w:w="100" w:type="dxa"/>
-            </w:tcMar>
-            <w:vAlign w:val="center"/>
-          </w:tcPr>
-          <w:p>
-            <w:pPr>
-              <w:spacing w:after="0"/>
-            </w:pPr>
-            <w:r/>
-            <w:r>
-              <w:rPr>
-                <w:rFonts w:ascii="Arial" w:hAnsi="Arial" w:eastAsia="Apple SD Gothic Neo"/>
-                <w:b w:val="0"/>
-                <w:sz w:val="17"/>
-              </w:rPr>
-              <w:t>출산예정일 또는 주차 기준값 보정</w:t>
-            </w:r>
-          </w:p>
-        </w:tc>
-      </w:tr>
-      <w:tr>
-        <w:tc>
-          <w:tcPr>
-            <w:tcW w:type="dxa" w:w="1944"/>
-            <w:tcMar>
-              <w:top w:w="80" w:type="dxa"/>
-              <w:bottom w:w="80" w:type="dxa"/>
-              <w:start w:w="100" w:type="dxa"/>
-              <w:end w:w="100" w:type="dxa"/>
-            </w:tcMar>
-            <w:vAlign w:val="center"/>
-          </w:tcPr>
-          <w:p>
-            <w:pPr>
-              <w:spacing w:after="0"/>
-            </w:pPr>
-            <w:r/>
-            <w:r>
-              <w:rPr>
-                <w:rFonts w:ascii="Arial" w:hAnsi="Arial" w:eastAsia="Apple SD Gothic Neo"/>
-                <w:b w:val="0"/>
-                <w:sz w:val="17"/>
-              </w:rPr>
-              <w:t>오늘의 한마디</w:t>
+              <w:t>앱: 태교 질문</w:t>
             </w:r>
           </w:p>
         </w:tc>
@@ -1027,7 +844,7 @@
         </w:tc>
         <w:tc>
           <w:tcPr>
-            <w:tcW w:type="dxa" w:w="3240"/>
+            <w:tcW w:type="dxa" w:w="3024"/>
             <w:tcMar>
               <w:top w:w="80" w:type="dxa"/>
               <w:bottom w:w="80" w:type="dxa"/>
@@ -1045,9 +862,9 @@
               <w:rPr>
                 <w:rFonts w:ascii="Arial" w:hAnsi="Arial" w:eastAsia="Apple SD Gothic Neo"/>
                 <w:b w:val="0"/>
-                <w:sz w:val="17"/>
+                <w:sz w:val="16"/>
               </w:rPr>
-              <w:t>자산 관리 &gt; 공통 풀 &gt; 홈 위안 풀</w:t>
+              <w:t>주차별 &gt; 상세 편집 &gt; 질문</w:t>
             </w:r>
           </w:p>
         </w:tc>
@@ -1071,15 +888,127 @@
               <w:rPr>
                 <w:rFonts w:ascii="Arial" w:hAnsi="Arial" w:eastAsia="Apple SD Gothic Neo"/>
                 <w:b w:val="0"/>
+                <w:sz w:val="16"/>
+              </w:rPr>
+              <w:t>질문 문구와 앱 노출 on/off</w:t>
+            </w:r>
+          </w:p>
+        </w:tc>
+      </w:tr>
+      <w:tr>
+        <w:tc>
+          <w:tcPr>
+            <w:tcW w:type="dxa" w:w="2448"/>
+            <w:tcMar>
+              <w:top w:w="80" w:type="dxa"/>
+              <w:bottom w:w="80" w:type="dxa"/>
+              <w:start w:w="100" w:type="dxa"/>
+              <w:end w:w="100" w:type="dxa"/>
+            </w:tcMar>
+            <w:vAlign w:val="center"/>
+          </w:tcPr>
+          <w:p>
+            <w:pPr>
+              <w:spacing w:after="0"/>
+            </w:pPr>
+            <w:r/>
+            <w:r>
+              <w:rPr>
+                <w:rFonts w:ascii="Arial" w:hAnsi="Arial" w:eastAsia="Apple SD Gothic Neo"/>
+                <w:b w:val="0"/>
+                <w:sz w:val="16"/>
+              </w:rPr>
+              <w:t>앱: 아기 이미지/임신백과</w:t>
+            </w:r>
+          </w:p>
+        </w:tc>
+        <w:tc>
+          <w:tcPr>
+            <w:tcW w:type="dxa" w:w="1440"/>
+            <w:tcMar>
+              <w:top w:w="80" w:type="dxa"/>
+              <w:bottom w:w="80" w:type="dxa"/>
+              <w:start w:w="100" w:type="dxa"/>
+              <w:end w:w="100" w:type="dxa"/>
+            </w:tcMar>
+            <w:vAlign w:val="center"/>
+            <w:shd w:fill="DFF2E6"/>
+          </w:tcPr>
+          <w:p>
+            <w:pPr>
+              <w:spacing w:after="0"/>
+            </w:pPr>
+            <w:r/>
+            <w:r>
+              <w:rPr>
+                <w:rFonts w:ascii="Arial" w:hAnsi="Arial" w:eastAsia="Apple SD Gothic Neo"/>
+                <w:b/>
                 <w:sz w:val="17"/>
               </w:rPr>
-              <w:t>오늘의 한마디 위치 문구 수정</w:t>
+              <w:t>수정 가능</w:t>
+            </w:r>
+          </w:p>
+        </w:tc>
+        <w:tc>
+          <w:tcPr>
+            <w:tcW w:type="dxa" w:w="3024"/>
+            <w:tcMar>
+              <w:top w:w="80" w:type="dxa"/>
+              <w:bottom w:w="80" w:type="dxa"/>
+              <w:start w:w="100" w:type="dxa"/>
+              <w:end w:w="100" w:type="dxa"/>
+            </w:tcMar>
+            <w:vAlign w:val="center"/>
+          </w:tcPr>
+          <w:p>
+            <w:pPr>
+              <w:spacing w:after="0"/>
+            </w:pPr>
+            <w:r/>
+            <w:r>
+              <w:rPr>
+                <w:rFonts w:ascii="Arial" w:hAnsi="Arial" w:eastAsia="Apple SD Gothic Neo"/>
+                <w:b w:val="0"/>
+                <w:sz w:val="16"/>
+              </w:rPr>
+              <w:t>주차별 &gt; 이미지/노출본</w:t>
+            </w:r>
+          </w:p>
+        </w:tc>
+        <w:tc>
+          <w:tcPr>
+            <w:tcW w:type="dxa" w:w="3312"/>
+            <w:tcMar>
+              <w:top w:w="80" w:type="dxa"/>
+              <w:bottom w:w="80" w:type="dxa"/>
+              <w:start w:w="100" w:type="dxa"/>
+              <w:end w:w="100" w:type="dxa"/>
+            </w:tcMar>
+            <w:vAlign w:val="center"/>
+          </w:tcPr>
+          <w:p>
+            <w:pPr>
+              <w:spacing w:after="0"/>
+            </w:pPr>
+            <w:r/>
+            <w:r>
+              <w:rPr>
+                <w:rFonts w:ascii="Arial" w:hAnsi="Arial" w:eastAsia="Apple SD Gothic Neo"/>
+                <w:b w:val="0"/>
+                <w:sz w:val="16"/>
+              </w:rPr>
+              <w:t>이미지 교체와 백과 카드 문구 수정</w:t>
             </w:r>
           </w:p>
         </w:tc>
       </w:tr>
     </w:tbl>
     <w:p/>
+    <w:p>
+      <w:r>
+        <w:br w:type="page"/>
+      </w:r>
+    </w:p>
     <w:p>
       <w:pPr>
         <w:pStyle w:val="Heading1"/>
@@ -1091,14 +1020,14 @@
           <w:color w:val="2E5C96"/>
           <w:sz w:val="30"/>
         </w:rPr>
-        <w:t>2. 오늘,우리 &gt; 아기와 엄마</w:t>
+        <w:t>2. 자산 관리 &gt; 공통 풀</w:t>
       </w:r>
     </w:p>
     <w:p>
       <w:r>
         <w:drawing>
           <wp:inline xmlns:a="http://schemas.openxmlformats.org/drawingml/2006/main" xmlns:pic="http://schemas.openxmlformats.org/drawingml/2006/picture">
-            <wp:extent cx="2331720" cy="5068252"/>
+            <wp:extent cx="6035040" cy="4149090"/>
             <wp:docPr id="2" name="Picture 2"/>
             <wp:cNvGraphicFramePr>
               <a:graphicFrameLocks noChangeAspect="1"/>
@@ -1107,7 +1036,7 @@
               <a:graphicData uri="http://schemas.openxmlformats.org/drawingml/2006/picture">
                 <pic:pic>
                   <pic:nvPicPr>
-                    <pic:cNvPr id="0" name="02-today-baby-mom.png"/>
+                    <pic:cNvPr id="0" name="02-admin-pools.png"/>
                     <pic:cNvPicPr/>
                   </pic:nvPicPr>
                   <pic:blipFill>
@@ -1119,7 +1048,7 @@
                   <pic:spPr>
                     <a:xfrm>
                       <a:off x="0" y="0"/>
-                      <a:ext cx="2331720" cy="5068252"/>
+                      <a:ext cx="6035040" cy="4149090"/>
                     </a:xfrm>
                     <a:prstGeom prst="rect"/>
                   </pic:spPr>
@@ -1146,15 +1075,15 @@
         </w:tblBorders>
       </w:tblPr>
       <w:tblGrid>
-        <w:gridCol w:w="2520"/>
-        <w:gridCol w:w="2520"/>
-        <w:gridCol w:w="2520"/>
-        <w:gridCol w:w="2520"/>
+        <w:gridCol w:w="2556"/>
+        <w:gridCol w:w="2556"/>
+        <w:gridCol w:w="2556"/>
+        <w:gridCol w:w="2556"/>
       </w:tblGrid>
       <w:tr>
         <w:tc>
           <w:tcPr>
-            <w:tcW w:type="dxa" w:w="1944"/>
+            <w:tcW w:type="dxa" w:w="2448"/>
             <w:tcMar>
               <w:top w:w="80" w:type="dxa"/>
               <w:bottom w:w="80" w:type="dxa"/>
@@ -1174,7 +1103,7 @@
                 <w:b/>
                 <w:sz w:val="17"/>
               </w:rPr>
-              <w:t>앱 화면 요소</w:t>
+              <w:t>앱 반영 영역</w:t>
             </w:r>
           </w:p>
         </w:tc>
@@ -1206,7 +1135,7 @@
         </w:tc>
         <w:tc>
           <w:tcPr>
-            <w:tcW w:type="dxa" w:w="3240"/>
+            <w:tcW w:type="dxa" w:w="3024"/>
             <w:tcMar>
               <w:top w:w="80" w:type="dxa"/>
               <w:bottom w:w="80" w:type="dxa"/>
@@ -1226,7 +1155,7 @@
                 <w:b/>
                 <w:sz w:val="17"/>
               </w:rPr>
-              <w:t>관리자 수정 위치</w:t>
+              <w:t>관리자 웹 수정 위치</w:t>
             </w:r>
           </w:p>
         </w:tc>
@@ -1260,7 +1189,7 @@
       <w:tr>
         <w:tc>
           <w:tcPr>
-            <w:tcW w:type="dxa" w:w="1944"/>
+            <w:tcW w:type="dxa" w:w="2448"/>
             <w:tcMar>
               <w:top w:w="80" w:type="dxa"/>
               <w:bottom w:w="80" w:type="dxa"/>
@@ -1278,9 +1207,9 @@
               <w:rPr>
                 <w:rFonts w:ascii="Arial" w:hAnsi="Arial" w:eastAsia="Apple SD Gothic Neo"/>
                 <w:b w:val="0"/>
-                <w:sz w:val="17"/>
+                <w:sz w:val="16"/>
               </w:rPr>
-              <w:t>오늘 아기는요 본문</w:t>
+              <w:t>앱: 홈 말풍선</w:t>
             </w:r>
           </w:p>
         </w:tc>
@@ -1313,7 +1242,7 @@
         </w:tc>
         <w:tc>
           <w:tcPr>
-            <w:tcW w:type="dxa" w:w="3240"/>
+            <w:tcW w:type="dxa" w:w="3024"/>
             <w:tcMar>
               <w:top w:w="80" w:type="dxa"/>
               <w:bottom w:w="80" w:type="dxa"/>
@@ -1331,9 +1260,9 @@
               <w:rPr>
                 <w:rFonts w:ascii="Arial" w:hAnsi="Arial" w:eastAsia="Apple SD Gothic Neo"/>
                 <w:b w:val="0"/>
-                <w:sz w:val="17"/>
+                <w:sz w:val="16"/>
               </w:rPr>
-              <w:t>자산 관리 &gt; 주차별 &gt; 해당 주차 &gt; 일별 본문</w:t>
+              <w:t>공통 풀 &gt; 홈 위안 풀</w:t>
             </w:r>
           </w:p>
         </w:tc>
@@ -1357,9 +1286,9 @@
               <w:rPr>
                 <w:rFonts w:ascii="Arial" w:hAnsi="Arial" w:eastAsia="Apple SD Gothic Neo"/>
                 <w:b w:val="0"/>
-                <w:sz w:val="17"/>
+                <w:sz w:val="16"/>
               </w:rPr>
-              <w:t>일차별 아기 문구 수정</w:t>
+              <w:t>말풍선 제목/본문 템플릿 수정</w:t>
             </w:r>
           </w:p>
         </w:tc>
@@ -1367,7 +1296,7 @@
       <w:tr>
         <w:tc>
           <w:tcPr>
-            <w:tcW w:type="dxa" w:w="1944"/>
+            <w:tcW w:type="dxa" w:w="2448"/>
             <w:tcMar>
               <w:top w:w="80" w:type="dxa"/>
               <w:bottom w:w="80" w:type="dxa"/>
@@ -1385,9 +1314,9 @@
               <w:rPr>
                 <w:rFonts w:ascii="Arial" w:hAnsi="Arial" w:eastAsia="Apple SD Gothic Neo"/>
                 <w:b w:val="0"/>
-                <w:sz w:val="17"/>
+                <w:sz w:val="16"/>
               </w:rPr>
-              <w:t>오늘 엄마는요 본문</w:t>
+              <w:t>앱: 오늘의 한마디</w:t>
             </w:r>
           </w:p>
         </w:tc>
@@ -1420,7 +1349,7 @@
         </w:tc>
         <w:tc>
           <w:tcPr>
-            <w:tcW w:type="dxa" w:w="3240"/>
+            <w:tcW w:type="dxa" w:w="3024"/>
             <w:tcMar>
               <w:top w:w="80" w:type="dxa"/>
               <w:bottom w:w="80" w:type="dxa"/>
@@ -1438,9 +1367,9 @@
               <w:rPr>
                 <w:rFonts w:ascii="Arial" w:hAnsi="Arial" w:eastAsia="Apple SD Gothic Neo"/>
                 <w:b w:val="0"/>
-                <w:sz w:val="17"/>
+                <w:sz w:val="16"/>
               </w:rPr>
-              <w:t>자산 관리 &gt; 주차별 &gt; 해당 주차 &gt; 일별 본문</w:t>
+              <w:t>공통 풀 &gt; 홈 위안 풀</w:t>
             </w:r>
           </w:p>
         </w:tc>
@@ -1464,9 +1393,9 @@
               <w:rPr>
                 <w:rFonts w:ascii="Arial" w:hAnsi="Arial" w:eastAsia="Apple SD Gothic Neo"/>
                 <w:b w:val="0"/>
-                <w:sz w:val="17"/>
+                <w:sz w:val="16"/>
               </w:rPr>
-              <w:t>일차별 엄마 문구 수정</w:t>
+              <w:t>오늘의 한마디 위치 문구 수정</w:t>
             </w:r>
           </w:p>
         </w:tc>
@@ -1474,7 +1403,7 @@
       <w:tr>
         <w:tc>
           <w:tcPr>
-            <w:tcW w:type="dxa" w:w="1944"/>
+            <w:tcW w:type="dxa" w:w="2448"/>
             <w:tcMar>
               <w:top w:w="80" w:type="dxa"/>
               <w:bottom w:w="80" w:type="dxa"/>
@@ -1492,9 +1421,9 @@
               <w:rPr>
                 <w:rFonts w:ascii="Arial" w:hAnsi="Arial" w:eastAsia="Apple SD Gothic Neo"/>
                 <w:b w:val="0"/>
-                <w:sz w:val="17"/>
+                <w:sz w:val="16"/>
               </w:rPr>
-              <w:t>탭/섹션 고정 문구</w:t>
+              <w:t>앱: 공통 위안 문구</w:t>
             </w:r>
           </w:p>
         </w:tc>
@@ -1508,7 +1437,7 @@
               <w:end w:w="100" w:type="dxa"/>
             </w:tcMar>
             <w:vAlign w:val="center"/>
-            <w:shd w:fill="FFF0D9"/>
+            <w:shd w:fill="DFF2E6"/>
           </w:tcPr>
           <w:p>
             <w:pPr>
@@ -1521,13 +1450,13 @@
                 <w:b/>
                 <w:sz w:val="17"/>
               </w:rPr>
-              <w:t>보완 필요</w:t>
+              <w:t>수정 가능</w:t>
             </w:r>
           </w:p>
         </w:tc>
         <w:tc>
           <w:tcPr>
-            <w:tcW w:type="dxa" w:w="3240"/>
+            <w:tcW w:type="dxa" w:w="3024"/>
             <w:tcMar>
               <w:top w:w="80" w:type="dxa"/>
               <w:bottom w:w="80" w:type="dxa"/>
@@ -1545,9 +1474,9 @@
               <w:rPr>
                 <w:rFonts w:ascii="Arial" w:hAnsi="Arial" w:eastAsia="Apple SD Gothic Neo"/>
                 <w:b w:val="0"/>
-                <w:sz w:val="17"/>
+                <w:sz w:val="16"/>
               </w:rPr>
-              <w:t>앱 UI 문구 관리 또는 시스템 운영 &gt; 브랜딩</w:t>
+              <w:t>공통 풀 &gt; 아기 위안 풀</w:t>
             </w:r>
           </w:p>
         </w:tc>
@@ -1571,9 +1500,9 @@
               <w:rPr>
                 <w:rFonts w:ascii="Arial" w:hAnsi="Arial" w:eastAsia="Apple SD Gothic Neo"/>
                 <w:b w:val="0"/>
-                <w:sz w:val="17"/>
+                <w:sz w:val="16"/>
               </w:rPr>
-              <w:t>운영자가 바꾸려면 문구 관리 필드 추가</w:t>
+              <w:t>주차/기분 태그 기반 문구 관리</w:t>
             </w:r>
           </w:p>
         </w:tc>
@@ -1596,14 +1525,14 @@
           <w:color w:val="2E5C96"/>
           <w:sz w:val="30"/>
         </w:rPr>
-        <w:t>3. 오늘,우리 &gt; 임신백과 카드</w:t>
+        <w:t>3. 대화 엔진 &gt; 워크플로우</w:t>
       </w:r>
     </w:p>
     <w:p>
       <w:r>
         <w:drawing>
           <wp:inline xmlns:a="http://schemas.openxmlformats.org/drawingml/2006/main" xmlns:pic="http://schemas.openxmlformats.org/drawingml/2006/picture">
-            <wp:extent cx="2331720" cy="5068252"/>
+            <wp:extent cx="6035040" cy="4149090"/>
             <wp:docPr id="3" name="Picture 3"/>
             <wp:cNvGraphicFramePr>
               <a:graphicFrameLocks noChangeAspect="1"/>
@@ -1612,7 +1541,7 @@
               <a:graphicData uri="http://schemas.openxmlformats.org/drawingml/2006/picture">
                 <pic:pic>
                   <pic:nvPicPr>
-                    <pic:cNvPr id="0" name="03-encyclopedia-card.png"/>
+                    <pic:cNvPr id="0" name="03-admin-workflows.png"/>
                     <pic:cNvPicPr/>
                   </pic:nvPicPr>
                   <pic:blipFill>
@@ -1624,7 +1553,7 @@
                   <pic:spPr>
                     <a:xfrm>
                       <a:off x="0" y="0"/>
-                      <a:ext cx="2331720" cy="5068252"/>
+                      <a:ext cx="6035040" cy="4149090"/>
                     </a:xfrm>
                     <a:prstGeom prst="rect"/>
                   </pic:spPr>
@@ -1651,15 +1580,15 @@
         </w:tblBorders>
       </w:tblPr>
       <w:tblGrid>
-        <w:gridCol w:w="2520"/>
-        <w:gridCol w:w="2520"/>
-        <w:gridCol w:w="2520"/>
-        <w:gridCol w:w="2520"/>
+        <w:gridCol w:w="2556"/>
+        <w:gridCol w:w="2556"/>
+        <w:gridCol w:w="2556"/>
+        <w:gridCol w:w="2556"/>
       </w:tblGrid>
       <w:tr>
         <w:tc>
           <w:tcPr>
-            <w:tcW w:type="dxa" w:w="1944"/>
+            <w:tcW w:type="dxa" w:w="2448"/>
             <w:tcMar>
               <w:top w:w="80" w:type="dxa"/>
               <w:bottom w:w="80" w:type="dxa"/>
@@ -1679,7 +1608,7 @@
                 <w:b/>
                 <w:sz w:val="17"/>
               </w:rPr>
-              <w:t>앱 화면 요소</w:t>
+              <w:t>앱 반영 영역</w:t>
             </w:r>
           </w:p>
         </w:tc>
@@ -1711,7 +1640,7 @@
         </w:tc>
         <w:tc>
           <w:tcPr>
-            <w:tcW w:type="dxa" w:w="3240"/>
+            <w:tcW w:type="dxa" w:w="3024"/>
             <w:tcMar>
               <w:top w:w="80" w:type="dxa"/>
               <w:bottom w:w="80" w:type="dxa"/>
@@ -1731,7 +1660,7 @@
                 <w:b/>
                 <w:sz w:val="17"/>
               </w:rPr>
-              <w:t>관리자 수정 위치</w:t>
+              <w:t>관리자 웹 수정 위치</w:t>
             </w:r>
           </w:p>
         </w:tc>
@@ -1765,7 +1694,7 @@
       <w:tr>
         <w:tc>
           <w:tcPr>
-            <w:tcW w:type="dxa" w:w="1944"/>
+            <w:tcW w:type="dxa" w:w="2448"/>
             <w:tcMar>
               <w:top w:w="80" w:type="dxa"/>
               <w:bottom w:w="80" w:type="dxa"/>
@@ -1783,9 +1712,223 @@
               <w:rPr>
                 <w:rFonts w:ascii="Arial" w:hAnsi="Arial" w:eastAsia="Apple SD Gothic Neo"/>
                 <w:b w:val="0"/>
+                <w:sz w:val="16"/>
+              </w:rPr>
+              <w:t>앱: 기분 첫 질문/버튼</w:t>
+            </w:r>
+          </w:p>
+        </w:tc>
+        <w:tc>
+          <w:tcPr>
+            <w:tcW w:type="dxa" w:w="1440"/>
+            <w:tcMar>
+              <w:top w:w="80" w:type="dxa"/>
+              <w:bottom w:w="80" w:type="dxa"/>
+              <w:start w:w="100" w:type="dxa"/>
+              <w:end w:w="100" w:type="dxa"/>
+            </w:tcMar>
+            <w:vAlign w:val="center"/>
+            <w:shd w:fill="DFF2E6"/>
+          </w:tcPr>
+          <w:p>
+            <w:pPr>
+              <w:spacing w:after="0"/>
+            </w:pPr>
+            <w:r/>
+            <w:r>
+              <w:rPr>
+                <w:rFonts w:ascii="Arial" w:hAnsi="Arial" w:eastAsia="Apple SD Gothic Neo"/>
+                <w:b/>
                 <w:sz w:val="17"/>
               </w:rPr>
-              <w:t>임신백과 카드 설명</w:t>
+              <w:t>수정 가능</w:t>
+            </w:r>
+          </w:p>
+        </w:tc>
+        <w:tc>
+          <w:tcPr>
+            <w:tcW w:type="dxa" w:w="3024"/>
+            <w:tcMar>
+              <w:top w:w="80" w:type="dxa"/>
+              <w:bottom w:w="80" w:type="dxa"/>
+              <w:start w:w="100" w:type="dxa"/>
+              <w:end w:w="100" w:type="dxa"/>
+            </w:tcMar>
+            <w:vAlign w:val="center"/>
+          </w:tcPr>
+          <w:p>
+            <w:pPr>
+              <w:spacing w:after="0"/>
+            </w:pPr>
+            <w:r/>
+            <w:r>
+              <w:rPr>
+                <w:rFonts w:ascii="Arial" w:hAnsi="Arial" w:eastAsia="Apple SD Gothic Neo"/>
+                <w:b w:val="0"/>
+                <w:sz w:val="16"/>
+              </w:rPr>
+              <w:t>워크플로우</w:t>
+            </w:r>
+          </w:p>
+        </w:tc>
+        <w:tc>
+          <w:tcPr>
+            <w:tcW w:type="dxa" w:w="3312"/>
+            <w:tcMar>
+              <w:top w:w="80" w:type="dxa"/>
+              <w:bottom w:w="80" w:type="dxa"/>
+              <w:start w:w="100" w:type="dxa"/>
+              <w:end w:w="100" w:type="dxa"/>
+            </w:tcMar>
+            <w:vAlign w:val="center"/>
+          </w:tcPr>
+          <w:p>
+            <w:pPr>
+              <w:spacing w:after="0"/>
+            </w:pPr>
+            <w:r/>
+            <w:r>
+              <w:rPr>
+                <w:rFonts w:ascii="Arial" w:hAnsi="Arial" w:eastAsia="Apple SD Gothic Neo"/>
+                <w:b w:val="0"/>
+                <w:sz w:val="16"/>
+              </w:rPr>
+              <w:t>질문 문구와 버튼 라벨 수정</w:t>
+            </w:r>
+          </w:p>
+        </w:tc>
+      </w:tr>
+      <w:tr>
+        <w:tc>
+          <w:tcPr>
+            <w:tcW w:type="dxa" w:w="2448"/>
+            <w:tcMar>
+              <w:top w:w="80" w:type="dxa"/>
+              <w:bottom w:w="80" w:type="dxa"/>
+              <w:start w:w="100" w:type="dxa"/>
+              <w:end w:w="100" w:type="dxa"/>
+            </w:tcMar>
+            <w:vAlign w:val="center"/>
+          </w:tcPr>
+          <w:p>
+            <w:pPr>
+              <w:spacing w:after="0"/>
+            </w:pPr>
+            <w:r/>
+            <w:r>
+              <w:rPr>
+                <w:rFonts w:ascii="Arial" w:hAnsi="Arial" w:eastAsia="Apple SD Gothic Neo"/>
+                <w:b w:val="0"/>
+                <w:sz w:val="16"/>
+              </w:rPr>
+              <w:t>앱: 주차 정보 제안</w:t>
+            </w:r>
+          </w:p>
+        </w:tc>
+        <w:tc>
+          <w:tcPr>
+            <w:tcW w:type="dxa" w:w="1440"/>
+            <w:tcMar>
+              <w:top w:w="80" w:type="dxa"/>
+              <w:bottom w:w="80" w:type="dxa"/>
+              <w:start w:w="100" w:type="dxa"/>
+              <w:end w:w="100" w:type="dxa"/>
+            </w:tcMar>
+            <w:vAlign w:val="center"/>
+            <w:shd w:fill="DFF2E6"/>
+          </w:tcPr>
+          <w:p>
+            <w:pPr>
+              <w:spacing w:after="0"/>
+            </w:pPr>
+            <w:r/>
+            <w:r>
+              <w:rPr>
+                <w:rFonts w:ascii="Arial" w:hAnsi="Arial" w:eastAsia="Apple SD Gothic Neo"/>
+                <w:b/>
+                <w:sz w:val="17"/>
+              </w:rPr>
+              <w:t>수정 가능</w:t>
+            </w:r>
+          </w:p>
+        </w:tc>
+        <w:tc>
+          <w:tcPr>
+            <w:tcW w:type="dxa" w:w="3024"/>
+            <w:tcMar>
+              <w:top w:w="80" w:type="dxa"/>
+              <w:bottom w:w="80" w:type="dxa"/>
+              <w:start w:w="100" w:type="dxa"/>
+              <w:end w:w="100" w:type="dxa"/>
+            </w:tcMar>
+            <w:vAlign w:val="center"/>
+          </w:tcPr>
+          <w:p>
+            <w:pPr>
+              <w:spacing w:after="0"/>
+            </w:pPr>
+            <w:r/>
+            <w:r>
+              <w:rPr>
+                <w:rFonts w:ascii="Arial" w:hAnsi="Arial" w:eastAsia="Apple SD Gothic Neo"/>
+                <w:b w:val="0"/>
+                <w:sz w:val="16"/>
+              </w:rPr>
+              <w:t>워크플로우</w:t>
+            </w:r>
+          </w:p>
+        </w:tc>
+        <w:tc>
+          <w:tcPr>
+            <w:tcW w:type="dxa" w:w="3312"/>
+            <w:tcMar>
+              <w:top w:w="80" w:type="dxa"/>
+              <w:bottom w:w="80" w:type="dxa"/>
+              <w:start w:w="100" w:type="dxa"/>
+              <w:end w:w="100" w:type="dxa"/>
+            </w:tcMar>
+            <w:vAlign w:val="center"/>
+          </w:tcPr>
+          <w:p>
+            <w:pPr>
+              <w:spacing w:after="0"/>
+            </w:pPr>
+            <w:r/>
+            <w:r>
+              <w:rPr>
+                <w:rFonts w:ascii="Arial" w:hAnsi="Arial" w:eastAsia="Apple SD Gothic Neo"/>
+                <w:b w:val="0"/>
+                <w:sz w:val="16"/>
+              </w:rPr>
+              <w:t>네/나중에요 버튼과 제안 문구 수정</w:t>
+            </w:r>
+          </w:p>
+        </w:tc>
+      </w:tr>
+      <w:tr>
+        <w:tc>
+          <w:tcPr>
+            <w:tcW w:type="dxa" w:w="2448"/>
+            <w:tcMar>
+              <w:top w:w="80" w:type="dxa"/>
+              <w:bottom w:w="80" w:type="dxa"/>
+              <w:start w:w="100" w:type="dxa"/>
+              <w:end w:w="100" w:type="dxa"/>
+            </w:tcMar>
+            <w:vAlign w:val="center"/>
+          </w:tcPr>
+          <w:p>
+            <w:pPr>
+              <w:spacing w:after="0"/>
+            </w:pPr>
+            <w:r/>
+            <w:r>
+              <w:rPr>
+                <w:rFonts w:ascii="Arial" w:hAnsi="Arial" w:eastAsia="Apple SD Gothic Neo"/>
+                <w:b w:val="0"/>
+                <w:sz w:val="16"/>
+              </w:rPr>
+              <w:t>앱: 기분 -&gt; 질문 -&gt; 자유대화 흐름</w:t>
             </w:r>
           </w:p>
         </w:tc>
@@ -1818,7 +1961,7 @@
         </w:tc>
         <w:tc>
           <w:tcPr>
-            <w:tcW w:type="dxa" w:w="3240"/>
+            <w:tcW w:type="dxa" w:w="3024"/>
             <w:tcMar>
               <w:top w:w="80" w:type="dxa"/>
               <w:bottom w:w="80" w:type="dxa"/>
@@ -1836,9 +1979,9 @@
               <w:rPr>
                 <w:rFonts w:ascii="Arial" w:hAnsi="Arial" w:eastAsia="Apple SD Gothic Neo"/>
                 <w:b w:val="0"/>
-                <w:sz w:val="17"/>
+                <w:sz w:val="16"/>
               </w:rPr>
-              <w:t>자산 관리 &gt; 주차별 또는 앱 UI 문구 관리</w:t>
+              <w:t>워크플로우</w:t>
             </w:r>
           </w:p>
         </w:tc>
@@ -1862,229 +2005,20 @@
               <w:rPr>
                 <w:rFonts w:ascii="Arial" w:hAnsi="Arial" w:eastAsia="Apple SD Gothic Neo"/>
                 <w:b w:val="0"/>
-                <w:sz w:val="17"/>
+                <w:sz w:val="16"/>
               </w:rPr>
-              <w:t>현재 고정이면 관리자 필드 추가</w:t>
-            </w:r>
-          </w:p>
-        </w:tc>
-      </w:tr>
-      <w:tr>
-        <w:tc>
-          <w:tcPr>
-            <w:tcW w:type="dxa" w:w="1944"/>
-            <w:tcMar>
-              <w:top w:w="80" w:type="dxa"/>
-              <w:bottom w:w="80" w:type="dxa"/>
-              <w:start w:w="100" w:type="dxa"/>
-              <w:end w:w="100" w:type="dxa"/>
-            </w:tcMar>
-            <w:vAlign w:val="center"/>
-          </w:tcPr>
-          <w:p>
-            <w:pPr>
-              <w:spacing w:after="0"/>
-            </w:pPr>
-            <w:r/>
-            <w:r>
-              <w:rPr>
-                <w:rFonts w:ascii="Arial" w:hAnsi="Arial" w:eastAsia="Apple SD Gothic Neo"/>
-                <w:b w:val="0"/>
-                <w:sz w:val="17"/>
-              </w:rPr>
-              <w:t>이번 주 백과 보기</w:t>
-            </w:r>
-          </w:p>
-        </w:tc>
-        <w:tc>
-          <w:tcPr>
-            <w:tcW w:type="dxa" w:w="1440"/>
-            <w:tcMar>
-              <w:top w:w="80" w:type="dxa"/>
-              <w:bottom w:w="80" w:type="dxa"/>
-              <w:start w:w="100" w:type="dxa"/>
-              <w:end w:w="100" w:type="dxa"/>
-            </w:tcMar>
-            <w:vAlign w:val="center"/>
-            <w:shd w:fill="DFF2E6"/>
-          </w:tcPr>
-          <w:p>
-            <w:pPr>
-              <w:spacing w:after="0"/>
-            </w:pPr>
-            <w:r/>
-            <w:r>
-              <w:rPr>
-                <w:rFonts w:ascii="Arial" w:hAnsi="Arial" w:eastAsia="Apple SD Gothic Neo"/>
-                <w:b/>
-                <w:sz w:val="17"/>
-              </w:rPr>
-              <w:t>수정 가능</w:t>
-            </w:r>
-          </w:p>
-        </w:tc>
-        <w:tc>
-          <w:tcPr>
-            <w:tcW w:type="dxa" w:w="3240"/>
-            <w:tcMar>
-              <w:top w:w="80" w:type="dxa"/>
-              <w:bottom w:w="80" w:type="dxa"/>
-              <w:start w:w="100" w:type="dxa"/>
-              <w:end w:w="100" w:type="dxa"/>
-            </w:tcMar>
-            <w:vAlign w:val="center"/>
-          </w:tcPr>
-          <w:p>
-            <w:pPr>
-              <w:spacing w:after="0"/>
-            </w:pPr>
-            <w:r/>
-            <w:r>
-              <w:rPr>
-                <w:rFonts w:ascii="Arial" w:hAnsi="Arial" w:eastAsia="Apple SD Gothic Neo"/>
-                <w:b w:val="0"/>
-                <w:sz w:val="17"/>
-              </w:rPr>
-              <w:t>자산 관리 &gt; 주차별 &gt; 해당 주차 &gt; 기본 정보/노출본</w:t>
-            </w:r>
-          </w:p>
-        </w:tc>
-        <w:tc>
-          <w:tcPr>
-            <w:tcW w:type="dxa" w:w="3312"/>
-            <w:tcMar>
-              <w:top w:w="80" w:type="dxa"/>
-              <w:bottom w:w="80" w:type="dxa"/>
-              <w:start w:w="100" w:type="dxa"/>
-              <w:end w:w="100" w:type="dxa"/>
-            </w:tcMar>
-            <w:vAlign w:val="center"/>
-          </w:tcPr>
-          <w:p>
-            <w:pPr>
-              <w:spacing w:after="0"/>
-            </w:pPr>
-            <w:r/>
-            <w:r>
-              <w:rPr>
-                <w:rFonts w:ascii="Arial" w:hAnsi="Arial" w:eastAsia="Apple SD Gothic Neo"/>
-                <w:b w:val="0"/>
-                <w:sz w:val="17"/>
-              </w:rPr>
-              <w:t>주차별 백과 소개 문구 수정</w:t>
-            </w:r>
-          </w:p>
-        </w:tc>
-      </w:tr>
-      <w:tr>
-        <w:tc>
-          <w:tcPr>
-            <w:tcW w:type="dxa" w:w="1944"/>
-            <w:tcMar>
-              <w:top w:w="80" w:type="dxa"/>
-              <w:bottom w:w="80" w:type="dxa"/>
-              <w:start w:w="100" w:type="dxa"/>
-              <w:end w:w="100" w:type="dxa"/>
-            </w:tcMar>
-            <w:vAlign w:val="center"/>
-          </w:tcPr>
-          <w:p>
-            <w:pPr>
-              <w:spacing w:after="0"/>
-            </w:pPr>
-            <w:r/>
-            <w:r>
-              <w:rPr>
-                <w:rFonts w:ascii="Arial" w:hAnsi="Arial" w:eastAsia="Apple SD Gothic Neo"/>
-                <w:b w:val="0"/>
-                <w:sz w:val="17"/>
-              </w:rPr>
-              <w:t>다른 주차 찾아보기</w:t>
-            </w:r>
-          </w:p>
-        </w:tc>
-        <w:tc>
-          <w:tcPr>
-            <w:tcW w:type="dxa" w:w="1440"/>
-            <w:tcMar>
-              <w:top w:w="80" w:type="dxa"/>
-              <w:bottom w:w="80" w:type="dxa"/>
-              <w:start w:w="100" w:type="dxa"/>
-              <w:end w:w="100" w:type="dxa"/>
-            </w:tcMar>
-            <w:vAlign w:val="center"/>
-            <w:shd w:fill="FFF0D9"/>
-          </w:tcPr>
-          <w:p>
-            <w:pPr>
-              <w:spacing w:after="0"/>
-            </w:pPr>
-            <w:r/>
-            <w:r>
-              <w:rPr>
-                <w:rFonts w:ascii="Arial" w:hAnsi="Arial" w:eastAsia="Apple SD Gothic Neo"/>
-                <w:b/>
-                <w:sz w:val="17"/>
-              </w:rPr>
-              <w:t>보완 필요</w:t>
-            </w:r>
-          </w:p>
-        </w:tc>
-        <w:tc>
-          <w:tcPr>
-            <w:tcW w:type="dxa" w:w="3240"/>
-            <w:tcMar>
-              <w:top w:w="80" w:type="dxa"/>
-              <w:bottom w:w="80" w:type="dxa"/>
-              <w:start w:w="100" w:type="dxa"/>
-              <w:end w:w="100" w:type="dxa"/>
-            </w:tcMar>
-            <w:vAlign w:val="center"/>
-          </w:tcPr>
-          <w:p>
-            <w:pPr>
-              <w:spacing w:after="0"/>
-            </w:pPr>
-            <w:r/>
-            <w:r>
-              <w:rPr>
-                <w:rFonts w:ascii="Arial" w:hAnsi="Arial" w:eastAsia="Apple SD Gothic Neo"/>
-                <w:b w:val="0"/>
-                <w:sz w:val="17"/>
-              </w:rPr>
-              <w:t>자산 관리 &gt; 주차별</w:t>
-            </w:r>
-          </w:p>
-        </w:tc>
-        <w:tc>
-          <w:tcPr>
-            <w:tcW w:type="dxa" w:w="3312"/>
-            <w:tcMar>
-              <w:top w:w="80" w:type="dxa"/>
-              <w:bottom w:w="80" w:type="dxa"/>
-              <w:start w:w="100" w:type="dxa"/>
-              <w:end w:w="100" w:type="dxa"/>
-            </w:tcMar>
-            <w:vAlign w:val="center"/>
-          </w:tcPr>
-          <w:p>
-            <w:pPr>
-              <w:spacing w:after="0"/>
-            </w:pPr>
-            <w:r/>
-            <w:r>
-              <w:rPr>
-                <w:rFonts w:ascii="Arial" w:hAnsi="Arial" w:eastAsia="Apple SD Gothic Neo"/>
-                <w:b w:val="0"/>
-                <w:sz w:val="17"/>
-              </w:rPr>
-              <w:t>진입 문구/노출 여부 관리</w:t>
+              <w:t>단계별 앱 미리보기와 노출 위치 매핑 필요</w:t>
             </w:r>
           </w:p>
         </w:tc>
       </w:tr>
     </w:tbl>
     <w:p/>
+    <w:p>
+      <w:r>
+        <w:br w:type="page"/>
+      </w:r>
+    </w:p>
     <w:p>
       <w:pPr>
         <w:pStyle w:val="Heading1"/>
@@ -2096,14 +2030,14 @@
           <w:color w:val="2E5C96"/>
           <w:sz w:val="30"/>
         </w:rPr>
-        <w:t>4. 오늘,우리 &gt; 체크리스트</w:t>
+        <w:t>4. 대화 엔진 &gt; 기분별 변주</w:t>
       </w:r>
     </w:p>
     <w:p>
       <w:r>
         <w:drawing>
           <wp:inline xmlns:a="http://schemas.openxmlformats.org/drawingml/2006/main" xmlns:pic="http://schemas.openxmlformats.org/drawingml/2006/picture">
-            <wp:extent cx="2331720" cy="5068252"/>
+            <wp:extent cx="6035040" cy="4149090"/>
             <wp:docPr id="4" name="Picture 4"/>
             <wp:cNvGraphicFramePr>
               <a:graphicFrameLocks noChangeAspect="1"/>
@@ -2112,7 +2046,7 @@
               <a:graphicData uri="http://schemas.openxmlformats.org/drawingml/2006/picture">
                 <pic:pic>
                   <pic:nvPicPr>
-                    <pic:cNvPr id="0" name="04-checklist.png"/>
+                    <pic:cNvPr id="0" name="04-admin-moods.png"/>
                     <pic:cNvPicPr/>
                   </pic:nvPicPr>
                   <pic:blipFill>
@@ -2124,7 +2058,7 @@
                   <pic:spPr>
                     <a:xfrm>
                       <a:off x="0" y="0"/>
-                      <a:ext cx="2331720" cy="5068252"/>
+                      <a:ext cx="6035040" cy="4149090"/>
                     </a:xfrm>
                     <a:prstGeom prst="rect"/>
                   </pic:spPr>
@@ -2151,15 +2085,15 @@
         </w:tblBorders>
       </w:tblPr>
       <w:tblGrid>
-        <w:gridCol w:w="2520"/>
-        <w:gridCol w:w="2520"/>
-        <w:gridCol w:w="2520"/>
-        <w:gridCol w:w="2520"/>
+        <w:gridCol w:w="2556"/>
+        <w:gridCol w:w="2556"/>
+        <w:gridCol w:w="2556"/>
+        <w:gridCol w:w="2556"/>
       </w:tblGrid>
       <w:tr>
         <w:tc>
           <w:tcPr>
-            <w:tcW w:type="dxa" w:w="1944"/>
+            <w:tcW w:type="dxa" w:w="2448"/>
             <w:tcMar>
               <w:top w:w="80" w:type="dxa"/>
               <w:bottom w:w="80" w:type="dxa"/>
@@ -2179,7 +2113,7 @@
                 <w:b/>
                 <w:sz w:val="17"/>
               </w:rPr>
-              <w:t>앱 화면 요소</w:t>
+              <w:t>앱 반영 영역</w:t>
             </w:r>
           </w:p>
         </w:tc>
@@ -2211,7 +2145,7 @@
         </w:tc>
         <w:tc>
           <w:tcPr>
-            <w:tcW w:type="dxa" w:w="3240"/>
+            <w:tcW w:type="dxa" w:w="3024"/>
             <w:tcMar>
               <w:top w:w="80" w:type="dxa"/>
               <w:bottom w:w="80" w:type="dxa"/>
@@ -2231,7 +2165,7 @@
                 <w:b/>
                 <w:sz w:val="17"/>
               </w:rPr>
-              <w:t>관리자 수정 위치</w:t>
+              <w:t>관리자 웹 수정 위치</w:t>
             </w:r>
           </w:p>
         </w:tc>
@@ -2265,7 +2199,7 @@
       <w:tr>
         <w:tc>
           <w:tcPr>
-            <w:tcW w:type="dxa" w:w="1944"/>
+            <w:tcW w:type="dxa" w:w="2448"/>
             <w:tcMar>
               <w:top w:w="80" w:type="dxa"/>
               <w:bottom w:w="80" w:type="dxa"/>
@@ -2283,9 +2217,9 @@
               <w:rPr>
                 <w:rFonts w:ascii="Arial" w:hAnsi="Arial" w:eastAsia="Apple SD Gothic Neo"/>
                 <w:b w:val="0"/>
-                <w:sz w:val="17"/>
+                <w:sz w:val="16"/>
               </w:rPr>
-              <w:t>체크리스트 항목</w:t>
+              <w:t>앱: 기분 선택 후 공감 문장</w:t>
             </w:r>
           </w:p>
         </w:tc>
@@ -2318,7 +2252,7 @@
         </w:tc>
         <w:tc>
           <w:tcPr>
-            <w:tcW w:type="dxa" w:w="3240"/>
+            <w:tcW w:type="dxa" w:w="3024"/>
             <w:tcMar>
               <w:top w:w="80" w:type="dxa"/>
               <w:bottom w:w="80" w:type="dxa"/>
@@ -2336,9 +2270,9 @@
               <w:rPr>
                 <w:rFonts w:ascii="Arial" w:hAnsi="Arial" w:eastAsia="Apple SD Gothic Neo"/>
                 <w:b w:val="0"/>
-                <w:sz w:val="17"/>
+                <w:sz w:val="16"/>
               </w:rPr>
-              <w:t>자산 관리 &gt; 주차별 &gt; 해당 주차 &gt; 체크리스트</w:t>
+              <w:t>기분별 변주</w:t>
             </w:r>
           </w:p>
         </w:tc>
@@ -2362,9 +2296,9 @@
               <w:rPr>
                 <w:rFonts w:ascii="Arial" w:hAnsi="Arial" w:eastAsia="Apple SD Gothic Neo"/>
                 <w:b w:val="0"/>
-                <w:sz w:val="17"/>
+                <w:sz w:val="16"/>
               </w:rPr>
-              <w:t>항목 문구 수정</w:t>
+              <w:t>mood_intake 행의 기분별 응답 후보 수정</w:t>
             </w:r>
           </w:p>
         </w:tc>
@@ -2372,7 +2306,7 @@
       <w:tr>
         <w:tc>
           <w:tcPr>
-            <w:tcW w:type="dxa" w:w="1944"/>
+            <w:tcW w:type="dxa" w:w="2448"/>
             <w:tcMar>
               <w:top w:w="80" w:type="dxa"/>
               <w:bottom w:w="80" w:type="dxa"/>
@@ -2390,9 +2324,9 @@
               <w:rPr>
                 <w:rFonts w:ascii="Arial" w:hAnsi="Arial" w:eastAsia="Apple SD Gothic Neo"/>
                 <w:b w:val="0"/>
-                <w:sz w:val="17"/>
+                <w:sz w:val="16"/>
               </w:rPr>
-              <w:t>항목 노출 여부</w:t>
+              <w:t>앱: 기분별 톤 보정</w:t>
             </w:r>
           </w:p>
         </w:tc>
@@ -2425,7 +2359,7 @@
         </w:tc>
         <w:tc>
           <w:tcPr>
-            <w:tcW w:type="dxa" w:w="3240"/>
+            <w:tcW w:type="dxa" w:w="3024"/>
             <w:tcMar>
               <w:top w:w="80" w:type="dxa"/>
               <w:bottom w:w="80" w:type="dxa"/>
@@ -2443,9 +2377,9 @@
               <w:rPr>
                 <w:rFonts w:ascii="Arial" w:hAnsi="Arial" w:eastAsia="Apple SD Gothic Neo"/>
                 <w:b w:val="0"/>
-                <w:sz w:val="17"/>
+                <w:sz w:val="16"/>
               </w:rPr>
-              <w:t>자산 관리 &gt; 주차별 &gt; 해당 주차 &gt; 체크리스트</w:t>
+              <w:t>기분별 변주</w:t>
             </w:r>
           </w:p>
         </w:tc>
@@ -2469,116 +2403,9 @@
               <w:rPr>
                 <w:rFonts w:ascii="Arial" w:hAnsi="Arial" w:eastAsia="Apple SD Gothic Neo"/>
                 <w:b w:val="0"/>
-                <w:sz w:val="17"/>
+                <w:sz w:val="16"/>
               </w:rPr>
-              <w:t>항목별 앱 노출 on/off</w:t>
-            </w:r>
-          </w:p>
-        </w:tc>
-      </w:tr>
-      <w:tr>
-        <w:tc>
-          <w:tcPr>
-            <w:tcW w:type="dxa" w:w="1944"/>
-            <w:tcMar>
-              <w:top w:w="80" w:type="dxa"/>
-              <w:bottom w:w="80" w:type="dxa"/>
-              <w:start w:w="100" w:type="dxa"/>
-              <w:end w:w="100" w:type="dxa"/>
-            </w:tcMar>
-            <w:vAlign w:val="center"/>
-          </w:tcPr>
-          <w:p>
-            <w:pPr>
-              <w:spacing w:after="0"/>
-            </w:pPr>
-            <w:r/>
-            <w:r>
-              <w:rPr>
-                <w:rFonts w:ascii="Arial" w:hAnsi="Arial" w:eastAsia="Apple SD Gothic Neo"/>
-                <w:b w:val="0"/>
-                <w:sz w:val="17"/>
-              </w:rPr>
-              <w:t>완료율/체크 상태</w:t>
-            </w:r>
-          </w:p>
-        </w:tc>
-        <w:tc>
-          <w:tcPr>
-            <w:tcW w:type="dxa" w:w="1440"/>
-            <w:tcMar>
-              <w:top w:w="80" w:type="dxa"/>
-              <w:bottom w:w="80" w:type="dxa"/>
-              <w:start w:w="100" w:type="dxa"/>
-              <w:end w:w="100" w:type="dxa"/>
-            </w:tcMar>
-            <w:vAlign w:val="center"/>
-            <w:shd w:fill="EEEEEE"/>
-          </w:tcPr>
-          <w:p>
-            <w:pPr>
-              <w:spacing w:after="0"/>
-            </w:pPr>
-            <w:r/>
-            <w:r>
-              <w:rPr>
-                <w:rFonts w:ascii="Arial" w:hAnsi="Arial" w:eastAsia="Apple SD Gothic Neo"/>
-                <w:b/>
-                <w:sz w:val="17"/>
-              </w:rPr>
-              <w:t>사용자 기록</w:t>
-            </w:r>
-          </w:p>
-        </w:tc>
-        <w:tc>
-          <w:tcPr>
-            <w:tcW w:type="dxa" w:w="3240"/>
-            <w:tcMar>
-              <w:top w:w="80" w:type="dxa"/>
-              <w:bottom w:w="80" w:type="dxa"/>
-              <w:start w:w="100" w:type="dxa"/>
-              <w:end w:w="100" w:type="dxa"/>
-            </w:tcMar>
-            <w:vAlign w:val="center"/>
-          </w:tcPr>
-          <w:p>
-            <w:pPr>
-              <w:spacing w:after="0"/>
-            </w:pPr>
-            <w:r/>
-            <w:r>
-              <w:rPr>
-                <w:rFonts w:ascii="Arial" w:hAnsi="Arial" w:eastAsia="Apple SD Gothic Neo"/>
-                <w:b w:val="0"/>
-                <w:sz w:val="17"/>
-              </w:rPr>
-              <w:t>사용자별 기록 관리</w:t>
-            </w:r>
-          </w:p>
-        </w:tc>
-        <w:tc>
-          <w:tcPr>
-            <w:tcW w:type="dxa" w:w="3312"/>
-            <w:tcMar>
-              <w:top w:w="80" w:type="dxa"/>
-              <w:bottom w:w="80" w:type="dxa"/>
-              <w:start w:w="100" w:type="dxa"/>
-              <w:end w:w="100" w:type="dxa"/>
-            </w:tcMar>
-            <w:vAlign w:val="center"/>
-          </w:tcPr>
-          <w:p>
-            <w:pPr>
-              <w:spacing w:after="0"/>
-            </w:pPr>
-            <w:r/>
-            <w:r>
-              <w:rPr>
-                <w:rFonts w:ascii="Arial" w:hAnsi="Arial" w:eastAsia="Apple SD Gothic Neo"/>
-                <w:b w:val="0"/>
-                <w:sz w:val="17"/>
-              </w:rPr>
-              <w:t>보정 정책 필요 시 기능 추가</w:t>
+              <w:t>기쁨/걱정/슬픔 등 톤별 문구 관리</w:t>
             </w:r>
           </w:p>
         </w:tc>
@@ -2601,14 +2428,14 @@
           <w:color w:val="2E5C96"/>
           <w:sz w:val="30"/>
         </w:rPr>
-        <w:t>5. 아기와 대화 &gt; 기분 선택</w:t>
+        <w:t>5. 시스템 운영 &gt; 브랜딩</w:t>
       </w:r>
     </w:p>
     <w:p>
       <w:r>
         <w:drawing>
           <wp:inline xmlns:a="http://schemas.openxmlformats.org/drawingml/2006/main" xmlns:pic="http://schemas.openxmlformats.org/drawingml/2006/picture">
-            <wp:extent cx="2331720" cy="5068252"/>
+            <wp:extent cx="6035040" cy="4149090"/>
             <wp:docPr id="5" name="Picture 5"/>
             <wp:cNvGraphicFramePr>
               <a:graphicFrameLocks noChangeAspect="1"/>
@@ -2617,7 +2444,7 @@
               <a:graphicData uri="http://schemas.openxmlformats.org/drawingml/2006/picture">
                 <pic:pic>
                   <pic:nvPicPr>
-                    <pic:cNvPr id="0" name="05-chat-mood.png"/>
+                    <pic:cNvPr id="0" name="05-admin-branding.png"/>
                     <pic:cNvPicPr/>
                   </pic:nvPicPr>
                   <pic:blipFill>
@@ -2629,7 +2456,7 @@
                   <pic:spPr>
                     <a:xfrm>
                       <a:off x="0" y="0"/>
-                      <a:ext cx="2331720" cy="5068252"/>
+                      <a:ext cx="6035040" cy="4149090"/>
                     </a:xfrm>
                     <a:prstGeom prst="rect"/>
                   </pic:spPr>
@@ -2656,15 +2483,15 @@
         </w:tblBorders>
       </w:tblPr>
       <w:tblGrid>
-        <w:gridCol w:w="2520"/>
-        <w:gridCol w:w="2520"/>
-        <w:gridCol w:w="2520"/>
-        <w:gridCol w:w="2520"/>
+        <w:gridCol w:w="2556"/>
+        <w:gridCol w:w="2556"/>
+        <w:gridCol w:w="2556"/>
+        <w:gridCol w:w="2556"/>
       </w:tblGrid>
       <w:tr>
         <w:tc>
           <w:tcPr>
-            <w:tcW w:type="dxa" w:w="1944"/>
+            <w:tcW w:type="dxa" w:w="2448"/>
             <w:tcMar>
               <w:top w:w="80" w:type="dxa"/>
               <w:bottom w:w="80" w:type="dxa"/>
@@ -2684,7 +2511,7 @@
                 <w:b/>
                 <w:sz w:val="17"/>
               </w:rPr>
-              <w:t>앱 화면 요소</w:t>
+              <w:t>앱 반영 영역</w:t>
             </w:r>
           </w:p>
         </w:tc>
@@ -2716,7 +2543,7 @@
         </w:tc>
         <w:tc>
           <w:tcPr>
-            <w:tcW w:type="dxa" w:w="3240"/>
+            <w:tcW w:type="dxa" w:w="3024"/>
             <w:tcMar>
               <w:top w:w="80" w:type="dxa"/>
               <w:bottom w:w="80" w:type="dxa"/>
@@ -2736,7 +2563,7 @@
                 <w:b/>
                 <w:sz w:val="17"/>
               </w:rPr>
-              <w:t>관리자 수정 위치</w:t>
+              <w:t>관리자 웹 수정 위치</w:t>
             </w:r>
           </w:p>
         </w:tc>
@@ -2770,7 +2597,7 @@
       <w:tr>
         <w:tc>
           <w:tcPr>
-            <w:tcW w:type="dxa" w:w="1944"/>
+            <w:tcW w:type="dxa" w:w="2448"/>
             <w:tcMar>
               <w:top w:w="80" w:type="dxa"/>
               <w:bottom w:w="80" w:type="dxa"/>
@@ -2788,9 +2615,9 @@
               <w:rPr>
                 <w:rFonts w:ascii="Arial" w:hAnsi="Arial" w:eastAsia="Apple SD Gothic Neo"/>
                 <w:b w:val="0"/>
-                <w:sz w:val="17"/>
+                <w:sz w:val="16"/>
               </w:rPr>
-              <w:t>첫 질문</w:t>
+              <w:t>앱: 외부 설문 버튼</w:t>
             </w:r>
           </w:p>
         </w:tc>
@@ -2823,7 +2650,7 @@
         </w:tc>
         <w:tc>
           <w:tcPr>
-            <w:tcW w:type="dxa" w:w="3240"/>
+            <w:tcW w:type="dxa" w:w="3024"/>
             <w:tcMar>
               <w:top w:w="80" w:type="dxa"/>
               <w:bottom w:w="80" w:type="dxa"/>
@@ -2841,9 +2668,9 @@
               <w:rPr>
                 <w:rFonts w:ascii="Arial" w:hAnsi="Arial" w:eastAsia="Apple SD Gothic Neo"/>
                 <w:b w:val="0"/>
-                <w:sz w:val="17"/>
+                <w:sz w:val="16"/>
               </w:rPr>
-              <w:t>대화 엔진 &gt; 워크플로우</w:t>
+              <w:t>브랜딩 &gt; 외부 설문 노출</w:t>
             </w:r>
           </w:p>
         </w:tc>
@@ -2867,9 +2694,9 @@
               <w:rPr>
                 <w:rFonts w:ascii="Arial" w:hAnsi="Arial" w:eastAsia="Apple SD Gothic Neo"/>
                 <w:b w:val="0"/>
-                <w:sz w:val="17"/>
+                <w:sz w:val="16"/>
               </w:rPr>
-              <w:t>질문 문구 수정</w:t>
+              <w:t>버튼명, 링크, 보이기/가림 처리</w:t>
             </w:r>
           </w:p>
         </w:tc>
@@ -2877,7 +2704,7 @@
       <w:tr>
         <w:tc>
           <w:tcPr>
-            <w:tcW w:type="dxa" w:w="1944"/>
+            <w:tcW w:type="dxa" w:w="2448"/>
             <w:tcMar>
               <w:top w:w="80" w:type="dxa"/>
               <w:bottom w:w="80" w:type="dxa"/>
@@ -2895,9 +2722,9 @@
               <w:rPr>
                 <w:rFonts w:ascii="Arial" w:hAnsi="Arial" w:eastAsia="Apple SD Gothic Neo"/>
                 <w:b w:val="0"/>
-                <w:sz w:val="17"/>
+                <w:sz w:val="16"/>
               </w:rPr>
-              <w:t>기분 버튼</w:t>
+              <w:t>앱: 마스코트/브랜딩 이미지</w:t>
             </w:r>
           </w:p>
         </w:tc>
@@ -2930,7 +2757,7 @@
         </w:tc>
         <w:tc>
           <w:tcPr>
-            <w:tcW w:type="dxa" w:w="3240"/>
+            <w:tcW w:type="dxa" w:w="3024"/>
             <w:tcMar>
               <w:top w:w="80" w:type="dxa"/>
               <w:bottom w:w="80" w:type="dxa"/>
@@ -2948,9 +2775,9 @@
               <w:rPr>
                 <w:rFonts w:ascii="Arial" w:hAnsi="Arial" w:eastAsia="Apple SD Gothic Neo"/>
                 <w:b w:val="0"/>
-                <w:sz w:val="17"/>
+                <w:sz w:val="16"/>
               </w:rPr>
-              <w:t>대화 엔진 &gt; 워크플로우</w:t>
+              <w:t>브랜딩</w:t>
             </w:r>
           </w:p>
         </w:tc>
@@ -2974,9 +2801,9 @@
               <w:rPr>
                 <w:rFonts w:ascii="Arial" w:hAnsi="Arial" w:eastAsia="Apple SD Gothic Neo"/>
                 <w:b w:val="0"/>
-                <w:sz w:val="17"/>
+                <w:sz w:val="16"/>
               </w:rPr>
-              <w:t>버튼 라벨/전송 문구 수정</w:t>
+              <w:t>이미지 업로드/교체</w:t>
             </w:r>
           </w:p>
         </w:tc>
@@ -2984,7 +2811,7 @@
       <w:tr>
         <w:tc>
           <w:tcPr>
-            <w:tcW w:type="dxa" w:w="1944"/>
+            <w:tcW w:type="dxa" w:w="2448"/>
             <w:tcMar>
               <w:top w:w="80" w:type="dxa"/>
               <w:bottom w:w="80" w:type="dxa"/>
@@ -3002,116 +2829,9 @@
               <w:rPr>
                 <w:rFonts w:ascii="Arial" w:hAnsi="Arial" w:eastAsia="Apple SD Gothic Neo"/>
                 <w:b w:val="0"/>
-                <w:sz w:val="17"/>
+                <w:sz w:val="16"/>
               </w:rPr>
-              <w:t>공감 문장</w:t>
-            </w:r>
-          </w:p>
-        </w:tc>
-        <w:tc>
-          <w:tcPr>
-            <w:tcW w:type="dxa" w:w="1440"/>
-            <w:tcMar>
-              <w:top w:w="80" w:type="dxa"/>
-              <w:bottom w:w="80" w:type="dxa"/>
-              <w:start w:w="100" w:type="dxa"/>
-              <w:end w:w="100" w:type="dxa"/>
-            </w:tcMar>
-            <w:vAlign w:val="center"/>
-            <w:shd w:fill="DFF2E6"/>
-          </w:tcPr>
-          <w:p>
-            <w:pPr>
-              <w:spacing w:after="0"/>
-            </w:pPr>
-            <w:r/>
-            <w:r>
-              <w:rPr>
-                <w:rFonts w:ascii="Arial" w:hAnsi="Arial" w:eastAsia="Apple SD Gothic Neo"/>
-                <w:b/>
-                <w:sz w:val="17"/>
-              </w:rPr>
-              <w:t>수정 가능</w:t>
-            </w:r>
-          </w:p>
-        </w:tc>
-        <w:tc>
-          <w:tcPr>
-            <w:tcW w:type="dxa" w:w="3240"/>
-            <w:tcMar>
-              <w:top w:w="80" w:type="dxa"/>
-              <w:bottom w:w="80" w:type="dxa"/>
-              <w:start w:w="100" w:type="dxa"/>
-              <w:end w:w="100" w:type="dxa"/>
-            </w:tcMar>
-            <w:vAlign w:val="center"/>
-          </w:tcPr>
-          <w:p>
-            <w:pPr>
-              <w:spacing w:after="0"/>
-            </w:pPr>
-            <w:r/>
-            <w:r>
-              <w:rPr>
-                <w:rFonts w:ascii="Arial" w:hAnsi="Arial" w:eastAsia="Apple SD Gothic Neo"/>
-                <w:b w:val="0"/>
-                <w:sz w:val="17"/>
-              </w:rPr>
-              <w:t>대화 엔진 &gt; 기분별 변주</w:t>
-            </w:r>
-          </w:p>
-        </w:tc>
-        <w:tc>
-          <w:tcPr>
-            <w:tcW w:type="dxa" w:w="3312"/>
-            <w:tcMar>
-              <w:top w:w="80" w:type="dxa"/>
-              <w:bottom w:w="80" w:type="dxa"/>
-              <w:start w:w="100" w:type="dxa"/>
-              <w:end w:w="100" w:type="dxa"/>
-            </w:tcMar>
-            <w:vAlign w:val="center"/>
-          </w:tcPr>
-          <w:p>
-            <w:pPr>
-              <w:spacing w:after="0"/>
-            </w:pPr>
-            <w:r/>
-            <w:r>
-              <w:rPr>
-                <w:rFonts w:ascii="Arial" w:hAnsi="Arial" w:eastAsia="Apple SD Gothic Neo"/>
-                <w:b w:val="0"/>
-                <w:sz w:val="17"/>
-              </w:rPr>
-              <w:t>기분별 응답 후보 수정</w:t>
-            </w:r>
-          </w:p>
-        </w:tc>
-      </w:tr>
-      <w:tr>
-        <w:tc>
-          <w:tcPr>
-            <w:tcW w:type="dxa" w:w="1944"/>
-            <w:tcMar>
-              <w:top w:w="80" w:type="dxa"/>
-              <w:bottom w:w="80" w:type="dxa"/>
-              <w:start w:w="100" w:type="dxa"/>
-              <w:end w:w="100" w:type="dxa"/>
-            </w:tcMar>
-            <w:vAlign w:val="center"/>
-          </w:tcPr>
-          <w:p>
-            <w:pPr>
-              <w:spacing w:after="0"/>
-            </w:pPr>
-            <w:r/>
-            <w:r>
-              <w:rPr>
-                <w:rFonts w:ascii="Arial" w:hAnsi="Arial" w:eastAsia="Apple SD Gothic Neo"/>
-                <w:b w:val="0"/>
-                <w:sz w:val="17"/>
-              </w:rPr>
-              <w:t>입력창 안내문</w:t>
+              <w:t>앱: 사용설명서 보기</w:t>
             </w:r>
           </w:p>
         </w:tc>
@@ -3144,7 +2864,7 @@
         </w:tc>
         <w:tc>
           <w:tcPr>
-            <w:tcW w:type="dxa" w:w="3240"/>
+            <w:tcW w:type="dxa" w:w="3024"/>
             <w:tcMar>
               <w:top w:w="80" w:type="dxa"/>
               <w:bottom w:w="80" w:type="dxa"/>
@@ -3162,9 +2882,9 @@
               <w:rPr>
                 <w:rFonts w:ascii="Arial" w:hAnsi="Arial" w:eastAsia="Apple SD Gothic Neo"/>
                 <w:b w:val="0"/>
-                <w:sz w:val="17"/>
+                <w:sz w:val="16"/>
               </w:rPr>
-              <w:t>앱 UI 문구 관리</w:t>
+              <w:t>브랜딩 또는 앱 UI 문구 관리</w:t>
             </w:r>
           </w:p>
         </w:tc>
@@ -3188,15 +2908,20 @@
               <w:rPr>
                 <w:rFonts w:ascii="Arial" w:hAnsi="Arial" w:eastAsia="Apple SD Gothic Neo"/>
                 <w:b w:val="0"/>
-                <w:sz w:val="17"/>
+                <w:sz w:val="16"/>
               </w:rPr>
-              <w:t>현재 고정이면 관리자 필드 추가</w:t>
+              <w:t>사용설명서 문서 URL/파일 교체 기능 필요</w:t>
             </w:r>
           </w:p>
         </w:tc>
       </w:tr>
     </w:tbl>
     <w:p/>
+    <w:p>
+      <w:r>
+        <w:br w:type="page"/>
+      </w:r>
+    </w:p>
     <w:p>
       <w:pPr>
         <w:pStyle w:val="Heading1"/>
@@ -3208,14 +2933,14 @@
           <w:color w:val="2E5C96"/>
           <w:sz w:val="30"/>
         </w:rPr>
-        <w:t>6. 아기와 대화 &gt; 주차 정보 안내</w:t>
+        <w:t>6. 시스템 운영 &gt; 사용자 운영 액션</w:t>
       </w:r>
     </w:p>
     <w:p>
       <w:r>
         <w:drawing>
           <wp:inline xmlns:a="http://schemas.openxmlformats.org/drawingml/2006/main" xmlns:pic="http://schemas.openxmlformats.org/drawingml/2006/picture">
-            <wp:extent cx="2331720" cy="5068252"/>
+            <wp:extent cx="6035040" cy="4149090"/>
             <wp:docPr id="6" name="Picture 6"/>
             <wp:cNvGraphicFramePr>
               <a:graphicFrameLocks noChangeAspect="1"/>
@@ -3224,7 +2949,7 @@
               <a:graphicData uri="http://schemas.openxmlformats.org/drawingml/2006/picture">
                 <pic:pic>
                   <pic:nvPicPr>
-                    <pic:cNvPr id="0" name="06-chat-week-info.png"/>
+                    <pic:cNvPr id="0" name="06-admin-users.png"/>
                     <pic:cNvPicPr/>
                   </pic:nvPicPr>
                   <pic:blipFill>
@@ -3236,7 +2961,7 @@
                   <pic:spPr>
                     <a:xfrm>
                       <a:off x="0" y="0"/>
-                      <a:ext cx="2331720" cy="5068252"/>
+                      <a:ext cx="6035040" cy="4149090"/>
                     </a:xfrm>
                     <a:prstGeom prst="rect"/>
                   </pic:spPr>
@@ -3263,15 +2988,15 @@
         </w:tblBorders>
       </w:tblPr>
       <w:tblGrid>
-        <w:gridCol w:w="2520"/>
-        <w:gridCol w:w="2520"/>
-        <w:gridCol w:w="2520"/>
-        <w:gridCol w:w="2520"/>
+        <w:gridCol w:w="2556"/>
+        <w:gridCol w:w="2556"/>
+        <w:gridCol w:w="2556"/>
+        <w:gridCol w:w="2556"/>
       </w:tblGrid>
       <w:tr>
         <w:tc>
           <w:tcPr>
-            <w:tcW w:type="dxa" w:w="1944"/>
+            <w:tcW w:type="dxa" w:w="2448"/>
             <w:tcMar>
               <w:top w:w="80" w:type="dxa"/>
               <w:bottom w:w="80" w:type="dxa"/>
@@ -3291,7 +3016,7 @@
                 <w:b/>
                 <w:sz w:val="17"/>
               </w:rPr>
-              <w:t>앱 화면 요소</w:t>
+              <w:t>앱 반영 영역</w:t>
             </w:r>
           </w:p>
         </w:tc>
@@ -3323,7 +3048,7 @@
         </w:tc>
         <w:tc>
           <w:tcPr>
-            <w:tcW w:type="dxa" w:w="3240"/>
+            <w:tcW w:type="dxa" w:w="3024"/>
             <w:tcMar>
               <w:top w:w="80" w:type="dxa"/>
               <w:bottom w:w="80" w:type="dxa"/>
@@ -3343,7 +3068,7 @@
                 <w:b/>
                 <w:sz w:val="17"/>
               </w:rPr>
-              <w:t>관리자 수정 위치</w:t>
+              <w:t>관리자 웹 수정 위치</w:t>
             </w:r>
           </w:p>
         </w:tc>
@@ -3377,7 +3102,7 @@
       <w:tr>
         <w:tc>
           <w:tcPr>
-            <w:tcW w:type="dxa" w:w="1944"/>
+            <w:tcW w:type="dxa" w:w="2448"/>
             <w:tcMar>
               <w:top w:w="80" w:type="dxa"/>
               <w:bottom w:w="80" w:type="dxa"/>
@@ -3395,9 +3120,9 @@
               <w:rPr>
                 <w:rFonts w:ascii="Arial" w:hAnsi="Arial" w:eastAsia="Apple SD Gothic Neo"/>
                 <w:b w:val="0"/>
-                <w:sz w:val="17"/>
+                <w:sz w:val="16"/>
               </w:rPr>
-              <w:t>주차 정보 제안/버튼</w:t>
+              <w:t>앱: 15주 2일/임신일수/남은일수</w:t>
             </w:r>
           </w:p>
         </w:tc>
@@ -3411,7 +3136,7 @@
               <w:end w:w="100" w:type="dxa"/>
             </w:tcMar>
             <w:vAlign w:val="center"/>
-            <w:shd w:fill="DFF2E6"/>
+            <w:shd w:fill="E4ECFF"/>
           </w:tcPr>
           <w:p>
             <w:pPr>
@@ -3424,13 +3149,13 @@
                 <w:b/>
                 <w:sz w:val="17"/>
               </w:rPr>
-              <w:t>수정 가능</w:t>
+              <w:t>자동 계산/보정</w:t>
             </w:r>
           </w:p>
         </w:tc>
         <w:tc>
           <w:tcPr>
-            <w:tcW w:type="dxa" w:w="3240"/>
+            <w:tcW w:type="dxa" w:w="3024"/>
             <w:tcMar>
               <w:top w:w="80" w:type="dxa"/>
               <w:bottom w:w="80" w:type="dxa"/>
@@ -3448,9 +3173,9 @@
               <w:rPr>
                 <w:rFonts w:ascii="Arial" w:hAnsi="Arial" w:eastAsia="Apple SD Gothic Neo"/>
                 <w:b w:val="0"/>
-                <w:sz w:val="17"/>
+                <w:sz w:val="16"/>
               </w:rPr>
-              <w:t>대화 엔진 &gt; 워크플로우</w:t>
+              <w:t>사용자 운영 액션 또는 계정 &gt; 사용자 상세</w:t>
             </w:r>
           </w:p>
         </w:tc>
@@ -3474,9 +3199,9 @@
               <w:rPr>
                 <w:rFonts w:ascii="Arial" w:hAnsi="Arial" w:eastAsia="Apple SD Gothic Neo"/>
                 <w:b w:val="0"/>
-                <w:sz w:val="17"/>
+                <w:sz w:val="16"/>
               </w:rPr>
-              <w:t>제안 문구와 버튼 수정</w:t>
+              <w:t>출산예정일/주차 기준값 보정 필드 필요</w:t>
             </w:r>
           </w:p>
         </w:tc>
@@ -3484,7 +3209,7 @@
       <w:tr>
         <w:tc>
           <w:tcPr>
-            <w:tcW w:type="dxa" w:w="1944"/>
+            <w:tcW w:type="dxa" w:w="2448"/>
             <w:tcMar>
               <w:top w:w="80" w:type="dxa"/>
               <w:bottom w:w="80" w:type="dxa"/>
@@ -3502,9 +3227,9 @@
               <w:rPr>
                 <w:rFonts w:ascii="Arial" w:hAnsi="Arial" w:eastAsia="Apple SD Gothic Neo"/>
                 <w:b w:val="0"/>
-                <w:sz w:val="17"/>
+                <w:sz w:val="16"/>
               </w:rPr>
-              <w:t>아기/엄마 bullet</w:t>
+              <w:t>앱: 사용자 상태/접근 제어</w:t>
             </w:r>
           </w:p>
         </w:tc>
@@ -3518,7 +3243,7 @@
               <w:end w:w="100" w:type="dxa"/>
             </w:tcMar>
             <w:vAlign w:val="center"/>
-            <w:shd w:fill="DFF2E6"/>
+            <w:shd w:fill="E4ECFF"/>
           </w:tcPr>
           <w:p>
             <w:pPr>
@@ -3531,13 +3256,13 @@
                 <w:b/>
                 <w:sz w:val="17"/>
               </w:rPr>
-              <w:t>수정 가능</w:t>
+              <w:t>현재 있음</w:t>
             </w:r>
           </w:p>
         </w:tc>
         <w:tc>
           <w:tcPr>
-            <w:tcW w:type="dxa" w:w="3240"/>
+            <w:tcW w:type="dxa" w:w="3024"/>
             <w:tcMar>
               <w:top w:w="80" w:type="dxa"/>
               <w:bottom w:w="80" w:type="dxa"/>
@@ -3555,9 +3280,9 @@
               <w:rPr>
                 <w:rFonts w:ascii="Arial" w:hAnsi="Arial" w:eastAsia="Apple SD Gothic Neo"/>
                 <w:b w:val="0"/>
-                <w:sz w:val="17"/>
+                <w:sz w:val="16"/>
               </w:rPr>
-              <w:t>자산 관리 &gt; 주차별 &gt; 해당 주차 &gt; 일별 본문/기본 정보</w:t>
+              <w:t>사용자 운영 액션</w:t>
             </w:r>
           </w:p>
         </w:tc>
@@ -3581,127 +3306,15 @@
               <w:rPr>
                 <w:rFonts w:ascii="Arial" w:hAnsi="Arial" w:eastAsia="Apple SD Gothic Neo"/>
                 <w:b w:val="0"/>
-                <w:sz w:val="17"/>
+                <w:sz w:val="16"/>
               </w:rPr>
-              <w:t>대화가 참조하는 주차 콘텐츠 수정</w:t>
-            </w:r>
-          </w:p>
-        </w:tc>
-      </w:tr>
-      <w:tr>
-        <w:tc>
-          <w:tcPr>
-            <w:tcW w:type="dxa" w:w="1944"/>
-            <w:tcMar>
-              <w:top w:w="80" w:type="dxa"/>
-              <w:bottom w:w="80" w:type="dxa"/>
-              <w:start w:w="100" w:type="dxa"/>
-              <w:end w:w="100" w:type="dxa"/>
-            </w:tcMar>
-            <w:vAlign w:val="center"/>
-          </w:tcPr>
-          <w:p>
-            <w:pPr>
-              <w:spacing w:after="0"/>
-            </w:pPr>
-            <w:r/>
-            <w:r>
-              <w:rPr>
-                <w:rFonts w:ascii="Arial" w:hAnsi="Arial" w:eastAsia="Apple SD Gothic Neo"/>
-                <w:b w:val="0"/>
-                <w:sz w:val="17"/>
-              </w:rPr>
-              <w:t>임신백과 링크 라벨</w:t>
-            </w:r>
-          </w:p>
-        </w:tc>
-        <w:tc>
-          <w:tcPr>
-            <w:tcW w:type="dxa" w:w="1440"/>
-            <w:tcMar>
-              <w:top w:w="80" w:type="dxa"/>
-              <w:bottom w:w="80" w:type="dxa"/>
-              <w:start w:w="100" w:type="dxa"/>
-              <w:end w:w="100" w:type="dxa"/>
-            </w:tcMar>
-            <w:vAlign w:val="center"/>
-            <w:shd w:fill="FFF0D9"/>
-          </w:tcPr>
-          <w:p>
-            <w:pPr>
-              <w:spacing w:after="0"/>
-            </w:pPr>
-            <w:r/>
-            <w:r>
-              <w:rPr>
-                <w:rFonts w:ascii="Arial" w:hAnsi="Arial" w:eastAsia="Apple SD Gothic Neo"/>
-                <w:b/>
-                <w:sz w:val="17"/>
-              </w:rPr>
-              <w:t>보완 필요</w:t>
-            </w:r>
-          </w:p>
-        </w:tc>
-        <w:tc>
-          <w:tcPr>
-            <w:tcW w:type="dxa" w:w="3240"/>
-            <w:tcMar>
-              <w:top w:w="80" w:type="dxa"/>
-              <w:bottom w:w="80" w:type="dxa"/>
-              <w:start w:w="100" w:type="dxa"/>
-              <w:end w:w="100" w:type="dxa"/>
-            </w:tcMar>
-            <w:vAlign w:val="center"/>
-          </w:tcPr>
-          <w:p>
-            <w:pPr>
-              <w:spacing w:after="0"/>
-            </w:pPr>
-            <w:r/>
-            <w:r>
-              <w:rPr>
-                <w:rFonts w:ascii="Arial" w:hAnsi="Arial" w:eastAsia="Apple SD Gothic Neo"/>
-                <w:b w:val="0"/>
-                <w:sz w:val="17"/>
-              </w:rPr>
-              <w:t>자산 관리 &gt; 주차별 또는 대화 엔진</w:t>
-            </w:r>
-          </w:p>
-        </w:tc>
-        <w:tc>
-          <w:tcPr>
-            <w:tcW w:type="dxa" w:w="3312"/>
-            <w:tcMar>
-              <w:top w:w="80" w:type="dxa"/>
-              <w:bottom w:w="80" w:type="dxa"/>
-              <w:start w:w="100" w:type="dxa"/>
-              <w:end w:w="100" w:type="dxa"/>
-            </w:tcMar>
-            <w:vAlign w:val="center"/>
-          </w:tcPr>
-          <w:p>
-            <w:pPr>
-              <w:spacing w:after="0"/>
-            </w:pPr>
-            <w:r/>
-            <w:r>
-              <w:rPr>
-                <w:rFonts w:ascii="Arial" w:hAnsi="Arial" w:eastAsia="Apple SD Gothic Neo"/>
-                <w:b w:val="0"/>
-                <w:sz w:val="17"/>
-              </w:rPr>
-              <w:t>자동 생성이면 라벨 템플릿 관리 필요</w:t>
+              <w:t>계정 상태 조회/운영 조치</w:t>
             </w:r>
           </w:p>
         </w:tc>
       </w:tr>
     </w:tbl>
     <w:p/>
-    <w:p>
-      <w:r>
-        <w:br w:type="page"/>
-      </w:r>
-    </w:p>
     <w:p>
       <w:pPr>
         <w:pStyle w:val="Heading1"/>
@@ -3713,43 +3326,7 @@
           <w:color w:val="2E5C96"/>
           <w:sz w:val="30"/>
         </w:rPr>
-        <w:t>7. 아기와 대화 &gt; 태교 질문</w:t>
-      </w:r>
-    </w:p>
-    <w:p>
-      <w:r>
-        <w:drawing>
-          <wp:inline xmlns:a="http://schemas.openxmlformats.org/drawingml/2006/main" xmlns:pic="http://schemas.openxmlformats.org/drawingml/2006/picture">
-            <wp:extent cx="2331720" cy="5068252"/>
-            <wp:docPr id="7" name="Picture 7"/>
-            <wp:cNvGraphicFramePr>
-              <a:graphicFrameLocks noChangeAspect="1"/>
-            </wp:cNvGraphicFramePr>
-            <a:graphic>
-              <a:graphicData uri="http://schemas.openxmlformats.org/drawingml/2006/picture">
-                <pic:pic>
-                  <pic:nvPicPr>
-                    <pic:cNvPr id="0" name="07-chat-questions.png"/>
-                    <pic:cNvPicPr/>
-                  </pic:nvPicPr>
-                  <pic:blipFill>
-                    <a:blip r:embed="rId15"/>
-                    <a:stretch>
-                      <a:fillRect/>
-                    </a:stretch>
-                  </pic:blipFill>
-                  <pic:spPr>
-                    <a:xfrm>
-                      <a:off x="0" y="0"/>
-                      <a:ext cx="2331720" cy="5068252"/>
-                    </a:xfrm>
-                    <a:prstGeom prst="rect"/>
-                  </pic:spPr>
-                </pic:pic>
-              </a:graphicData>
-            </a:graphic>
-          </wp:inline>
-        </w:drawing>
+        <w:t>외주사 검수 요구</w:t>
       </w:r>
     </w:p>
     <w:tbl>
@@ -3768,15 +3345,13 @@
         </w:tblBorders>
       </w:tblPr>
       <w:tblGrid>
-        <w:gridCol w:w="2520"/>
-        <w:gridCol w:w="2520"/>
-        <w:gridCol w:w="2520"/>
-        <w:gridCol w:w="2520"/>
+        <w:gridCol w:w="5112"/>
+        <w:gridCol w:w="5112"/>
       </w:tblGrid>
       <w:tr>
         <w:tc>
           <w:tcPr>
-            <w:tcW w:type="dxa" w:w="1944"/>
+            <w:tcW w:type="dxa" w:w="2160"/>
             <w:tcMar>
               <w:top w:w="80" w:type="dxa"/>
               <w:bottom w:w="80" w:type="dxa"/>
@@ -3796,1076 +3371,7 @@
                 <w:b/>
                 <w:sz w:val="17"/>
               </w:rPr>
-              <w:t>앱 화면 요소</w:t>
-            </w:r>
-          </w:p>
-        </w:tc>
-        <w:tc>
-          <w:tcPr>
-            <w:tcW w:type="dxa" w:w="1440"/>
-            <w:tcMar>
-              <w:top w:w="80" w:type="dxa"/>
-              <w:bottom w:w="80" w:type="dxa"/>
-              <w:start w:w="100" w:type="dxa"/>
-              <w:end w:w="100" w:type="dxa"/>
-            </w:tcMar>
-            <w:shd w:fill="F3F4F6"/>
-          </w:tcPr>
-          <w:p>
-            <w:pPr>
-              <w:spacing w:after="0"/>
-            </w:pPr>
-            <w:r/>
-            <w:r>
-              <w:rPr>
-                <w:rFonts w:ascii="Arial" w:hAnsi="Arial" w:eastAsia="Apple SD Gothic Neo"/>
-                <w:b/>
-                <w:sz w:val="17"/>
-              </w:rPr>
-              <w:t>판정</w:t>
-            </w:r>
-          </w:p>
-        </w:tc>
-        <w:tc>
-          <w:tcPr>
-            <w:tcW w:type="dxa" w:w="3240"/>
-            <w:tcMar>
-              <w:top w:w="80" w:type="dxa"/>
-              <w:bottom w:w="80" w:type="dxa"/>
-              <w:start w:w="100" w:type="dxa"/>
-              <w:end w:w="100" w:type="dxa"/>
-            </w:tcMar>
-            <w:shd w:fill="F3F4F6"/>
-          </w:tcPr>
-          <w:p>
-            <w:pPr>
-              <w:spacing w:after="0"/>
-            </w:pPr>
-            <w:r/>
-            <w:r>
-              <w:rPr>
-                <w:rFonts w:ascii="Arial" w:hAnsi="Arial" w:eastAsia="Apple SD Gothic Neo"/>
-                <w:b/>
-                <w:sz w:val="17"/>
-              </w:rPr>
-              <w:t>관리자 수정 위치</w:t>
-            </w:r>
-          </w:p>
-        </w:tc>
-        <w:tc>
-          <w:tcPr>
-            <w:tcW w:type="dxa" w:w="3312"/>
-            <w:tcMar>
-              <w:top w:w="80" w:type="dxa"/>
-              <w:bottom w:w="80" w:type="dxa"/>
-              <w:start w:w="100" w:type="dxa"/>
-              <w:end w:w="100" w:type="dxa"/>
-            </w:tcMar>
-            <w:shd w:fill="F3F4F6"/>
-          </w:tcPr>
-          <w:p>
-            <w:pPr>
-              <w:spacing w:after="0"/>
-            </w:pPr>
-            <w:r/>
-            <w:r>
-              <w:rPr>
-                <w:rFonts w:ascii="Arial" w:hAnsi="Arial" w:eastAsia="Apple SD Gothic Neo"/>
-                <w:b/>
-                <w:sz w:val="17"/>
-              </w:rPr>
-              <w:t>외주사 구현/확인 사항</w:t>
-            </w:r>
-          </w:p>
-        </w:tc>
-      </w:tr>
-      <w:tr>
-        <w:tc>
-          <w:tcPr>
-            <w:tcW w:type="dxa" w:w="1944"/>
-            <w:tcMar>
-              <w:top w:w="80" w:type="dxa"/>
-              <w:bottom w:w="80" w:type="dxa"/>
-              <w:start w:w="100" w:type="dxa"/>
-              <w:end w:w="100" w:type="dxa"/>
-            </w:tcMar>
-            <w:vAlign w:val="center"/>
-          </w:tcPr>
-          <w:p>
-            <w:pPr>
-              <w:spacing w:after="0"/>
-            </w:pPr>
-            <w:r/>
-            <w:r>
-              <w:rPr>
-                <w:rFonts w:ascii="Arial" w:hAnsi="Arial" w:eastAsia="Apple SD Gothic Neo"/>
-                <w:b w:val="0"/>
-                <w:sz w:val="17"/>
-              </w:rPr>
-              <w:t>안내 문구</w:t>
-            </w:r>
-          </w:p>
-        </w:tc>
-        <w:tc>
-          <w:tcPr>
-            <w:tcW w:type="dxa" w:w="1440"/>
-            <w:tcMar>
-              <w:top w:w="80" w:type="dxa"/>
-              <w:bottom w:w="80" w:type="dxa"/>
-              <w:start w:w="100" w:type="dxa"/>
-              <w:end w:w="100" w:type="dxa"/>
-            </w:tcMar>
-            <w:vAlign w:val="center"/>
-            <w:shd w:fill="DFF2E6"/>
-          </w:tcPr>
-          <w:p>
-            <w:pPr>
-              <w:spacing w:after="0"/>
-            </w:pPr>
-            <w:r/>
-            <w:r>
-              <w:rPr>
-                <w:rFonts w:ascii="Arial" w:hAnsi="Arial" w:eastAsia="Apple SD Gothic Neo"/>
-                <w:b/>
-                <w:sz w:val="17"/>
-              </w:rPr>
-              <w:t>수정 가능</w:t>
-            </w:r>
-          </w:p>
-        </w:tc>
-        <w:tc>
-          <w:tcPr>
-            <w:tcW w:type="dxa" w:w="3240"/>
-            <w:tcMar>
-              <w:top w:w="80" w:type="dxa"/>
-              <w:bottom w:w="80" w:type="dxa"/>
-              <w:start w:w="100" w:type="dxa"/>
-              <w:end w:w="100" w:type="dxa"/>
-            </w:tcMar>
-            <w:vAlign w:val="center"/>
-          </w:tcPr>
-          <w:p>
-            <w:pPr>
-              <w:spacing w:after="0"/>
-            </w:pPr>
-            <w:r/>
-            <w:r>
-              <w:rPr>
-                <w:rFonts w:ascii="Arial" w:hAnsi="Arial" w:eastAsia="Apple SD Gothic Neo"/>
-                <w:b w:val="0"/>
-                <w:sz w:val="17"/>
-              </w:rPr>
-              <w:t>대화 엔진 &gt; 워크플로우</w:t>
-            </w:r>
-          </w:p>
-        </w:tc>
-        <w:tc>
-          <w:tcPr>
-            <w:tcW w:type="dxa" w:w="3312"/>
-            <w:tcMar>
-              <w:top w:w="80" w:type="dxa"/>
-              <w:bottom w:w="80" w:type="dxa"/>
-              <w:start w:w="100" w:type="dxa"/>
-              <w:end w:w="100" w:type="dxa"/>
-            </w:tcMar>
-            <w:vAlign w:val="center"/>
-          </w:tcPr>
-          <w:p>
-            <w:pPr>
-              <w:spacing w:after="0"/>
-            </w:pPr>
-            <w:r/>
-            <w:r>
-              <w:rPr>
-                <w:rFonts w:ascii="Arial" w:hAnsi="Arial" w:eastAsia="Apple SD Gothic Neo"/>
-                <w:b w:val="0"/>
-                <w:sz w:val="17"/>
-              </w:rPr>
-              <w:t>질문 안내 문구 수정</w:t>
-            </w:r>
-          </w:p>
-        </w:tc>
-      </w:tr>
-      <w:tr>
-        <w:tc>
-          <w:tcPr>
-            <w:tcW w:type="dxa" w:w="1944"/>
-            <w:tcMar>
-              <w:top w:w="80" w:type="dxa"/>
-              <w:bottom w:w="80" w:type="dxa"/>
-              <w:start w:w="100" w:type="dxa"/>
-              <w:end w:w="100" w:type="dxa"/>
-            </w:tcMar>
-            <w:vAlign w:val="center"/>
-          </w:tcPr>
-          <w:p>
-            <w:pPr>
-              <w:spacing w:after="0"/>
-            </w:pPr>
-            <w:r/>
-            <w:r>
-              <w:rPr>
-                <w:rFonts w:ascii="Arial" w:hAnsi="Arial" w:eastAsia="Apple SD Gothic Neo"/>
-                <w:b w:val="0"/>
-                <w:sz w:val="17"/>
-              </w:rPr>
-              <w:t>태교 질문 카드</w:t>
-            </w:r>
-          </w:p>
-        </w:tc>
-        <w:tc>
-          <w:tcPr>
-            <w:tcW w:type="dxa" w:w="1440"/>
-            <w:tcMar>
-              <w:top w:w="80" w:type="dxa"/>
-              <w:bottom w:w="80" w:type="dxa"/>
-              <w:start w:w="100" w:type="dxa"/>
-              <w:end w:w="100" w:type="dxa"/>
-            </w:tcMar>
-            <w:vAlign w:val="center"/>
-            <w:shd w:fill="DFF2E6"/>
-          </w:tcPr>
-          <w:p>
-            <w:pPr>
-              <w:spacing w:after="0"/>
-            </w:pPr>
-            <w:r/>
-            <w:r>
-              <w:rPr>
-                <w:rFonts w:ascii="Arial" w:hAnsi="Arial" w:eastAsia="Apple SD Gothic Neo"/>
-                <w:b/>
-                <w:sz w:val="17"/>
-              </w:rPr>
-              <w:t>수정 가능</w:t>
-            </w:r>
-          </w:p>
-        </w:tc>
-        <w:tc>
-          <w:tcPr>
-            <w:tcW w:type="dxa" w:w="3240"/>
-            <w:tcMar>
-              <w:top w:w="80" w:type="dxa"/>
-              <w:bottom w:w="80" w:type="dxa"/>
-              <w:start w:w="100" w:type="dxa"/>
-              <w:end w:w="100" w:type="dxa"/>
-            </w:tcMar>
-            <w:vAlign w:val="center"/>
-          </w:tcPr>
-          <w:p>
-            <w:pPr>
-              <w:spacing w:after="0"/>
-            </w:pPr>
-            <w:r/>
-            <w:r>
-              <w:rPr>
-                <w:rFonts w:ascii="Arial" w:hAnsi="Arial" w:eastAsia="Apple SD Gothic Neo"/>
-                <w:b w:val="0"/>
-                <w:sz w:val="17"/>
-              </w:rPr>
-              <w:t>자산 관리 &gt; 주차별 &gt; 해당 주차 &gt; 질문</w:t>
-            </w:r>
-          </w:p>
-        </w:tc>
-        <w:tc>
-          <w:tcPr>
-            <w:tcW w:type="dxa" w:w="3312"/>
-            <w:tcMar>
-              <w:top w:w="80" w:type="dxa"/>
-              <w:bottom w:w="80" w:type="dxa"/>
-              <w:start w:w="100" w:type="dxa"/>
-              <w:end w:w="100" w:type="dxa"/>
-            </w:tcMar>
-            <w:vAlign w:val="center"/>
-          </w:tcPr>
-          <w:p>
-            <w:pPr>
-              <w:spacing w:after="0"/>
-            </w:pPr>
-            <w:r/>
-            <w:r>
-              <w:rPr>
-                <w:rFonts w:ascii="Arial" w:hAnsi="Arial" w:eastAsia="Apple SD Gothic Neo"/>
-                <w:b w:val="0"/>
-                <w:sz w:val="17"/>
-              </w:rPr>
-              <w:t>질문 문구 수정</w:t>
-            </w:r>
-          </w:p>
-        </w:tc>
-      </w:tr>
-      <w:tr>
-        <w:tc>
-          <w:tcPr>
-            <w:tcW w:type="dxa" w:w="1944"/>
-            <w:tcMar>
-              <w:top w:w="80" w:type="dxa"/>
-              <w:bottom w:w="80" w:type="dxa"/>
-              <w:start w:w="100" w:type="dxa"/>
-              <w:end w:w="100" w:type="dxa"/>
-            </w:tcMar>
-            <w:vAlign w:val="center"/>
-          </w:tcPr>
-          <w:p>
-            <w:pPr>
-              <w:spacing w:after="0"/>
-            </w:pPr>
-            <w:r/>
-            <w:r>
-              <w:rPr>
-                <w:rFonts w:ascii="Arial" w:hAnsi="Arial" w:eastAsia="Apple SD Gothic Neo"/>
-                <w:b w:val="0"/>
-                <w:sz w:val="17"/>
-              </w:rPr>
-              <w:t>질문 노출 여부</w:t>
-            </w:r>
-          </w:p>
-        </w:tc>
-        <w:tc>
-          <w:tcPr>
-            <w:tcW w:type="dxa" w:w="1440"/>
-            <w:tcMar>
-              <w:top w:w="80" w:type="dxa"/>
-              <w:bottom w:w="80" w:type="dxa"/>
-              <w:start w:w="100" w:type="dxa"/>
-              <w:end w:w="100" w:type="dxa"/>
-            </w:tcMar>
-            <w:vAlign w:val="center"/>
-            <w:shd w:fill="DFF2E6"/>
-          </w:tcPr>
-          <w:p>
-            <w:pPr>
-              <w:spacing w:after="0"/>
-            </w:pPr>
-            <w:r/>
-            <w:r>
-              <w:rPr>
-                <w:rFonts w:ascii="Arial" w:hAnsi="Arial" w:eastAsia="Apple SD Gothic Neo"/>
-                <w:b/>
-                <w:sz w:val="17"/>
-              </w:rPr>
-              <w:t>수정 가능</w:t>
-            </w:r>
-          </w:p>
-        </w:tc>
-        <w:tc>
-          <w:tcPr>
-            <w:tcW w:type="dxa" w:w="3240"/>
-            <w:tcMar>
-              <w:top w:w="80" w:type="dxa"/>
-              <w:bottom w:w="80" w:type="dxa"/>
-              <w:start w:w="100" w:type="dxa"/>
-              <w:end w:w="100" w:type="dxa"/>
-            </w:tcMar>
-            <w:vAlign w:val="center"/>
-          </w:tcPr>
-          <w:p>
-            <w:pPr>
-              <w:spacing w:after="0"/>
-            </w:pPr>
-            <w:r/>
-            <w:r>
-              <w:rPr>
-                <w:rFonts w:ascii="Arial" w:hAnsi="Arial" w:eastAsia="Apple SD Gothic Neo"/>
-                <w:b w:val="0"/>
-                <w:sz w:val="17"/>
-              </w:rPr>
-              <w:t>자산 관리 &gt; 주차별 &gt; 해당 주차 &gt; 질문</w:t>
-            </w:r>
-          </w:p>
-        </w:tc>
-        <w:tc>
-          <w:tcPr>
-            <w:tcW w:type="dxa" w:w="3312"/>
-            <w:tcMar>
-              <w:top w:w="80" w:type="dxa"/>
-              <w:bottom w:w="80" w:type="dxa"/>
-              <w:start w:w="100" w:type="dxa"/>
-              <w:end w:w="100" w:type="dxa"/>
-            </w:tcMar>
-            <w:vAlign w:val="center"/>
-          </w:tcPr>
-          <w:p>
-            <w:pPr>
-              <w:spacing w:after="0"/>
-            </w:pPr>
-            <w:r/>
-            <w:r>
-              <w:rPr>
-                <w:rFonts w:ascii="Arial" w:hAnsi="Arial" w:eastAsia="Apple SD Gothic Neo"/>
-                <w:b w:val="0"/>
-                <w:sz w:val="17"/>
-              </w:rPr>
-              <w:t>질문별 앱 노출 on/off</w:t>
-            </w:r>
-          </w:p>
-        </w:tc>
-      </w:tr>
-      <w:tr>
-        <w:tc>
-          <w:tcPr>
-            <w:tcW w:type="dxa" w:w="1944"/>
-            <w:tcMar>
-              <w:top w:w="80" w:type="dxa"/>
-              <w:bottom w:w="80" w:type="dxa"/>
-              <w:start w:w="100" w:type="dxa"/>
-              <w:end w:w="100" w:type="dxa"/>
-            </w:tcMar>
-            <w:vAlign w:val="center"/>
-          </w:tcPr>
-          <w:p>
-            <w:pPr>
-              <w:spacing w:after="0"/>
-            </w:pPr>
-            <w:r/>
-            <w:r>
-              <w:rPr>
-                <w:rFonts w:ascii="Arial" w:hAnsi="Arial" w:eastAsia="Apple SD Gothic Neo"/>
-                <w:b w:val="0"/>
-                <w:sz w:val="17"/>
-              </w:rPr>
-              <w:t>질문 후 자유대화 전환</w:t>
-            </w:r>
-          </w:p>
-        </w:tc>
-        <w:tc>
-          <w:tcPr>
-            <w:tcW w:type="dxa" w:w="1440"/>
-            <w:tcMar>
-              <w:top w:w="80" w:type="dxa"/>
-              <w:bottom w:w="80" w:type="dxa"/>
-              <w:start w:w="100" w:type="dxa"/>
-              <w:end w:w="100" w:type="dxa"/>
-            </w:tcMar>
-            <w:vAlign w:val="center"/>
-            <w:shd w:fill="FFF0D9"/>
-          </w:tcPr>
-          <w:p>
-            <w:pPr>
-              <w:spacing w:after="0"/>
-            </w:pPr>
-            <w:r/>
-            <w:r>
-              <w:rPr>
-                <w:rFonts w:ascii="Arial" w:hAnsi="Arial" w:eastAsia="Apple SD Gothic Neo"/>
-                <w:b/>
-                <w:sz w:val="17"/>
-              </w:rPr>
-              <w:t>보완 필요</w:t>
-            </w:r>
-          </w:p>
-        </w:tc>
-        <w:tc>
-          <w:tcPr>
-            <w:tcW w:type="dxa" w:w="3240"/>
-            <w:tcMar>
-              <w:top w:w="80" w:type="dxa"/>
-              <w:bottom w:w="80" w:type="dxa"/>
-              <w:start w:w="100" w:type="dxa"/>
-              <w:end w:w="100" w:type="dxa"/>
-            </w:tcMar>
-            <w:vAlign w:val="center"/>
-          </w:tcPr>
-          <w:p>
-            <w:pPr>
-              <w:spacing w:after="0"/>
-            </w:pPr>
-            <w:r/>
-            <w:r>
-              <w:rPr>
-                <w:rFonts w:ascii="Arial" w:hAnsi="Arial" w:eastAsia="Apple SD Gothic Neo"/>
-                <w:b w:val="0"/>
-                <w:sz w:val="17"/>
-              </w:rPr>
-              <w:t>대화 엔진 &gt; 워크플로우</w:t>
-            </w:r>
-          </w:p>
-        </w:tc>
-        <w:tc>
-          <w:tcPr>
-            <w:tcW w:type="dxa" w:w="3312"/>
-            <w:tcMar>
-              <w:top w:w="80" w:type="dxa"/>
-              <w:bottom w:w="80" w:type="dxa"/>
-              <w:start w:w="100" w:type="dxa"/>
-              <w:end w:w="100" w:type="dxa"/>
-            </w:tcMar>
-            <w:vAlign w:val="center"/>
-          </w:tcPr>
-          <w:p>
-            <w:pPr>
-              <w:spacing w:after="0"/>
-            </w:pPr>
-            <w:r/>
-            <w:r>
-              <w:rPr>
-                <w:rFonts w:ascii="Arial" w:hAnsi="Arial" w:eastAsia="Apple SD Gothic Neo"/>
-                <w:b w:val="0"/>
-                <w:sz w:val="17"/>
-              </w:rPr>
-              <w:t>플로우 미리보기 필요</w:t>
-            </w:r>
-          </w:p>
-        </w:tc>
-      </w:tr>
-    </w:tbl>
-    <w:p/>
-    <w:p>
-      <w:pPr>
-        <w:pStyle w:val="Heading1"/>
-      </w:pPr>
-      <w:r>
-        <w:rPr>
-          <w:rFonts w:ascii="Arial" w:hAnsi="Arial" w:eastAsia="Apple SD Gothic Neo"/>
-          <w:b/>
-          <w:color w:val="2E5C96"/>
-          <w:sz w:val="30"/>
-        </w:rPr>
-        <w:t>8. 마이페이지 &gt; 외부 설문/사용설명서</w:t>
-      </w:r>
-    </w:p>
-    <w:p>
-      <w:r>
-        <w:drawing>
-          <wp:inline xmlns:a="http://schemas.openxmlformats.org/drawingml/2006/main" xmlns:pic="http://schemas.openxmlformats.org/drawingml/2006/picture">
-            <wp:extent cx="2331720" cy="5068252"/>
-            <wp:docPr id="8" name="Picture 8"/>
-            <wp:cNvGraphicFramePr>
-              <a:graphicFrameLocks noChangeAspect="1"/>
-            </wp:cNvGraphicFramePr>
-            <a:graphic>
-              <a:graphicData uri="http://schemas.openxmlformats.org/drawingml/2006/picture">
-                <pic:pic>
-                  <pic:nvPicPr>
-                    <pic:cNvPr id="0" name="08-profile-survey.png"/>
-                    <pic:cNvPicPr/>
-                  </pic:nvPicPr>
-                  <pic:blipFill>
-                    <a:blip r:embed="rId16"/>
-                    <a:stretch>
-                      <a:fillRect/>
-                    </a:stretch>
-                  </pic:blipFill>
-                  <pic:spPr>
-                    <a:xfrm>
-                      <a:off x="0" y="0"/>
-                      <a:ext cx="2331720" cy="5068252"/>
-                    </a:xfrm>
-                    <a:prstGeom prst="rect"/>
-                  </pic:spPr>
-                </pic:pic>
-              </a:graphicData>
-            </a:graphic>
-          </wp:inline>
-        </w:drawing>
-      </w:r>
-    </w:p>
-    <w:tbl>
-      <w:tblPr>
-        <w:tblW w:type="auto" w:w="0"/>
-        <w:jc w:val="left"/>
-        <w:tblLayout w:type="fixed"/>
-        <w:tblLook w:firstColumn="1" w:firstRow="1" w:lastColumn="0" w:lastRow="0" w:noHBand="0" w:noVBand="1" w:val="04A0"/>
-        <w:tblBorders>
-          <w:top w:val="single" w:sz="4" w:space="0" w:color="DADCE0"/>
-          <w:left w:val="single" w:sz="4" w:space="0" w:color="DADCE0"/>
-          <w:bottom w:val="single" w:sz="4" w:space="0" w:color="DADCE0"/>
-          <w:right w:val="single" w:sz="4" w:space="0" w:color="DADCE0"/>
-          <w:insideH w:val="single" w:sz="4" w:space="0" w:color="DADCE0"/>
-          <w:insideV w:val="single" w:sz="4" w:space="0" w:color="DADCE0"/>
-        </w:tblBorders>
-      </w:tblPr>
-      <w:tblGrid>
-        <w:gridCol w:w="2520"/>
-        <w:gridCol w:w="2520"/>
-        <w:gridCol w:w="2520"/>
-        <w:gridCol w:w="2520"/>
-      </w:tblGrid>
-      <w:tr>
-        <w:tc>
-          <w:tcPr>
-            <w:tcW w:type="dxa" w:w="1944"/>
-            <w:tcMar>
-              <w:top w:w="80" w:type="dxa"/>
-              <w:bottom w:w="80" w:type="dxa"/>
-              <w:start w:w="100" w:type="dxa"/>
-              <w:end w:w="100" w:type="dxa"/>
-            </w:tcMar>
-            <w:shd w:fill="F3F4F6"/>
-          </w:tcPr>
-          <w:p>
-            <w:pPr>
-              <w:spacing w:after="0"/>
-            </w:pPr>
-            <w:r/>
-            <w:r>
-              <w:rPr>
-                <w:rFonts w:ascii="Arial" w:hAnsi="Arial" w:eastAsia="Apple SD Gothic Neo"/>
-                <w:b/>
-                <w:sz w:val="17"/>
-              </w:rPr>
-              <w:t>앱 화면 요소</w:t>
-            </w:r>
-          </w:p>
-        </w:tc>
-        <w:tc>
-          <w:tcPr>
-            <w:tcW w:type="dxa" w:w="1440"/>
-            <w:tcMar>
-              <w:top w:w="80" w:type="dxa"/>
-              <w:bottom w:w="80" w:type="dxa"/>
-              <w:start w:w="100" w:type="dxa"/>
-              <w:end w:w="100" w:type="dxa"/>
-            </w:tcMar>
-            <w:shd w:fill="F3F4F6"/>
-          </w:tcPr>
-          <w:p>
-            <w:pPr>
-              <w:spacing w:after="0"/>
-            </w:pPr>
-            <w:r/>
-            <w:r>
-              <w:rPr>
-                <w:rFonts w:ascii="Arial" w:hAnsi="Arial" w:eastAsia="Apple SD Gothic Neo"/>
-                <w:b/>
-                <w:sz w:val="17"/>
-              </w:rPr>
-              <w:t>판정</w:t>
-            </w:r>
-          </w:p>
-        </w:tc>
-        <w:tc>
-          <w:tcPr>
-            <w:tcW w:type="dxa" w:w="3240"/>
-            <w:tcMar>
-              <w:top w:w="80" w:type="dxa"/>
-              <w:bottom w:w="80" w:type="dxa"/>
-              <w:start w:w="100" w:type="dxa"/>
-              <w:end w:w="100" w:type="dxa"/>
-            </w:tcMar>
-            <w:shd w:fill="F3F4F6"/>
-          </w:tcPr>
-          <w:p>
-            <w:pPr>
-              <w:spacing w:after="0"/>
-            </w:pPr>
-            <w:r/>
-            <w:r>
-              <w:rPr>
-                <w:rFonts w:ascii="Arial" w:hAnsi="Arial" w:eastAsia="Apple SD Gothic Neo"/>
-                <w:b/>
-                <w:sz w:val="17"/>
-              </w:rPr>
-              <w:t>관리자 수정 위치</w:t>
-            </w:r>
-          </w:p>
-        </w:tc>
-        <w:tc>
-          <w:tcPr>
-            <w:tcW w:type="dxa" w:w="3312"/>
-            <w:tcMar>
-              <w:top w:w="80" w:type="dxa"/>
-              <w:bottom w:w="80" w:type="dxa"/>
-              <w:start w:w="100" w:type="dxa"/>
-              <w:end w:w="100" w:type="dxa"/>
-            </w:tcMar>
-            <w:shd w:fill="F3F4F6"/>
-          </w:tcPr>
-          <w:p>
-            <w:pPr>
-              <w:spacing w:after="0"/>
-            </w:pPr>
-            <w:r/>
-            <w:r>
-              <w:rPr>
-                <w:rFonts w:ascii="Arial" w:hAnsi="Arial" w:eastAsia="Apple SD Gothic Neo"/>
-                <w:b/>
-                <w:sz w:val="17"/>
-              </w:rPr>
-              <w:t>외주사 구현/확인 사항</w:t>
-            </w:r>
-          </w:p>
-        </w:tc>
-      </w:tr>
-      <w:tr>
-        <w:tc>
-          <w:tcPr>
-            <w:tcW w:type="dxa" w:w="1944"/>
-            <w:tcMar>
-              <w:top w:w="80" w:type="dxa"/>
-              <w:bottom w:w="80" w:type="dxa"/>
-              <w:start w:w="100" w:type="dxa"/>
-              <w:end w:w="100" w:type="dxa"/>
-            </w:tcMar>
-            <w:vAlign w:val="center"/>
-          </w:tcPr>
-          <w:p>
-            <w:pPr>
-              <w:spacing w:after="0"/>
-            </w:pPr>
-            <w:r/>
-            <w:r>
-              <w:rPr>
-                <w:rFonts w:ascii="Arial" w:hAnsi="Arial" w:eastAsia="Apple SD Gothic Neo"/>
-                <w:b w:val="0"/>
-                <w:sz w:val="17"/>
-              </w:rPr>
-              <w:t>외부 설문 버튼명/링크</w:t>
-            </w:r>
-          </w:p>
-        </w:tc>
-        <w:tc>
-          <w:tcPr>
-            <w:tcW w:type="dxa" w:w="1440"/>
-            <w:tcMar>
-              <w:top w:w="80" w:type="dxa"/>
-              <w:bottom w:w="80" w:type="dxa"/>
-              <w:start w:w="100" w:type="dxa"/>
-              <w:end w:w="100" w:type="dxa"/>
-            </w:tcMar>
-            <w:vAlign w:val="center"/>
-            <w:shd w:fill="DFF2E6"/>
-          </w:tcPr>
-          <w:p>
-            <w:pPr>
-              <w:spacing w:after="0"/>
-            </w:pPr>
-            <w:r/>
-            <w:r>
-              <w:rPr>
-                <w:rFonts w:ascii="Arial" w:hAnsi="Arial" w:eastAsia="Apple SD Gothic Neo"/>
-                <w:b/>
-                <w:sz w:val="17"/>
-              </w:rPr>
-              <w:t>수정 가능</w:t>
-            </w:r>
-          </w:p>
-        </w:tc>
-        <w:tc>
-          <w:tcPr>
-            <w:tcW w:type="dxa" w:w="3240"/>
-            <w:tcMar>
-              <w:top w:w="80" w:type="dxa"/>
-              <w:bottom w:w="80" w:type="dxa"/>
-              <w:start w:w="100" w:type="dxa"/>
-              <w:end w:w="100" w:type="dxa"/>
-            </w:tcMar>
-            <w:vAlign w:val="center"/>
-          </w:tcPr>
-          <w:p>
-            <w:pPr>
-              <w:spacing w:after="0"/>
-            </w:pPr>
-            <w:r/>
-            <w:r>
-              <w:rPr>
-                <w:rFonts w:ascii="Arial" w:hAnsi="Arial" w:eastAsia="Apple SD Gothic Neo"/>
-                <w:b w:val="0"/>
-                <w:sz w:val="17"/>
-              </w:rPr>
-              <w:t>시스템 운영 &gt; 브랜딩 &gt; 외부 설문 노출</w:t>
-            </w:r>
-          </w:p>
-        </w:tc>
-        <w:tc>
-          <w:tcPr>
-            <w:tcW w:type="dxa" w:w="3312"/>
-            <w:tcMar>
-              <w:top w:w="80" w:type="dxa"/>
-              <w:bottom w:w="80" w:type="dxa"/>
-              <w:start w:w="100" w:type="dxa"/>
-              <w:end w:w="100" w:type="dxa"/>
-            </w:tcMar>
-            <w:vAlign w:val="center"/>
-          </w:tcPr>
-          <w:p>
-            <w:pPr>
-              <w:spacing w:after="0"/>
-            </w:pPr>
-            <w:r/>
-            <w:r>
-              <w:rPr>
-                <w:rFonts w:ascii="Arial" w:hAnsi="Arial" w:eastAsia="Apple SD Gothic Neo"/>
-                <w:b w:val="0"/>
-                <w:sz w:val="17"/>
-              </w:rPr>
-              <w:t>버튼명, 링크 수정</w:t>
-            </w:r>
-          </w:p>
-        </w:tc>
-      </w:tr>
-      <w:tr>
-        <w:tc>
-          <w:tcPr>
-            <w:tcW w:type="dxa" w:w="1944"/>
-            <w:tcMar>
-              <w:top w:w="80" w:type="dxa"/>
-              <w:bottom w:w="80" w:type="dxa"/>
-              <w:start w:w="100" w:type="dxa"/>
-              <w:end w:w="100" w:type="dxa"/>
-            </w:tcMar>
-            <w:vAlign w:val="center"/>
-          </w:tcPr>
-          <w:p>
-            <w:pPr>
-              <w:spacing w:after="0"/>
-            </w:pPr>
-            <w:r/>
-            <w:r>
-              <w:rPr>
-                <w:rFonts w:ascii="Arial" w:hAnsi="Arial" w:eastAsia="Apple SD Gothic Neo"/>
-                <w:b w:val="0"/>
-                <w:sz w:val="17"/>
-              </w:rPr>
-              <w:t>설문 보이기/가림</w:t>
-            </w:r>
-          </w:p>
-        </w:tc>
-        <w:tc>
-          <w:tcPr>
-            <w:tcW w:type="dxa" w:w="1440"/>
-            <w:tcMar>
-              <w:top w:w="80" w:type="dxa"/>
-              <w:bottom w:w="80" w:type="dxa"/>
-              <w:start w:w="100" w:type="dxa"/>
-              <w:end w:w="100" w:type="dxa"/>
-            </w:tcMar>
-            <w:vAlign w:val="center"/>
-            <w:shd w:fill="DFF2E6"/>
-          </w:tcPr>
-          <w:p>
-            <w:pPr>
-              <w:spacing w:after="0"/>
-            </w:pPr>
-            <w:r/>
-            <w:r>
-              <w:rPr>
-                <w:rFonts w:ascii="Arial" w:hAnsi="Arial" w:eastAsia="Apple SD Gothic Neo"/>
-                <w:b/>
-                <w:sz w:val="17"/>
-              </w:rPr>
-              <w:t>수정 가능</w:t>
-            </w:r>
-          </w:p>
-        </w:tc>
-        <w:tc>
-          <w:tcPr>
-            <w:tcW w:type="dxa" w:w="3240"/>
-            <w:tcMar>
-              <w:top w:w="80" w:type="dxa"/>
-              <w:bottom w:w="80" w:type="dxa"/>
-              <w:start w:w="100" w:type="dxa"/>
-              <w:end w:w="100" w:type="dxa"/>
-            </w:tcMar>
-            <w:vAlign w:val="center"/>
-          </w:tcPr>
-          <w:p>
-            <w:pPr>
-              <w:spacing w:after="0"/>
-            </w:pPr>
-            <w:r/>
-            <w:r>
-              <w:rPr>
-                <w:rFonts w:ascii="Arial" w:hAnsi="Arial" w:eastAsia="Apple SD Gothic Neo"/>
-                <w:b w:val="0"/>
-                <w:sz w:val="17"/>
-              </w:rPr>
-              <w:t>시스템 운영 &gt; 브랜딩 &gt; 외부 설문 노출</w:t>
-            </w:r>
-          </w:p>
-        </w:tc>
-        <w:tc>
-          <w:tcPr>
-            <w:tcW w:type="dxa" w:w="3312"/>
-            <w:tcMar>
-              <w:top w:w="80" w:type="dxa"/>
-              <w:bottom w:w="80" w:type="dxa"/>
-              <w:start w:w="100" w:type="dxa"/>
-              <w:end w:w="100" w:type="dxa"/>
-            </w:tcMar>
-            <w:vAlign w:val="center"/>
-          </w:tcPr>
-          <w:p>
-            <w:pPr>
-              <w:spacing w:after="0"/>
-            </w:pPr>
-            <w:r/>
-            <w:r>
-              <w:rPr>
-                <w:rFonts w:ascii="Arial" w:hAnsi="Arial" w:eastAsia="Apple SD Gothic Neo"/>
-                <w:b w:val="0"/>
-                <w:sz w:val="17"/>
-              </w:rPr>
-              <w:t>설문별 노출 on/off</w:t>
-            </w:r>
-          </w:p>
-        </w:tc>
-      </w:tr>
-      <w:tr>
-        <w:tc>
-          <w:tcPr>
-            <w:tcW w:type="dxa" w:w="1944"/>
-            <w:tcMar>
-              <w:top w:w="80" w:type="dxa"/>
-              <w:bottom w:w="80" w:type="dxa"/>
-              <w:start w:w="100" w:type="dxa"/>
-              <w:end w:w="100" w:type="dxa"/>
-            </w:tcMar>
-            <w:vAlign w:val="center"/>
-          </w:tcPr>
-          <w:p>
-            <w:pPr>
-              <w:spacing w:after="0"/>
-            </w:pPr>
-            <w:r/>
-            <w:r>
-              <w:rPr>
-                <w:rFonts w:ascii="Arial" w:hAnsi="Arial" w:eastAsia="Apple SD Gothic Neo"/>
-                <w:b w:val="0"/>
-                <w:sz w:val="17"/>
-              </w:rPr>
-              <w:t>사용설명서 버튼/문서</w:t>
-            </w:r>
-          </w:p>
-        </w:tc>
-        <w:tc>
-          <w:tcPr>
-            <w:tcW w:type="dxa" w:w="1440"/>
-            <w:tcMar>
-              <w:top w:w="80" w:type="dxa"/>
-              <w:bottom w:w="80" w:type="dxa"/>
-              <w:start w:w="100" w:type="dxa"/>
-              <w:end w:w="100" w:type="dxa"/>
-            </w:tcMar>
-            <w:vAlign w:val="center"/>
-            <w:shd w:fill="FFF0D9"/>
-          </w:tcPr>
-          <w:p>
-            <w:pPr>
-              <w:spacing w:after="0"/>
-            </w:pPr>
-            <w:r/>
-            <w:r>
-              <w:rPr>
-                <w:rFonts w:ascii="Arial" w:hAnsi="Arial" w:eastAsia="Apple SD Gothic Neo"/>
-                <w:b/>
-                <w:sz w:val="17"/>
-              </w:rPr>
-              <w:t>보완 필요</w:t>
-            </w:r>
-          </w:p>
-        </w:tc>
-        <w:tc>
-          <w:tcPr>
-            <w:tcW w:type="dxa" w:w="3240"/>
-            <w:tcMar>
-              <w:top w:w="80" w:type="dxa"/>
-              <w:bottom w:w="80" w:type="dxa"/>
-              <w:start w:w="100" w:type="dxa"/>
-              <w:end w:w="100" w:type="dxa"/>
-            </w:tcMar>
-            <w:vAlign w:val="center"/>
-          </w:tcPr>
-          <w:p>
-            <w:pPr>
-              <w:spacing w:after="0"/>
-            </w:pPr>
-            <w:r/>
-            <w:r>
-              <w:rPr>
-                <w:rFonts w:ascii="Arial" w:hAnsi="Arial" w:eastAsia="Apple SD Gothic Neo"/>
-                <w:b w:val="0"/>
-                <w:sz w:val="17"/>
-              </w:rPr>
-              <w:t>시스템 운영 &gt; 브랜딩 또는 앱 UI 문구 관리</w:t>
-            </w:r>
-          </w:p>
-        </w:tc>
-        <w:tc>
-          <w:tcPr>
-            <w:tcW w:type="dxa" w:w="3312"/>
-            <w:tcMar>
-              <w:top w:w="80" w:type="dxa"/>
-              <w:bottom w:w="80" w:type="dxa"/>
-              <w:start w:w="100" w:type="dxa"/>
-              <w:end w:w="100" w:type="dxa"/>
-            </w:tcMar>
-            <w:vAlign w:val="center"/>
-          </w:tcPr>
-          <w:p>
-            <w:pPr>
-              <w:spacing w:after="0"/>
-            </w:pPr>
-            <w:r/>
-            <w:r>
-              <w:rPr>
-                <w:rFonts w:ascii="Arial" w:hAnsi="Arial" w:eastAsia="Apple SD Gothic Neo"/>
-                <w:b w:val="0"/>
-                <w:sz w:val="17"/>
-              </w:rPr>
-              <w:t>문서 URL/파일 교체 기능 필요</w:t>
-            </w:r>
-          </w:p>
-        </w:tc>
-      </w:tr>
-    </w:tbl>
-    <w:p/>
-    <w:p>
-      <w:pPr>
-        <w:pStyle w:val="Heading1"/>
-      </w:pPr>
-      <w:r>
-        <w:rPr>
-          <w:rFonts w:ascii="Arial" w:hAnsi="Arial" w:eastAsia="Apple SD Gothic Neo"/>
-          <w:b/>
-          <w:color w:val="2E5C96"/>
-          <w:sz w:val="30"/>
-        </w:rPr>
-        <w:t>외주사 전달 기준</w:t>
-      </w:r>
-    </w:p>
-    <w:tbl>
-      <w:tblPr>
-        <w:tblW w:type="auto" w:w="0"/>
-        <w:jc w:val="left"/>
-        <w:tblLayout w:type="fixed"/>
-        <w:tblLook w:firstColumn="1" w:firstRow="1" w:lastColumn="0" w:lastRow="0" w:noHBand="0" w:noVBand="1" w:val="04A0"/>
-        <w:tblBorders>
-          <w:top w:val="single" w:sz="4" w:space="0" w:color="DADCE0"/>
-          <w:left w:val="single" w:sz="4" w:space="0" w:color="DADCE0"/>
-          <w:bottom w:val="single" w:sz="4" w:space="0" w:color="DADCE0"/>
-          <w:right w:val="single" w:sz="4" w:space="0" w:color="DADCE0"/>
-          <w:insideH w:val="single" w:sz="4" w:space="0" w:color="DADCE0"/>
-          <w:insideV w:val="single" w:sz="4" w:space="0" w:color="DADCE0"/>
-        </w:tblBorders>
-      </w:tblPr>
-      <w:tblGrid>
-        <w:gridCol w:w="5040"/>
-        <w:gridCol w:w="5040"/>
-      </w:tblGrid>
-      <w:tr>
-        <w:tc>
-          <w:tcPr>
-            <w:tcW w:type="dxa" w:w="1872"/>
-            <w:tcMar>
-              <w:top w:w="80" w:type="dxa"/>
-              <w:bottom w:w="80" w:type="dxa"/>
-              <w:start w:w="100" w:type="dxa"/>
-              <w:end w:w="100" w:type="dxa"/>
-            </w:tcMar>
-            <w:shd w:fill="F3F4F6"/>
-          </w:tcPr>
-          <w:p>
-            <w:pPr>
-              <w:spacing w:after="0"/>
-            </w:pPr>
-            <w:r/>
-            <w:r>
-              <w:rPr>
-                <w:rFonts w:ascii="Arial" w:hAnsi="Arial" w:eastAsia="Apple SD Gothic Neo"/>
-                <w:b/>
-                <w:sz w:val="17"/>
-              </w:rPr>
-              <w:t>구분</w:t>
+              <w:t>항목</w:t>
             </w:r>
           </w:p>
         </w:tc>
@@ -4899,7 +3405,7 @@
       <w:tr>
         <w:tc>
           <w:tcPr>
-            <w:tcW w:type="dxa" w:w="1872"/>
+            <w:tcW w:type="dxa" w:w="2160"/>
             <w:tcMar>
               <w:top w:w="80" w:type="dxa"/>
               <w:bottom w:w="80" w:type="dxa"/>
@@ -4917,9 +3423,9 @@
               <w:rPr>
                 <w:rFonts w:ascii="Arial" w:hAnsi="Arial" w:eastAsia="Apple SD Gothic Neo"/>
                 <w:b w:val="0"/>
-                <w:sz w:val="17"/>
+                <w:sz w:val="16"/>
               </w:rPr>
-              <w:t>수정 가능</w:t>
+              <w:t>관리자 화면 증빙</w:t>
             </w:r>
           </w:p>
         </w:tc>
@@ -4943,9 +3449,9 @@
               <w:rPr>
                 <w:rFonts w:ascii="Arial" w:hAnsi="Arial" w:eastAsia="Apple SD Gothic Neo"/>
                 <w:b w:val="0"/>
-                <w:sz w:val="17"/>
+                <w:sz w:val="16"/>
               </w:rPr>
-              <w:t>관리자에서 저장하면 앱 화면에 반영되어야 합니다.</w:t>
+              <w:t>각 수정 항목마다 관리자 웹 경로와 저장 화면 캡처를 제출해야 합니다.</w:t>
             </w:r>
           </w:p>
         </w:tc>
@@ -4953,7 +3459,7 @@
       <w:tr>
         <w:tc>
           <w:tcPr>
-            <w:tcW w:type="dxa" w:w="1872"/>
+            <w:tcW w:type="dxa" w:w="2160"/>
             <w:tcMar>
               <w:top w:w="80" w:type="dxa"/>
               <w:bottom w:w="80" w:type="dxa"/>
@@ -4971,9 +3477,9 @@
               <w:rPr>
                 <w:rFonts w:ascii="Arial" w:hAnsi="Arial" w:eastAsia="Apple SD Gothic Neo"/>
                 <w:b w:val="0"/>
-                <w:sz w:val="17"/>
+                <w:sz w:val="16"/>
               </w:rPr>
-              <w:t>보완 필요</w:t>
+              <w:t>앱 반영 증빙</w:t>
             </w:r>
           </w:p>
         </w:tc>
@@ -4997,9 +3503,9 @@
               <w:rPr>
                 <w:rFonts w:ascii="Arial" w:hAnsi="Arial" w:eastAsia="Apple SD Gothic Neo"/>
                 <w:b w:val="0"/>
-                <w:sz w:val="17"/>
+                <w:sz w:val="16"/>
               </w:rPr>
-              <w:t>현재 관리자 필드가 없거나 흐름이 분산되어 있으면 새 관리 화면/필드/미리보기를 추가해야 합니다.</w:t>
+              <w:t>저장 후 앱 화면에서 실제 문구/노출 상태가 바뀐 캡처를 제출해야 합니다.</w:t>
             </w:r>
           </w:p>
         </w:tc>
@@ -5007,7 +3513,7 @@
       <w:tr>
         <w:tc>
           <w:tcPr>
-            <w:tcW w:type="dxa" w:w="1872"/>
+            <w:tcW w:type="dxa" w:w="2160"/>
             <w:tcMar>
               <w:top w:w="80" w:type="dxa"/>
               <w:bottom w:w="80" w:type="dxa"/>
@@ -5025,9 +3531,9 @@
               <w:rPr>
                 <w:rFonts w:ascii="Arial" w:hAnsi="Arial" w:eastAsia="Apple SD Gothic Neo"/>
                 <w:b w:val="0"/>
-                <w:sz w:val="17"/>
+                <w:sz w:val="16"/>
               </w:rPr>
-              <w:t>자동 계산/보정</w:t>
+              <w:t>보완 필요 항목</w:t>
             </w:r>
           </w:p>
         </w:tc>
@@ -5051,9 +3557,9 @@
               <w:rPr>
                 <w:rFonts w:ascii="Arial" w:hAnsi="Arial" w:eastAsia="Apple SD Gothic Neo"/>
                 <w:b w:val="0"/>
-                <w:sz w:val="17"/>
+                <w:sz w:val="16"/>
               </w:rPr>
-              <w:t>사용자별 출산예정일, 주차 기준값, 완료 기록처럼 콘텐츠가 아닌 값은 사용자 상세에서 보정 가능해야 합니다.</w:t>
+              <w:t>새 필드 또는 화면을 추가하고, 기존 고정 문구로 남기지 않아야 합니다.</w:t>
             </w:r>
           </w:p>
         </w:tc>
@@ -5061,7 +3567,7 @@
       <w:tr>
         <w:tc>
           <w:tcPr>
-            <w:tcW w:type="dxa" w:w="1872"/>
+            <w:tcW w:type="dxa" w:w="2160"/>
             <w:tcMar>
               <w:top w:w="80" w:type="dxa"/>
               <w:bottom w:w="80" w:type="dxa"/>
@@ -5079,9 +3585,9 @@
               <w:rPr>
                 <w:rFonts w:ascii="Arial" w:hAnsi="Arial" w:eastAsia="Apple SD Gothic Neo"/>
                 <w:b w:val="0"/>
-                <w:sz w:val="17"/>
+                <w:sz w:val="16"/>
               </w:rPr>
-              <w:t>검수 방식</w:t>
+              <w:t>자동 계산/보정 항목</w:t>
             </w:r>
           </w:p>
         </w:tc>
@@ -5105,9 +3611,9 @@
               <w:rPr>
                 <w:rFonts w:ascii="Arial" w:hAnsi="Arial" w:eastAsia="Apple SD Gothic Neo"/>
                 <w:b w:val="0"/>
-                <w:sz w:val="17"/>
+                <w:sz w:val="16"/>
               </w:rPr>
-              <w:t>외주사는 각 행에 대해 관리자 화면 경로, 저장 API, 앱 반영 화면을 캡처로 증빙해야 합니다.</w:t>
+              <w:t>콘텐츠 CMS가 아니라 사용자 상세/운영 액션에서 기준값 보정이 가능해야 합니다.</w:t>
             </w:r>
           </w:p>
         </w:tc>
@@ -5116,7 +3622,7 @@
     <w:p/>
     <w:sectPr>
       <w:pgSz w:w="12240" w:h="15840"/>
-      <w:pgMar w:top="1080" w:right="1080" w:bottom="1080" w:left="1080" w:header="720" w:footer="720" w:gutter="0"/>
+      <w:pgMar w:top="1008" w:right="1008" w:bottom="1008" w:left="1008" w:header="720" w:footer="720" w:gutter="0"/>
       <w:cols w:space="720"/>
       <w:docGrid w:linePitch="360"/>
     </w:sectPr>
@@ -5488,7 +3994,7 @@
     <w:qFormat/>
     <w:rsid w:val="00FC693F"/>
     <w:pPr>
-      <w:spacing w:after="100" w:line="264" w:lineRule="auto"/>
+      <w:spacing w:after="100"/>
     </w:pPr>
     <w:rPr>
       <w:rFonts w:ascii="Arial" w:hAnsi="Arial" w:eastAsia="Apple SD Gothic Neo"/>
@@ -5582,7 +4088,7 @@
       <w:b/>
       <w:bCs/>
       <w:color w:val="4F81BD" w:themeColor="accent1"/>
-      <w:sz w:val="26"/>
+      <w:sz w:val="24"/>
       <w:szCs w:val="26"/>
     </w:rPr>
   </w:style>
@@ -5602,11 +4108,10 @@
       <w:outlineLvl w:val="2"/>
     </w:pPr>
     <w:rPr>
-      <w:rFonts w:asciiTheme="majorHAnsi" w:eastAsiaTheme="majorEastAsia" w:hAnsiTheme="majorHAnsi" w:cstheme="majorBidi" w:ascii="Arial" w:hAnsi="Arial" w:eastAsia="Apple SD Gothic Neo"/>
+      <w:rFonts w:asciiTheme="majorHAnsi" w:eastAsiaTheme="majorEastAsia" w:hAnsiTheme="majorHAnsi" w:cstheme="majorBidi"/>
       <w:b/>
       <w:bCs/>
       <w:color w:val="4F81BD" w:themeColor="accent1"/>
-      <w:sz w:val="22"/>
     </w:rPr>
   </w:style>
   <w:style w:type="paragraph" w:styleId="Heading4">

</xml_diff>

<commit_message>
Frame usage report for admin operators
The handoff report should read as an administrator-facing confirmation document, so developer-oriented words were removed from the DOCX body, tables, and screenshot labels.

Constraint: Keep the report focused on admin web operation, not implementation details.

Rejected: Leaving API, field, implementation, and vendor wording in place | those terms shift the document back toward developers.

Confidence: high

Scope-risk: narrow

Directive: Future edits should describe what an admin can see, change, and verify, not how engineers implement it.

Tested: Scanned DOCX text for developer-oriented terms and found none.

Tested: python-docx reported 6 inline images and 8 tables.

Tested: LibreOffice converted the DOCX to PDF and pdftoppm rendered 7 pages; visually inspected representative pages 1, 3, and 7.

Not-tested: Microsoft Word manual round-trip.
</commit_message>
<xml_diff>
--- a/docs/delivery/support/아가야_관리자_사용보고서.docx
+++ b/docs/delivery/support/아가야_관리자_사용보고서.docx
@@ -8,90 +8,69 @@
         <w:jc w:val="center"/>
       </w:pPr>
       <w:r>
-        <w:rPr>
-          <w:rFonts w:ascii="Arial" w:hAnsi="Arial" w:eastAsia="Apple SD Gothic Neo"/>
-          <w:b/>
-          <w:sz w:val="44"/>
-        </w:rPr>
         <w:t>아가야 관리자 사용 보고서</w:t>
       </w:r>
     </w:p>
     <w:p>
       <w:pPr>
+        <w:pStyle w:val="Subtitle"/>
+        <w:spacing w:after="280"/>
         <w:jc w:val="center"/>
       </w:pPr>
       <w:r>
-        <w:rPr>
-          <w:rFonts w:ascii="Arial" w:hAnsi="Arial" w:eastAsia="Apple SD Gothic Neo"/>
-          <w:b w:val="0"/>
-          <w:color w:val="505050"/>
-          <w:sz w:val="24"/>
-        </w:rPr>
-        <w:t>관리자 웹 화면별 수정 가능 여부 및 구현 확인표</w:t>
+        <w:t>관리자 화면별 수정 가능 여부 확인표</w:t>
       </w:r>
     </w:p>
     <w:p>
       <w:r>
         <w:rPr>
-          <w:rFonts w:ascii="Arial" w:hAnsi="Arial" w:eastAsia="Apple SD Gothic Neo"/>
-          <w:b w:val="0"/>
-          <w:sz w:val="18"/>
+          <w:b/>
         </w:rPr>
-        <w:t>작성일: 2026년 5월 12일</w:t>
+        <w:t xml:space="preserve">작성일: </w:t>
+      </w:r>
+      <w:r>
+        <w:t>2026년 5월 12일</w:t>
       </w:r>
     </w:p>
     <w:p>
       <w:r>
         <w:rPr>
-          <w:rFonts w:ascii="Arial" w:hAnsi="Arial" w:eastAsia="Apple SD Gothic Neo"/>
-          <w:b w:val="0"/>
-          <w:sz w:val="20"/>
+          <w:b/>
         </w:rPr>
-        <w:t>목적: 외주 개발사가 앱에서 보이는 각 영역을 관리자 웹의 어떤 화면에서 수정 가능하게 해야 하는지 확인할 수 있도록, 관리자 웹 캡처와 판정 마크를 함께 정리합니다.</w:t>
+        <w:t xml:space="preserve">목적: </w:t>
+      </w:r>
+      <w:r>
+        <w:t>앱에서 보이는 문구와 버튼, 상태값을 관리자 화면의 어느 위치에서 관리하는지 확인할 수 있도록 관리자 웹 캡처와 판정 마크를 함께 정리합니다.</w:t>
       </w:r>
     </w:p>
     <w:tbl>
       <w:tblPr>
+        <w:tblStyle w:val="TableGrid"/>
         <w:tblW w:type="auto" w:w="0"/>
-        <w:jc w:val="left"/>
-        <w:tblLayout w:type="fixed"/>
+        <w:jc w:val="center"/>
         <w:tblLook w:firstColumn="1" w:firstRow="1" w:lastColumn="0" w:lastRow="0" w:noHBand="0" w:noVBand="1" w:val="04A0"/>
-        <w:tblBorders>
-          <w:top w:val="single" w:sz="4" w:space="0" w:color="DADCE0"/>
-          <w:left w:val="single" w:sz="4" w:space="0" w:color="DADCE0"/>
-          <w:bottom w:val="single" w:sz="4" w:space="0" w:color="DADCE0"/>
-          <w:right w:val="single" w:sz="4" w:space="0" w:color="DADCE0"/>
-          <w:insideH w:val="single" w:sz="4" w:space="0" w:color="DADCE0"/>
-          <w:insideV w:val="single" w:sz="4" w:space="0" w:color="DADCE0"/>
-        </w:tblBorders>
       </w:tblPr>
       <w:tblGrid>
-        <w:gridCol w:w="3408"/>
-        <w:gridCol w:w="3408"/>
-        <w:gridCol w:w="3408"/>
+        <w:gridCol w:w="3360"/>
+        <w:gridCol w:w="3360"/>
+        <w:gridCol w:w="3360"/>
       </w:tblGrid>
       <w:tr>
         <w:tc>
           <w:tcPr>
             <w:tcW w:type="dxa" w:w="1728"/>
-            <w:tcMar>
-              <w:top w:w="80" w:type="dxa"/>
-              <w:bottom w:w="80" w:type="dxa"/>
-              <w:start w:w="100" w:type="dxa"/>
-              <w:end w:w="100" w:type="dxa"/>
-            </w:tcMar>
-            <w:shd w:fill="F3F4F6"/>
+            <w:vAlign w:val="center"/>
+            <w:shd w:fill="EEF3F8"/>
           </w:tcPr>
           <w:p>
             <w:pPr>
-              <w:spacing w:after="0"/>
+              <w:spacing w:after="0" w:line="276" w:lineRule="auto"/>
             </w:pPr>
-            <w:r/>
             <w:r>
               <w:rPr>
-                <w:rFonts w:ascii="Arial" w:hAnsi="Arial" w:eastAsia="Apple SD Gothic Neo"/>
+                <w:rFonts w:ascii="Pretendard" w:hAnsi="Pretendard" w:eastAsia="Pretendard"/>
                 <w:b/>
-                <w:sz w:val="17"/>
+                <w:sz w:val="18"/>
               </w:rPr>
               <w:t>마크</w:t>
             </w:r>
@@ -99,53 +78,41 @@
         </w:tc>
         <w:tc>
           <w:tcPr>
-            <w:tcW w:type="dxa" w:w="3456"/>
-            <w:tcMar>
-              <w:top w:w="80" w:type="dxa"/>
-              <w:bottom w:w="80" w:type="dxa"/>
-              <w:start w:w="100" w:type="dxa"/>
-              <w:end w:w="100" w:type="dxa"/>
-            </w:tcMar>
-            <w:shd w:fill="F3F4F6"/>
+            <w:tcW w:type="dxa" w:w="3744"/>
+            <w:vAlign w:val="center"/>
+            <w:shd w:fill="EEF3F8"/>
           </w:tcPr>
           <w:p>
             <w:pPr>
-              <w:spacing w:after="0"/>
+              <w:spacing w:after="0" w:line="276" w:lineRule="auto"/>
             </w:pPr>
-            <w:r/>
             <w:r>
               <w:rPr>
-                <w:rFonts w:ascii="Arial" w:hAnsi="Arial" w:eastAsia="Apple SD Gothic Neo"/>
+                <w:rFonts w:ascii="Pretendard" w:hAnsi="Pretendard" w:eastAsia="Pretendard"/>
                 <w:b/>
-                <w:sz w:val="17"/>
+                <w:sz w:val="18"/>
               </w:rPr>
-              <w:t>뜻</w:t>
+              <w:t>의미</w:t>
             </w:r>
           </w:p>
         </w:tc>
         <w:tc>
           <w:tcPr>
-            <w:tcW w:type="dxa" w:w="5040"/>
-            <w:tcMar>
-              <w:top w:w="80" w:type="dxa"/>
-              <w:bottom w:w="80" w:type="dxa"/>
-              <w:start w:w="100" w:type="dxa"/>
-              <w:end w:w="100" w:type="dxa"/>
-            </w:tcMar>
-            <w:shd w:fill="F3F4F6"/>
+            <w:tcW w:type="dxa" w:w="4320"/>
+            <w:vAlign w:val="center"/>
+            <w:shd w:fill="EEF3F8"/>
           </w:tcPr>
           <w:p>
             <w:pPr>
-              <w:spacing w:after="0"/>
+              <w:spacing w:after="0" w:line="276" w:lineRule="auto"/>
             </w:pPr>
-            <w:r/>
             <w:r>
               <w:rPr>
-                <w:rFonts w:ascii="Arial" w:hAnsi="Arial" w:eastAsia="Apple SD Gothic Neo"/>
+                <w:rFonts w:ascii="Pretendard" w:hAnsi="Pretendard" w:eastAsia="Pretendard"/>
                 <w:b/>
-                <w:sz w:val="17"/>
+                <w:sz w:val="18"/>
               </w:rPr>
-              <w:t>외주사 확인 사항</w:t>
+              <w:t>관리자 확인 내용</w:t>
             </w:r>
           </w:p>
         </w:tc>
@@ -154,24 +121,17 @@
         <w:tc>
           <w:tcPr>
             <w:tcW w:type="dxa" w:w="1728"/>
-            <w:tcMar>
-              <w:top w:w="80" w:type="dxa"/>
-              <w:bottom w:w="80" w:type="dxa"/>
-              <w:start w:w="100" w:type="dxa"/>
-              <w:end w:w="100" w:type="dxa"/>
-            </w:tcMar>
             <w:vAlign w:val="center"/>
           </w:tcPr>
           <w:p>
             <w:pPr>
-              <w:spacing w:after="0"/>
+              <w:spacing w:after="0" w:line="276" w:lineRule="auto"/>
             </w:pPr>
-            <w:r/>
             <w:r>
               <w:rPr>
-                <w:rFonts w:ascii="Arial" w:hAnsi="Arial" w:eastAsia="Apple SD Gothic Neo"/>
+                <w:rFonts w:ascii="Pretendard" w:hAnsi="Pretendard" w:eastAsia="Pretendard"/>
                 <w:b w:val="0"/>
-                <w:sz w:val="16"/>
+                <w:sz w:val="18"/>
               </w:rPr>
               <w:t>수정 가능</w:t>
             </w:r>
@@ -179,53 +139,39 @@
         </w:tc>
         <w:tc>
           <w:tcPr>
-            <w:tcW w:type="dxa" w:w="3456"/>
-            <w:tcMar>
-              <w:top w:w="80" w:type="dxa"/>
-              <w:bottom w:w="80" w:type="dxa"/>
-              <w:start w:w="100" w:type="dxa"/>
-              <w:end w:w="100" w:type="dxa"/>
-            </w:tcMar>
+            <w:tcW w:type="dxa" w:w="3744"/>
             <w:vAlign w:val="center"/>
           </w:tcPr>
           <w:p>
             <w:pPr>
-              <w:spacing w:after="0"/>
+              <w:spacing w:after="0" w:line="276" w:lineRule="auto"/>
             </w:pPr>
-            <w:r/>
             <w:r>
               <w:rPr>
-                <w:rFonts w:ascii="Arial" w:hAnsi="Arial" w:eastAsia="Apple SD Gothic Neo"/>
+                <w:rFonts w:ascii="Pretendard" w:hAnsi="Pretendard" w:eastAsia="Pretendard"/>
                 <w:b w:val="0"/>
-                <w:sz w:val="16"/>
+                <w:sz w:val="18"/>
               </w:rPr>
-              <w:t>해당 관리자 웹 화면에서 수정 가능해야 함</w:t>
+              <w:t>해당 관리자 화면에서 바로 수정하는 항목</w:t>
             </w:r>
           </w:p>
         </w:tc>
         <w:tc>
           <w:tcPr>
-            <w:tcW w:type="dxa" w:w="5040"/>
-            <w:tcMar>
-              <w:top w:w="80" w:type="dxa"/>
-              <w:bottom w:w="80" w:type="dxa"/>
-              <w:start w:w="100" w:type="dxa"/>
-              <w:end w:w="100" w:type="dxa"/>
-            </w:tcMar>
+            <w:tcW w:type="dxa" w:w="4320"/>
             <w:vAlign w:val="center"/>
           </w:tcPr>
           <w:p>
             <w:pPr>
-              <w:spacing w:after="0"/>
+              <w:spacing w:after="0" w:line="276" w:lineRule="auto"/>
             </w:pPr>
-            <w:r/>
             <w:r>
               <w:rPr>
-                <w:rFonts w:ascii="Arial" w:hAnsi="Arial" w:eastAsia="Apple SD Gothic Neo"/>
+                <w:rFonts w:ascii="Pretendard" w:hAnsi="Pretendard" w:eastAsia="Pretendard"/>
                 <w:b w:val="0"/>
-                <w:sz w:val="16"/>
+                <w:sz w:val="18"/>
               </w:rPr>
-              <w:t>저장 필드/API/앱 반영 캡처 증빙</w:t>
+              <w:t>저장 후 앱 문구와 노출 상태가 바뀌는지 확인</w:t>
             </w:r>
           </w:p>
         </w:tc>
@@ -234,24 +180,17 @@
         <w:tc>
           <w:tcPr>
             <w:tcW w:type="dxa" w:w="1728"/>
-            <w:tcMar>
-              <w:top w:w="80" w:type="dxa"/>
-              <w:bottom w:w="80" w:type="dxa"/>
-              <w:start w:w="100" w:type="dxa"/>
-              <w:end w:w="100" w:type="dxa"/>
-            </w:tcMar>
             <w:vAlign w:val="center"/>
           </w:tcPr>
           <w:p>
             <w:pPr>
-              <w:spacing w:after="0"/>
+              <w:spacing w:after="0" w:line="276" w:lineRule="auto"/>
             </w:pPr>
-            <w:r/>
             <w:r>
               <w:rPr>
-                <w:rFonts w:ascii="Arial" w:hAnsi="Arial" w:eastAsia="Apple SD Gothic Neo"/>
+                <w:rFonts w:ascii="Pretendard" w:hAnsi="Pretendard" w:eastAsia="Pretendard"/>
                 <w:b w:val="0"/>
-                <w:sz w:val="16"/>
+                <w:sz w:val="18"/>
               </w:rPr>
               <w:t>보완 필요</w:t>
             </w:r>
@@ -259,53 +198,39 @@
         </w:tc>
         <w:tc>
           <w:tcPr>
-            <w:tcW w:type="dxa" w:w="3456"/>
-            <w:tcMar>
-              <w:top w:w="80" w:type="dxa"/>
-              <w:bottom w:w="80" w:type="dxa"/>
-              <w:start w:w="100" w:type="dxa"/>
-              <w:end w:w="100" w:type="dxa"/>
-            </w:tcMar>
+            <w:tcW w:type="dxa" w:w="3744"/>
             <w:vAlign w:val="center"/>
           </w:tcPr>
           <w:p>
             <w:pPr>
-              <w:spacing w:after="0"/>
+              <w:spacing w:after="0" w:line="276" w:lineRule="auto"/>
             </w:pPr>
-            <w:r/>
             <w:r>
               <w:rPr>
-                <w:rFonts w:ascii="Arial" w:hAnsi="Arial" w:eastAsia="Apple SD Gothic Neo"/>
+                <w:rFonts w:ascii="Pretendard" w:hAnsi="Pretendard" w:eastAsia="Pretendard"/>
                 <w:b w:val="0"/>
-                <w:sz w:val="16"/>
+                <w:sz w:val="18"/>
               </w:rPr>
-              <w:t>현재 화면만으로는 부족하거나 새 기능 필요</w:t>
+              <w:t>현재 관리자 화면만으로는 관리 위치가 부족한 항목</w:t>
             </w:r>
           </w:p>
         </w:tc>
         <w:tc>
           <w:tcPr>
-            <w:tcW w:type="dxa" w:w="5040"/>
-            <w:tcMar>
-              <w:top w:w="80" w:type="dxa"/>
-              <w:bottom w:w="80" w:type="dxa"/>
-              <w:start w:w="100" w:type="dxa"/>
-              <w:end w:w="100" w:type="dxa"/>
-            </w:tcMar>
+            <w:tcW w:type="dxa" w:w="4320"/>
             <w:vAlign w:val="center"/>
           </w:tcPr>
           <w:p>
             <w:pPr>
-              <w:spacing w:after="0"/>
+              <w:spacing w:after="0" w:line="276" w:lineRule="auto"/>
             </w:pPr>
-            <w:r/>
             <w:r>
               <w:rPr>
-                <w:rFonts w:ascii="Arial" w:hAnsi="Arial" w:eastAsia="Apple SD Gothic Neo"/>
+                <w:rFonts w:ascii="Pretendard" w:hAnsi="Pretendard" w:eastAsia="Pretendard"/>
                 <w:b w:val="0"/>
-                <w:sz w:val="16"/>
+                <w:sz w:val="18"/>
               </w:rPr>
-              <w:t>필드 추가, 노출 제어, 미리보기, 문서/링크 관리 추가</w:t>
+              <w:t>관리 메뉴, 입력칸, 미리보기, 문서 관리 화면 보강 필요</w:t>
             </w:r>
           </w:p>
         </w:tc>
@@ -314,24 +239,17 @@
         <w:tc>
           <w:tcPr>
             <w:tcW w:type="dxa" w:w="1728"/>
-            <w:tcMar>
-              <w:top w:w="80" w:type="dxa"/>
-              <w:bottom w:w="80" w:type="dxa"/>
-              <w:start w:w="100" w:type="dxa"/>
-              <w:end w:w="100" w:type="dxa"/>
-            </w:tcMar>
             <w:vAlign w:val="center"/>
           </w:tcPr>
           <w:p>
             <w:pPr>
-              <w:spacing w:after="0"/>
+              <w:spacing w:after="0" w:line="276" w:lineRule="auto"/>
             </w:pPr>
-            <w:r/>
             <w:r>
               <w:rPr>
-                <w:rFonts w:ascii="Arial" w:hAnsi="Arial" w:eastAsia="Apple SD Gothic Neo"/>
+                <w:rFonts w:ascii="Pretendard" w:hAnsi="Pretendard" w:eastAsia="Pretendard"/>
                 <w:b w:val="0"/>
-                <w:sz w:val="16"/>
+                <w:sz w:val="18"/>
               </w:rPr>
               <w:t>자동 계산/보정</w:t>
             </w:r>
@@ -339,59 +257,49 @@
         </w:tc>
         <w:tc>
           <w:tcPr>
-            <w:tcW w:type="dxa" w:w="3456"/>
-            <w:tcMar>
-              <w:top w:w="80" w:type="dxa"/>
-              <w:bottom w:w="80" w:type="dxa"/>
-              <w:start w:w="100" w:type="dxa"/>
-              <w:end w:w="100" w:type="dxa"/>
-            </w:tcMar>
+            <w:tcW w:type="dxa" w:w="3744"/>
             <w:vAlign w:val="center"/>
           </w:tcPr>
           <w:p>
             <w:pPr>
-              <w:spacing w:after="0"/>
+              <w:spacing w:after="0" w:line="276" w:lineRule="auto"/>
             </w:pPr>
-            <w:r/>
             <w:r>
               <w:rPr>
-                <w:rFonts w:ascii="Arial" w:hAnsi="Arial" w:eastAsia="Apple SD Gothic Neo"/>
+                <w:rFonts w:ascii="Pretendard" w:hAnsi="Pretendard" w:eastAsia="Pretendard"/>
                 <w:b w:val="0"/>
-                <w:sz w:val="16"/>
+                <w:sz w:val="18"/>
               </w:rPr>
-              <w:t>콘텐츠가 아니라 사용자 상태값</w:t>
+              <w:t>문구가 아니라 사용자 기준일이나 상태에 따라 표시되는 값</w:t>
             </w:r>
           </w:p>
         </w:tc>
         <w:tc>
           <w:tcPr>
-            <w:tcW w:type="dxa" w:w="5040"/>
-            <w:tcMar>
-              <w:top w:w="80" w:type="dxa"/>
-              <w:bottom w:w="80" w:type="dxa"/>
-              <w:start w:w="100" w:type="dxa"/>
-              <w:end w:w="100" w:type="dxa"/>
-            </w:tcMar>
+            <w:tcW w:type="dxa" w:w="4320"/>
             <w:vAlign w:val="center"/>
           </w:tcPr>
           <w:p>
             <w:pPr>
-              <w:spacing w:after="0"/>
+              <w:spacing w:after="0" w:line="276" w:lineRule="auto"/>
             </w:pPr>
-            <w:r/>
             <w:r>
               <w:rPr>
-                <w:rFonts w:ascii="Arial" w:hAnsi="Arial" w:eastAsia="Apple SD Gothic Neo"/>
+                <w:rFonts w:ascii="Pretendard" w:hAnsi="Pretendard" w:eastAsia="Pretendard"/>
                 <w:b w:val="0"/>
-                <w:sz w:val="16"/>
+                <w:sz w:val="18"/>
               </w:rPr>
-              <w:t>사용자 상세에서 기준값 보정 가능해야 함</w:t>
+              <w:t>사용자 상세에서 기준일을 확인하고 보정할 수 있어야 함</w:t>
             </w:r>
           </w:p>
         </w:tc>
       </w:tr>
     </w:tbl>
-    <w:p/>
+    <w:p>
+      <w:pPr>
+        <w:spacing w:after="80"/>
+      </w:pPr>
+    </w:p>
     <w:p>
       <w:r>
         <w:br w:type="page"/>
@@ -400,22 +308,20 @@
     <w:p>
       <w:pPr>
         <w:pStyle w:val="Heading1"/>
+        <w:spacing w:before="160" w:after="160"/>
       </w:pPr>
       <w:r>
-        <w:rPr>
-          <w:rFonts w:ascii="Arial" w:hAnsi="Arial" w:eastAsia="Apple SD Gothic Neo"/>
-          <w:b/>
-          <w:color w:val="2E5C96"/>
-          <w:sz w:val="30"/>
-        </w:rPr>
         <w:t>1. 자산 관리 &gt; 주차별</w:t>
       </w:r>
     </w:p>
     <w:p>
+      <w:pPr>
+        <w:jc w:val="center"/>
+      </w:pPr>
       <w:r>
         <w:drawing>
           <wp:inline xmlns:a="http://schemas.openxmlformats.org/drawingml/2006/main" xmlns:pic="http://schemas.openxmlformats.org/drawingml/2006/picture">
-            <wp:extent cx="6035040" cy="4149090"/>
+            <wp:extent cx="6172200" cy="4243388"/>
             <wp:docPr id="1" name="Picture 1"/>
             <wp:cNvGraphicFramePr>
               <a:graphicFrameLocks noChangeAspect="1"/>
@@ -436,7 +342,7 @@
                   <pic:spPr>
                     <a:xfrm>
                       <a:off x="0" y="0"/>
-                      <a:ext cx="6035040" cy="4149090"/>
+                      <a:ext cx="6172200" cy="4243388"/>
                     </a:xfrm>
                     <a:prstGeom prst="rect"/>
                   </pic:spPr>
@@ -449,73 +355,53 @@
     </w:p>
     <w:tbl>
       <w:tblPr>
+        <w:tblStyle w:val="TableGrid"/>
         <w:tblW w:type="auto" w:w="0"/>
-        <w:jc w:val="left"/>
-        <w:tblLayout w:type="fixed"/>
+        <w:jc w:val="center"/>
         <w:tblLook w:firstColumn="1" w:firstRow="1" w:lastColumn="0" w:lastRow="0" w:noHBand="0" w:noVBand="1" w:val="04A0"/>
-        <w:tblBorders>
-          <w:top w:val="single" w:sz="4" w:space="0" w:color="DADCE0"/>
-          <w:left w:val="single" w:sz="4" w:space="0" w:color="DADCE0"/>
-          <w:bottom w:val="single" w:sz="4" w:space="0" w:color="DADCE0"/>
-          <w:right w:val="single" w:sz="4" w:space="0" w:color="DADCE0"/>
-          <w:insideH w:val="single" w:sz="4" w:space="0" w:color="DADCE0"/>
-          <w:insideV w:val="single" w:sz="4" w:space="0" w:color="DADCE0"/>
-        </w:tblBorders>
       </w:tblPr>
       <w:tblGrid>
-        <w:gridCol w:w="2556"/>
-        <w:gridCol w:w="2556"/>
-        <w:gridCol w:w="2556"/>
-        <w:gridCol w:w="2556"/>
+        <w:gridCol w:w="2520"/>
+        <w:gridCol w:w="2520"/>
+        <w:gridCol w:w="2520"/>
+        <w:gridCol w:w="2520"/>
       </w:tblGrid>
       <w:tr>
         <w:tc>
           <w:tcPr>
-            <w:tcW w:type="dxa" w:w="2448"/>
-            <w:tcMar>
-              <w:top w:w="80" w:type="dxa"/>
-              <w:bottom w:w="80" w:type="dxa"/>
-              <w:start w:w="100" w:type="dxa"/>
-              <w:end w:w="100" w:type="dxa"/>
-            </w:tcMar>
-            <w:shd w:fill="F3F4F6"/>
+            <w:tcW w:type="dxa" w:w="2520"/>
+            <w:vAlign w:val="center"/>
+            <w:shd w:fill="EEF3F8"/>
           </w:tcPr>
           <w:p>
             <w:pPr>
-              <w:spacing w:after="0"/>
+              <w:spacing w:after="0" w:line="276" w:lineRule="auto"/>
             </w:pPr>
-            <w:r/>
             <w:r>
               <w:rPr>
-                <w:rFonts w:ascii="Arial" w:hAnsi="Arial" w:eastAsia="Apple SD Gothic Neo"/>
+                <w:rFonts w:ascii="Pretendard" w:hAnsi="Pretendard" w:eastAsia="Pretendard"/>
                 <w:b/>
-                <w:sz w:val="17"/>
+                <w:sz w:val="18"/>
               </w:rPr>
-              <w:t>앱 반영 영역</w:t>
+              <w:t>앱에서 보이는 영역</w:t>
             </w:r>
           </w:p>
         </w:tc>
         <w:tc>
           <w:tcPr>
             <w:tcW w:type="dxa" w:w="1440"/>
-            <w:tcMar>
-              <w:top w:w="80" w:type="dxa"/>
-              <w:bottom w:w="80" w:type="dxa"/>
-              <w:start w:w="100" w:type="dxa"/>
-              <w:end w:w="100" w:type="dxa"/>
-            </w:tcMar>
-            <w:shd w:fill="F3F4F6"/>
+            <w:vAlign w:val="center"/>
+            <w:shd w:fill="EEF3F8"/>
           </w:tcPr>
           <w:p>
             <w:pPr>
-              <w:spacing w:after="0"/>
+              <w:spacing w:after="0" w:line="276" w:lineRule="auto"/>
             </w:pPr>
-            <w:r/>
             <w:r>
               <w:rPr>
-                <w:rFonts w:ascii="Arial" w:hAnsi="Arial" w:eastAsia="Apple SD Gothic Neo"/>
+                <w:rFonts w:ascii="Pretendard" w:hAnsi="Pretendard" w:eastAsia="Pretendard"/>
                 <w:b/>
-                <w:sz w:val="17"/>
+                <w:sz w:val="18"/>
               </w:rPr>
               <w:t>판정</w:t>
             </w:r>
@@ -523,53 +409,41 @@
         </w:tc>
         <w:tc>
           <w:tcPr>
-            <w:tcW w:type="dxa" w:w="3024"/>
-            <w:tcMar>
-              <w:top w:w="80" w:type="dxa"/>
-              <w:bottom w:w="80" w:type="dxa"/>
-              <w:start w:w="100" w:type="dxa"/>
-              <w:end w:w="100" w:type="dxa"/>
-            </w:tcMar>
-            <w:shd w:fill="F3F4F6"/>
+            <w:tcW w:type="dxa" w:w="2664"/>
+            <w:vAlign w:val="center"/>
+            <w:shd w:fill="EEF3F8"/>
           </w:tcPr>
           <w:p>
             <w:pPr>
-              <w:spacing w:after="0"/>
+              <w:spacing w:after="0" w:line="276" w:lineRule="auto"/>
             </w:pPr>
-            <w:r/>
             <w:r>
               <w:rPr>
-                <w:rFonts w:ascii="Arial" w:hAnsi="Arial" w:eastAsia="Apple SD Gothic Neo"/>
+                <w:rFonts w:ascii="Pretendard" w:hAnsi="Pretendard" w:eastAsia="Pretendard"/>
                 <w:b/>
-                <w:sz w:val="17"/>
+                <w:sz w:val="18"/>
               </w:rPr>
-              <w:t>관리자 웹 수정 위치</w:t>
+              <w:t>관리자 화면 위치</w:t>
             </w:r>
           </w:p>
         </w:tc>
         <w:tc>
           <w:tcPr>
-            <w:tcW w:type="dxa" w:w="3312"/>
-            <w:tcMar>
-              <w:top w:w="80" w:type="dxa"/>
-              <w:bottom w:w="80" w:type="dxa"/>
-              <w:start w:w="100" w:type="dxa"/>
-              <w:end w:w="100" w:type="dxa"/>
-            </w:tcMar>
-            <w:shd w:fill="F3F4F6"/>
+            <w:tcW w:type="dxa" w:w="3168"/>
+            <w:vAlign w:val="center"/>
+            <w:shd w:fill="EEF3F8"/>
           </w:tcPr>
           <w:p>
             <w:pPr>
-              <w:spacing w:after="0"/>
+              <w:spacing w:after="0" w:line="276" w:lineRule="auto"/>
             </w:pPr>
-            <w:r/>
             <w:r>
               <w:rPr>
-                <w:rFonts w:ascii="Arial" w:hAnsi="Arial" w:eastAsia="Apple SD Gothic Neo"/>
+                <w:rFonts w:ascii="Pretendard" w:hAnsi="Pretendard" w:eastAsia="Pretendard"/>
                 <w:b/>
-                <w:sz w:val="17"/>
+                <w:sz w:val="18"/>
               </w:rPr>
-              <w:t>외주사 구현/확인 사항</w:t>
+              <w:t>관리자가 확인할 내용</w:t>
             </w:r>
           </w:p>
         </w:tc>
@@ -577,52 +451,37 @@
       <w:tr>
         <w:tc>
           <w:tcPr>
-            <w:tcW w:type="dxa" w:w="2448"/>
-            <w:tcMar>
-              <w:top w:w="80" w:type="dxa"/>
-              <w:bottom w:w="80" w:type="dxa"/>
-              <w:start w:w="100" w:type="dxa"/>
-              <w:end w:w="100" w:type="dxa"/>
-            </w:tcMar>
+            <w:tcW w:type="dxa" w:w="2520"/>
             <w:vAlign w:val="center"/>
           </w:tcPr>
           <w:p>
             <w:pPr>
-              <w:spacing w:after="0"/>
+              <w:spacing w:after="0" w:line="276" w:lineRule="auto"/>
             </w:pPr>
-            <w:r/>
             <w:r>
               <w:rPr>
-                <w:rFonts w:ascii="Arial" w:hAnsi="Arial" w:eastAsia="Apple SD Gothic Neo"/>
+                <w:rFonts w:ascii="Pretendard" w:hAnsi="Pretendard" w:eastAsia="Pretendard"/>
                 <w:b w:val="0"/>
-                <w:sz w:val="16"/>
+                <w:sz w:val="18"/>
               </w:rPr>
-              <w:t>앱: 오늘 아기는요/오늘 엄마는요</w:t>
+              <w:t>오늘 아기는요 / 오늘 엄마는요</w:t>
             </w:r>
           </w:p>
         </w:tc>
         <w:tc>
           <w:tcPr>
             <w:tcW w:type="dxa" w:w="1440"/>
-            <w:tcMar>
-              <w:top w:w="80" w:type="dxa"/>
-              <w:bottom w:w="80" w:type="dxa"/>
-              <w:start w:w="100" w:type="dxa"/>
-              <w:end w:w="100" w:type="dxa"/>
-            </w:tcMar>
             <w:vAlign w:val="center"/>
-            <w:shd w:fill="DFF2E6"/>
           </w:tcPr>
           <w:p>
             <w:pPr>
-              <w:spacing w:after="0"/>
+              <w:spacing w:after="0" w:line="276" w:lineRule="auto"/>
             </w:pPr>
-            <w:r/>
             <w:r>
               <w:rPr>
-                <w:rFonts w:ascii="Arial" w:hAnsi="Arial" w:eastAsia="Apple SD Gothic Neo"/>
-                <w:b/>
-                <w:sz w:val="17"/>
+                <w:rFonts w:ascii="Pretendard" w:hAnsi="Pretendard" w:eastAsia="Pretendard"/>
+                <w:b w:val="0"/>
+                <w:sz w:val="18"/>
               </w:rPr>
               <w:t>수정 가능</w:t>
             </w:r>
@@ -630,53 +489,39 @@
         </w:tc>
         <w:tc>
           <w:tcPr>
-            <w:tcW w:type="dxa" w:w="3024"/>
-            <w:tcMar>
-              <w:top w:w="80" w:type="dxa"/>
-              <w:bottom w:w="80" w:type="dxa"/>
-              <w:start w:w="100" w:type="dxa"/>
-              <w:end w:w="100" w:type="dxa"/>
-            </w:tcMar>
+            <w:tcW w:type="dxa" w:w="2664"/>
             <w:vAlign w:val="center"/>
           </w:tcPr>
           <w:p>
             <w:pPr>
-              <w:spacing w:after="0"/>
+              <w:spacing w:after="0" w:line="276" w:lineRule="auto"/>
             </w:pPr>
-            <w:r/>
             <w:r>
               <w:rPr>
-                <w:rFonts w:ascii="Arial" w:hAnsi="Arial" w:eastAsia="Apple SD Gothic Neo"/>
+                <w:rFonts w:ascii="Pretendard" w:hAnsi="Pretendard" w:eastAsia="Pretendard"/>
                 <w:b w:val="0"/>
-                <w:sz w:val="16"/>
+                <w:sz w:val="18"/>
               </w:rPr>
-              <w:t>주차별 &gt; 상세 편집 &gt; 일별 본문</w:t>
+              <w:t>주차별 &gt; 상세 편집 &gt; 일별 문구</w:t>
             </w:r>
           </w:p>
         </w:tc>
         <w:tc>
           <w:tcPr>
-            <w:tcW w:type="dxa" w:w="3312"/>
-            <w:tcMar>
-              <w:top w:w="80" w:type="dxa"/>
-              <w:bottom w:w="80" w:type="dxa"/>
-              <w:start w:w="100" w:type="dxa"/>
-              <w:end w:w="100" w:type="dxa"/>
-            </w:tcMar>
+            <w:tcW w:type="dxa" w:w="3168"/>
             <w:vAlign w:val="center"/>
           </w:tcPr>
           <w:p>
             <w:pPr>
-              <w:spacing w:after="0"/>
+              <w:spacing w:after="0" w:line="276" w:lineRule="auto"/>
             </w:pPr>
-            <w:r/>
             <w:r>
               <w:rPr>
-                <w:rFonts w:ascii="Arial" w:hAnsi="Arial" w:eastAsia="Apple SD Gothic Neo"/>
+                <w:rFonts w:ascii="Pretendard" w:hAnsi="Pretendard" w:eastAsia="Pretendard"/>
                 <w:b w:val="0"/>
-                <w:sz w:val="16"/>
+                <w:sz w:val="18"/>
               </w:rPr>
-              <w:t>아기/엄마 문구를 일차별로 분리 수정</w:t>
+              <w:t>아기/엄마 문구가 일차별로 나뉘어 저장되는지 확인</w:t>
             </w:r>
           </w:p>
         </w:tc>
@@ -684,52 +529,37 @@
       <w:tr>
         <w:tc>
           <w:tcPr>
-            <w:tcW w:type="dxa" w:w="2448"/>
-            <w:tcMar>
-              <w:top w:w="80" w:type="dxa"/>
-              <w:bottom w:w="80" w:type="dxa"/>
-              <w:start w:w="100" w:type="dxa"/>
-              <w:end w:w="100" w:type="dxa"/>
-            </w:tcMar>
+            <w:tcW w:type="dxa" w:w="2520"/>
             <w:vAlign w:val="center"/>
           </w:tcPr>
           <w:p>
             <w:pPr>
-              <w:spacing w:after="0"/>
+              <w:spacing w:after="0" w:line="276" w:lineRule="auto"/>
             </w:pPr>
-            <w:r/>
             <w:r>
               <w:rPr>
-                <w:rFonts w:ascii="Arial" w:hAnsi="Arial" w:eastAsia="Apple SD Gothic Neo"/>
+                <w:rFonts w:ascii="Pretendard" w:hAnsi="Pretendard" w:eastAsia="Pretendard"/>
                 <w:b w:val="0"/>
-                <w:sz w:val="16"/>
+                <w:sz w:val="18"/>
               </w:rPr>
-              <w:t>앱: 체크리스트</w:t>
+              <w:t>체크리스트</w:t>
             </w:r>
           </w:p>
         </w:tc>
         <w:tc>
           <w:tcPr>
             <w:tcW w:type="dxa" w:w="1440"/>
-            <w:tcMar>
-              <w:top w:w="80" w:type="dxa"/>
-              <w:bottom w:w="80" w:type="dxa"/>
-              <w:start w:w="100" w:type="dxa"/>
-              <w:end w:w="100" w:type="dxa"/>
-            </w:tcMar>
             <w:vAlign w:val="center"/>
-            <w:shd w:fill="DFF2E6"/>
           </w:tcPr>
           <w:p>
             <w:pPr>
-              <w:spacing w:after="0"/>
+              <w:spacing w:after="0" w:line="276" w:lineRule="auto"/>
             </w:pPr>
-            <w:r/>
             <w:r>
               <w:rPr>
-                <w:rFonts w:ascii="Arial" w:hAnsi="Arial" w:eastAsia="Apple SD Gothic Neo"/>
-                <w:b/>
-                <w:sz w:val="17"/>
+                <w:rFonts w:ascii="Pretendard" w:hAnsi="Pretendard" w:eastAsia="Pretendard"/>
+                <w:b w:val="0"/>
+                <w:sz w:val="18"/>
               </w:rPr>
               <w:t>수정 가능</w:t>
             </w:r>
@@ -737,25 +567,18 @@
         </w:tc>
         <w:tc>
           <w:tcPr>
-            <w:tcW w:type="dxa" w:w="3024"/>
-            <w:tcMar>
-              <w:top w:w="80" w:type="dxa"/>
-              <w:bottom w:w="80" w:type="dxa"/>
-              <w:start w:w="100" w:type="dxa"/>
-              <w:end w:w="100" w:type="dxa"/>
-            </w:tcMar>
+            <w:tcW w:type="dxa" w:w="2664"/>
             <w:vAlign w:val="center"/>
           </w:tcPr>
           <w:p>
             <w:pPr>
-              <w:spacing w:after="0"/>
+              <w:spacing w:after="0" w:line="276" w:lineRule="auto"/>
             </w:pPr>
-            <w:r/>
             <w:r>
               <w:rPr>
-                <w:rFonts w:ascii="Arial" w:hAnsi="Arial" w:eastAsia="Apple SD Gothic Neo"/>
+                <w:rFonts w:ascii="Pretendard" w:hAnsi="Pretendard" w:eastAsia="Pretendard"/>
                 <w:b w:val="0"/>
-                <w:sz w:val="16"/>
+                <w:sz w:val="18"/>
               </w:rPr>
               <w:t>주차별 &gt; 상세 편집 &gt; 체크리스트</w:t>
             </w:r>
@@ -763,27 +586,20 @@
         </w:tc>
         <w:tc>
           <w:tcPr>
-            <w:tcW w:type="dxa" w:w="3312"/>
-            <w:tcMar>
-              <w:top w:w="80" w:type="dxa"/>
-              <w:bottom w:w="80" w:type="dxa"/>
-              <w:start w:w="100" w:type="dxa"/>
-              <w:end w:w="100" w:type="dxa"/>
-            </w:tcMar>
+            <w:tcW w:type="dxa" w:w="3168"/>
             <w:vAlign w:val="center"/>
           </w:tcPr>
           <w:p>
             <w:pPr>
-              <w:spacing w:after="0"/>
+              <w:spacing w:after="0" w:line="276" w:lineRule="auto"/>
             </w:pPr>
-            <w:r/>
             <w:r>
               <w:rPr>
-                <w:rFonts w:ascii="Arial" w:hAnsi="Arial" w:eastAsia="Apple SD Gothic Neo"/>
+                <w:rFonts w:ascii="Pretendard" w:hAnsi="Pretendard" w:eastAsia="Pretendard"/>
                 <w:b w:val="0"/>
-                <w:sz w:val="16"/>
+                <w:sz w:val="18"/>
               </w:rPr>
-              <w:t>항목 문구와 앱 노출 on/off</w:t>
+              <w:t>항목 문구와 앱 노출 여부를 켜고 끌 수 있는지 확인</w:t>
             </w:r>
           </w:p>
         </w:tc>
@@ -791,52 +607,37 @@
       <w:tr>
         <w:tc>
           <w:tcPr>
-            <w:tcW w:type="dxa" w:w="2448"/>
-            <w:tcMar>
-              <w:top w:w="80" w:type="dxa"/>
-              <w:bottom w:w="80" w:type="dxa"/>
-              <w:start w:w="100" w:type="dxa"/>
-              <w:end w:w="100" w:type="dxa"/>
-            </w:tcMar>
+            <w:tcW w:type="dxa" w:w="2520"/>
             <w:vAlign w:val="center"/>
           </w:tcPr>
           <w:p>
             <w:pPr>
-              <w:spacing w:after="0"/>
+              <w:spacing w:after="0" w:line="276" w:lineRule="auto"/>
             </w:pPr>
-            <w:r/>
             <w:r>
               <w:rPr>
-                <w:rFonts w:ascii="Arial" w:hAnsi="Arial" w:eastAsia="Apple SD Gothic Neo"/>
+                <w:rFonts w:ascii="Pretendard" w:hAnsi="Pretendard" w:eastAsia="Pretendard"/>
                 <w:b w:val="0"/>
-                <w:sz w:val="16"/>
+                <w:sz w:val="18"/>
               </w:rPr>
-              <w:t>앱: 태교 질문</w:t>
+              <w:t>태교 질문</w:t>
             </w:r>
           </w:p>
         </w:tc>
         <w:tc>
           <w:tcPr>
             <w:tcW w:type="dxa" w:w="1440"/>
-            <w:tcMar>
-              <w:top w:w="80" w:type="dxa"/>
-              <w:bottom w:w="80" w:type="dxa"/>
-              <w:start w:w="100" w:type="dxa"/>
-              <w:end w:w="100" w:type="dxa"/>
-            </w:tcMar>
             <w:vAlign w:val="center"/>
-            <w:shd w:fill="DFF2E6"/>
           </w:tcPr>
           <w:p>
             <w:pPr>
-              <w:spacing w:after="0"/>
+              <w:spacing w:after="0" w:line="276" w:lineRule="auto"/>
             </w:pPr>
-            <w:r/>
             <w:r>
               <w:rPr>
-                <w:rFonts w:ascii="Arial" w:hAnsi="Arial" w:eastAsia="Apple SD Gothic Neo"/>
-                <w:b/>
-                <w:sz w:val="17"/>
+                <w:rFonts w:ascii="Pretendard" w:hAnsi="Pretendard" w:eastAsia="Pretendard"/>
+                <w:b w:val="0"/>
+                <w:sz w:val="18"/>
               </w:rPr>
               <w:t>수정 가능</w:t>
             </w:r>
@@ -844,25 +645,18 @@
         </w:tc>
         <w:tc>
           <w:tcPr>
-            <w:tcW w:type="dxa" w:w="3024"/>
-            <w:tcMar>
-              <w:top w:w="80" w:type="dxa"/>
-              <w:bottom w:w="80" w:type="dxa"/>
-              <w:start w:w="100" w:type="dxa"/>
-              <w:end w:w="100" w:type="dxa"/>
-            </w:tcMar>
+            <w:tcW w:type="dxa" w:w="2664"/>
             <w:vAlign w:val="center"/>
           </w:tcPr>
           <w:p>
             <w:pPr>
-              <w:spacing w:after="0"/>
+              <w:spacing w:after="0" w:line="276" w:lineRule="auto"/>
             </w:pPr>
-            <w:r/>
             <w:r>
               <w:rPr>
-                <w:rFonts w:ascii="Arial" w:hAnsi="Arial" w:eastAsia="Apple SD Gothic Neo"/>
+                <w:rFonts w:ascii="Pretendard" w:hAnsi="Pretendard" w:eastAsia="Pretendard"/>
                 <w:b w:val="0"/>
-                <w:sz w:val="16"/>
+                <w:sz w:val="18"/>
               </w:rPr>
               <w:t>주차별 &gt; 상세 편집 &gt; 질문</w:t>
             </w:r>
@@ -870,27 +664,20 @@
         </w:tc>
         <w:tc>
           <w:tcPr>
-            <w:tcW w:type="dxa" w:w="3312"/>
-            <w:tcMar>
-              <w:top w:w="80" w:type="dxa"/>
-              <w:bottom w:w="80" w:type="dxa"/>
-              <w:start w:w="100" w:type="dxa"/>
-              <w:end w:w="100" w:type="dxa"/>
-            </w:tcMar>
+            <w:tcW w:type="dxa" w:w="3168"/>
             <w:vAlign w:val="center"/>
           </w:tcPr>
           <w:p>
             <w:pPr>
-              <w:spacing w:after="0"/>
+              <w:spacing w:after="0" w:line="276" w:lineRule="auto"/>
             </w:pPr>
-            <w:r/>
             <w:r>
               <w:rPr>
-                <w:rFonts w:ascii="Arial" w:hAnsi="Arial" w:eastAsia="Apple SD Gothic Neo"/>
+                <w:rFonts w:ascii="Pretendard" w:hAnsi="Pretendard" w:eastAsia="Pretendard"/>
                 <w:b w:val="0"/>
-                <w:sz w:val="16"/>
+                <w:sz w:val="18"/>
               </w:rPr>
-              <w:t>질문 문구와 앱 노출 on/off</w:t>
+              <w:t>질문 문구와 앱 노출 여부를 확인</w:t>
             </w:r>
           </w:p>
         </w:tc>
@@ -898,52 +685,37 @@
       <w:tr>
         <w:tc>
           <w:tcPr>
-            <w:tcW w:type="dxa" w:w="2448"/>
-            <w:tcMar>
-              <w:top w:w="80" w:type="dxa"/>
-              <w:bottom w:w="80" w:type="dxa"/>
-              <w:start w:w="100" w:type="dxa"/>
-              <w:end w:w="100" w:type="dxa"/>
-            </w:tcMar>
+            <w:tcW w:type="dxa" w:w="2520"/>
             <w:vAlign w:val="center"/>
           </w:tcPr>
           <w:p>
             <w:pPr>
-              <w:spacing w:after="0"/>
+              <w:spacing w:after="0" w:line="276" w:lineRule="auto"/>
             </w:pPr>
-            <w:r/>
             <w:r>
               <w:rPr>
-                <w:rFonts w:ascii="Arial" w:hAnsi="Arial" w:eastAsia="Apple SD Gothic Neo"/>
+                <w:rFonts w:ascii="Pretendard" w:hAnsi="Pretendard" w:eastAsia="Pretendard"/>
                 <w:b w:val="0"/>
-                <w:sz w:val="16"/>
+                <w:sz w:val="18"/>
               </w:rPr>
-              <w:t>앱: 아기 이미지/임신백과</w:t>
+              <w:t>아기 이미지 / 임신백과</w:t>
             </w:r>
           </w:p>
         </w:tc>
         <w:tc>
           <w:tcPr>
             <w:tcW w:type="dxa" w:w="1440"/>
-            <w:tcMar>
-              <w:top w:w="80" w:type="dxa"/>
-              <w:bottom w:w="80" w:type="dxa"/>
-              <w:start w:w="100" w:type="dxa"/>
-              <w:end w:w="100" w:type="dxa"/>
-            </w:tcMar>
             <w:vAlign w:val="center"/>
-            <w:shd w:fill="DFF2E6"/>
           </w:tcPr>
           <w:p>
             <w:pPr>
-              <w:spacing w:after="0"/>
+              <w:spacing w:after="0" w:line="276" w:lineRule="auto"/>
             </w:pPr>
-            <w:r/>
             <w:r>
               <w:rPr>
-                <w:rFonts w:ascii="Arial" w:hAnsi="Arial" w:eastAsia="Apple SD Gothic Neo"/>
-                <w:b/>
-                <w:sz w:val="17"/>
+                <w:rFonts w:ascii="Pretendard" w:hAnsi="Pretendard" w:eastAsia="Pretendard"/>
+                <w:b w:val="0"/>
+                <w:sz w:val="18"/>
               </w:rPr>
               <w:t>수정 가능</w:t>
             </w:r>
@@ -951,25 +723,18 @@
         </w:tc>
         <w:tc>
           <w:tcPr>
-            <w:tcW w:type="dxa" w:w="3024"/>
-            <w:tcMar>
-              <w:top w:w="80" w:type="dxa"/>
-              <w:bottom w:w="80" w:type="dxa"/>
-              <w:start w:w="100" w:type="dxa"/>
-              <w:end w:w="100" w:type="dxa"/>
-            </w:tcMar>
+            <w:tcW w:type="dxa" w:w="2664"/>
             <w:vAlign w:val="center"/>
           </w:tcPr>
           <w:p>
             <w:pPr>
-              <w:spacing w:after="0"/>
+              <w:spacing w:after="0" w:line="276" w:lineRule="auto"/>
             </w:pPr>
-            <w:r/>
             <w:r>
               <w:rPr>
-                <w:rFonts w:ascii="Arial" w:hAnsi="Arial" w:eastAsia="Apple SD Gothic Neo"/>
+                <w:rFonts w:ascii="Pretendard" w:hAnsi="Pretendard" w:eastAsia="Pretendard"/>
                 <w:b w:val="0"/>
-                <w:sz w:val="16"/>
+                <w:sz w:val="18"/>
               </w:rPr>
               <w:t>주차별 &gt; 이미지/노출본</w:t>
             </w:r>
@@ -977,33 +742,30 @@
         </w:tc>
         <w:tc>
           <w:tcPr>
-            <w:tcW w:type="dxa" w:w="3312"/>
-            <w:tcMar>
-              <w:top w:w="80" w:type="dxa"/>
-              <w:bottom w:w="80" w:type="dxa"/>
-              <w:start w:w="100" w:type="dxa"/>
-              <w:end w:w="100" w:type="dxa"/>
-            </w:tcMar>
+            <w:tcW w:type="dxa" w:w="3168"/>
             <w:vAlign w:val="center"/>
           </w:tcPr>
           <w:p>
             <w:pPr>
-              <w:spacing w:after="0"/>
+              <w:spacing w:after="0" w:line="276" w:lineRule="auto"/>
             </w:pPr>
-            <w:r/>
             <w:r>
               <w:rPr>
-                <w:rFonts w:ascii="Arial" w:hAnsi="Arial" w:eastAsia="Apple SD Gothic Neo"/>
+                <w:rFonts w:ascii="Pretendard" w:hAnsi="Pretendard" w:eastAsia="Pretendard"/>
                 <w:b w:val="0"/>
-                <w:sz w:val="16"/>
+                <w:sz w:val="18"/>
               </w:rPr>
-              <w:t>이미지 교체와 백과 카드 문구 수정</w:t>
+              <w:t>이미지와 백과 카드 문구를 관리자 화면에서 교체할 수 있는지 확인</w:t>
             </w:r>
           </w:p>
         </w:tc>
       </w:tr>
     </w:tbl>
-    <w:p/>
+    <w:p>
+      <w:pPr>
+        <w:spacing w:after="80"/>
+      </w:pPr>
+    </w:p>
     <w:p>
       <w:r>
         <w:br w:type="page"/>
@@ -1012,22 +774,20 @@
     <w:p>
       <w:pPr>
         <w:pStyle w:val="Heading1"/>
+        <w:spacing w:before="160" w:after="160"/>
       </w:pPr>
       <w:r>
-        <w:rPr>
-          <w:rFonts w:ascii="Arial" w:hAnsi="Arial" w:eastAsia="Apple SD Gothic Neo"/>
-          <w:b/>
-          <w:color w:val="2E5C96"/>
-          <w:sz w:val="30"/>
-        </w:rPr>
         <w:t>2. 자산 관리 &gt; 공통 풀</w:t>
       </w:r>
     </w:p>
     <w:p>
+      <w:pPr>
+        <w:jc w:val="center"/>
+      </w:pPr>
       <w:r>
         <w:drawing>
           <wp:inline xmlns:a="http://schemas.openxmlformats.org/drawingml/2006/main" xmlns:pic="http://schemas.openxmlformats.org/drawingml/2006/picture">
-            <wp:extent cx="6035040" cy="4149090"/>
+            <wp:extent cx="6172200" cy="4243388"/>
             <wp:docPr id="2" name="Picture 2"/>
             <wp:cNvGraphicFramePr>
               <a:graphicFrameLocks noChangeAspect="1"/>
@@ -1048,7 +808,7 @@
                   <pic:spPr>
                     <a:xfrm>
                       <a:off x="0" y="0"/>
-                      <a:ext cx="6035040" cy="4149090"/>
+                      <a:ext cx="6172200" cy="4243388"/>
                     </a:xfrm>
                     <a:prstGeom prst="rect"/>
                   </pic:spPr>
@@ -1061,73 +821,53 @@
     </w:p>
     <w:tbl>
       <w:tblPr>
+        <w:tblStyle w:val="TableGrid"/>
         <w:tblW w:type="auto" w:w="0"/>
-        <w:jc w:val="left"/>
-        <w:tblLayout w:type="fixed"/>
+        <w:jc w:val="center"/>
         <w:tblLook w:firstColumn="1" w:firstRow="1" w:lastColumn="0" w:lastRow="0" w:noHBand="0" w:noVBand="1" w:val="04A0"/>
-        <w:tblBorders>
-          <w:top w:val="single" w:sz="4" w:space="0" w:color="DADCE0"/>
-          <w:left w:val="single" w:sz="4" w:space="0" w:color="DADCE0"/>
-          <w:bottom w:val="single" w:sz="4" w:space="0" w:color="DADCE0"/>
-          <w:right w:val="single" w:sz="4" w:space="0" w:color="DADCE0"/>
-          <w:insideH w:val="single" w:sz="4" w:space="0" w:color="DADCE0"/>
-          <w:insideV w:val="single" w:sz="4" w:space="0" w:color="DADCE0"/>
-        </w:tblBorders>
       </w:tblPr>
       <w:tblGrid>
-        <w:gridCol w:w="2556"/>
-        <w:gridCol w:w="2556"/>
-        <w:gridCol w:w="2556"/>
-        <w:gridCol w:w="2556"/>
+        <w:gridCol w:w="2520"/>
+        <w:gridCol w:w="2520"/>
+        <w:gridCol w:w="2520"/>
+        <w:gridCol w:w="2520"/>
       </w:tblGrid>
       <w:tr>
         <w:tc>
           <w:tcPr>
-            <w:tcW w:type="dxa" w:w="2448"/>
-            <w:tcMar>
-              <w:top w:w="80" w:type="dxa"/>
-              <w:bottom w:w="80" w:type="dxa"/>
-              <w:start w:w="100" w:type="dxa"/>
-              <w:end w:w="100" w:type="dxa"/>
-            </w:tcMar>
-            <w:shd w:fill="F3F4F6"/>
+            <w:tcW w:type="dxa" w:w="2520"/>
+            <w:vAlign w:val="center"/>
+            <w:shd w:fill="EEF3F8"/>
           </w:tcPr>
           <w:p>
             <w:pPr>
-              <w:spacing w:after="0"/>
+              <w:spacing w:after="0" w:line="276" w:lineRule="auto"/>
             </w:pPr>
-            <w:r/>
             <w:r>
               <w:rPr>
-                <w:rFonts w:ascii="Arial" w:hAnsi="Arial" w:eastAsia="Apple SD Gothic Neo"/>
+                <w:rFonts w:ascii="Pretendard" w:hAnsi="Pretendard" w:eastAsia="Pretendard"/>
                 <w:b/>
-                <w:sz w:val="17"/>
+                <w:sz w:val="18"/>
               </w:rPr>
-              <w:t>앱 반영 영역</w:t>
+              <w:t>앱에서 보이는 영역</w:t>
             </w:r>
           </w:p>
         </w:tc>
         <w:tc>
           <w:tcPr>
             <w:tcW w:type="dxa" w:w="1440"/>
-            <w:tcMar>
-              <w:top w:w="80" w:type="dxa"/>
-              <w:bottom w:w="80" w:type="dxa"/>
-              <w:start w:w="100" w:type="dxa"/>
-              <w:end w:w="100" w:type="dxa"/>
-            </w:tcMar>
-            <w:shd w:fill="F3F4F6"/>
+            <w:vAlign w:val="center"/>
+            <w:shd w:fill="EEF3F8"/>
           </w:tcPr>
           <w:p>
             <w:pPr>
-              <w:spacing w:after="0"/>
+              <w:spacing w:after="0" w:line="276" w:lineRule="auto"/>
             </w:pPr>
-            <w:r/>
             <w:r>
               <w:rPr>
-                <w:rFonts w:ascii="Arial" w:hAnsi="Arial" w:eastAsia="Apple SD Gothic Neo"/>
+                <w:rFonts w:ascii="Pretendard" w:hAnsi="Pretendard" w:eastAsia="Pretendard"/>
                 <w:b/>
-                <w:sz w:val="17"/>
+                <w:sz w:val="18"/>
               </w:rPr>
               <w:t>판정</w:t>
             </w:r>
@@ -1135,53 +875,41 @@
         </w:tc>
         <w:tc>
           <w:tcPr>
-            <w:tcW w:type="dxa" w:w="3024"/>
-            <w:tcMar>
-              <w:top w:w="80" w:type="dxa"/>
-              <w:bottom w:w="80" w:type="dxa"/>
-              <w:start w:w="100" w:type="dxa"/>
-              <w:end w:w="100" w:type="dxa"/>
-            </w:tcMar>
-            <w:shd w:fill="F3F4F6"/>
+            <w:tcW w:type="dxa" w:w="2664"/>
+            <w:vAlign w:val="center"/>
+            <w:shd w:fill="EEF3F8"/>
           </w:tcPr>
           <w:p>
             <w:pPr>
-              <w:spacing w:after="0"/>
+              <w:spacing w:after="0" w:line="276" w:lineRule="auto"/>
             </w:pPr>
-            <w:r/>
             <w:r>
               <w:rPr>
-                <w:rFonts w:ascii="Arial" w:hAnsi="Arial" w:eastAsia="Apple SD Gothic Neo"/>
+                <w:rFonts w:ascii="Pretendard" w:hAnsi="Pretendard" w:eastAsia="Pretendard"/>
                 <w:b/>
-                <w:sz w:val="17"/>
+                <w:sz w:val="18"/>
               </w:rPr>
-              <w:t>관리자 웹 수정 위치</w:t>
+              <w:t>관리자 화면 위치</w:t>
             </w:r>
           </w:p>
         </w:tc>
         <w:tc>
           <w:tcPr>
-            <w:tcW w:type="dxa" w:w="3312"/>
-            <w:tcMar>
-              <w:top w:w="80" w:type="dxa"/>
-              <w:bottom w:w="80" w:type="dxa"/>
-              <w:start w:w="100" w:type="dxa"/>
-              <w:end w:w="100" w:type="dxa"/>
-            </w:tcMar>
-            <w:shd w:fill="F3F4F6"/>
+            <w:tcW w:type="dxa" w:w="3168"/>
+            <w:vAlign w:val="center"/>
+            <w:shd w:fill="EEF3F8"/>
           </w:tcPr>
           <w:p>
             <w:pPr>
-              <w:spacing w:after="0"/>
+              <w:spacing w:after="0" w:line="276" w:lineRule="auto"/>
             </w:pPr>
-            <w:r/>
             <w:r>
               <w:rPr>
-                <w:rFonts w:ascii="Arial" w:hAnsi="Arial" w:eastAsia="Apple SD Gothic Neo"/>
+                <w:rFonts w:ascii="Pretendard" w:hAnsi="Pretendard" w:eastAsia="Pretendard"/>
                 <w:b/>
-                <w:sz w:val="17"/>
+                <w:sz w:val="18"/>
               </w:rPr>
-              <w:t>외주사 구현/확인 사항</w:t>
+              <w:t>관리자가 확인할 내용</w:t>
             </w:r>
           </w:p>
         </w:tc>
@@ -1189,52 +917,37 @@
       <w:tr>
         <w:tc>
           <w:tcPr>
-            <w:tcW w:type="dxa" w:w="2448"/>
-            <w:tcMar>
-              <w:top w:w="80" w:type="dxa"/>
-              <w:bottom w:w="80" w:type="dxa"/>
-              <w:start w:w="100" w:type="dxa"/>
-              <w:end w:w="100" w:type="dxa"/>
-            </w:tcMar>
+            <w:tcW w:type="dxa" w:w="2520"/>
             <w:vAlign w:val="center"/>
           </w:tcPr>
           <w:p>
             <w:pPr>
-              <w:spacing w:after="0"/>
+              <w:spacing w:after="0" w:line="276" w:lineRule="auto"/>
             </w:pPr>
-            <w:r/>
             <w:r>
               <w:rPr>
-                <w:rFonts w:ascii="Arial" w:hAnsi="Arial" w:eastAsia="Apple SD Gothic Neo"/>
+                <w:rFonts w:ascii="Pretendard" w:hAnsi="Pretendard" w:eastAsia="Pretendard"/>
                 <w:b w:val="0"/>
-                <w:sz w:val="16"/>
+                <w:sz w:val="18"/>
               </w:rPr>
-              <w:t>앱: 홈 말풍선</w:t>
+              <w:t>홈 말풍선</w:t>
             </w:r>
           </w:p>
         </w:tc>
         <w:tc>
           <w:tcPr>
             <w:tcW w:type="dxa" w:w="1440"/>
-            <w:tcMar>
-              <w:top w:w="80" w:type="dxa"/>
-              <w:bottom w:w="80" w:type="dxa"/>
-              <w:start w:w="100" w:type="dxa"/>
-              <w:end w:w="100" w:type="dxa"/>
-            </w:tcMar>
             <w:vAlign w:val="center"/>
-            <w:shd w:fill="DFF2E6"/>
           </w:tcPr>
           <w:p>
             <w:pPr>
-              <w:spacing w:after="0"/>
+              <w:spacing w:after="0" w:line="276" w:lineRule="auto"/>
             </w:pPr>
-            <w:r/>
             <w:r>
               <w:rPr>
-                <w:rFonts w:ascii="Arial" w:hAnsi="Arial" w:eastAsia="Apple SD Gothic Neo"/>
-                <w:b/>
-                <w:sz w:val="17"/>
+                <w:rFonts w:ascii="Pretendard" w:hAnsi="Pretendard" w:eastAsia="Pretendard"/>
+                <w:b w:val="0"/>
+                <w:sz w:val="18"/>
               </w:rPr>
               <w:t>수정 가능</w:t>
             </w:r>
@@ -1242,25 +955,18 @@
         </w:tc>
         <w:tc>
           <w:tcPr>
-            <w:tcW w:type="dxa" w:w="3024"/>
-            <w:tcMar>
-              <w:top w:w="80" w:type="dxa"/>
-              <w:bottom w:w="80" w:type="dxa"/>
-              <w:start w:w="100" w:type="dxa"/>
-              <w:end w:w="100" w:type="dxa"/>
-            </w:tcMar>
+            <w:tcW w:type="dxa" w:w="2664"/>
             <w:vAlign w:val="center"/>
           </w:tcPr>
           <w:p>
             <w:pPr>
-              <w:spacing w:after="0"/>
+              <w:spacing w:after="0" w:line="276" w:lineRule="auto"/>
             </w:pPr>
-            <w:r/>
             <w:r>
               <w:rPr>
-                <w:rFonts w:ascii="Arial" w:hAnsi="Arial" w:eastAsia="Apple SD Gothic Neo"/>
+                <w:rFonts w:ascii="Pretendard" w:hAnsi="Pretendard" w:eastAsia="Pretendard"/>
                 <w:b w:val="0"/>
-                <w:sz w:val="16"/>
+                <w:sz w:val="18"/>
               </w:rPr>
               <w:t>공통 풀 &gt; 홈 위안 풀</w:t>
             </w:r>
@@ -1268,27 +974,20 @@
         </w:tc>
         <w:tc>
           <w:tcPr>
-            <w:tcW w:type="dxa" w:w="3312"/>
-            <w:tcMar>
-              <w:top w:w="80" w:type="dxa"/>
-              <w:bottom w:w="80" w:type="dxa"/>
-              <w:start w:w="100" w:type="dxa"/>
-              <w:end w:w="100" w:type="dxa"/>
-            </w:tcMar>
+            <w:tcW w:type="dxa" w:w="3168"/>
             <w:vAlign w:val="center"/>
           </w:tcPr>
           <w:p>
             <w:pPr>
-              <w:spacing w:after="0"/>
+              <w:spacing w:after="0" w:line="276" w:lineRule="auto"/>
             </w:pPr>
-            <w:r/>
             <w:r>
               <w:rPr>
-                <w:rFonts w:ascii="Arial" w:hAnsi="Arial" w:eastAsia="Apple SD Gothic Neo"/>
+                <w:rFonts w:ascii="Pretendard" w:hAnsi="Pretendard" w:eastAsia="Pretendard"/>
                 <w:b w:val="0"/>
-                <w:sz w:val="16"/>
+                <w:sz w:val="18"/>
               </w:rPr>
-              <w:t>말풍선 제목/본문 템플릿 수정</w:t>
+              <w:t>말풍선 제목과 본문을 수정할 수 있는지 확인</w:t>
             </w:r>
           </w:p>
         </w:tc>
@@ -1296,52 +995,37 @@
       <w:tr>
         <w:tc>
           <w:tcPr>
-            <w:tcW w:type="dxa" w:w="2448"/>
-            <w:tcMar>
-              <w:top w:w="80" w:type="dxa"/>
-              <w:bottom w:w="80" w:type="dxa"/>
-              <w:start w:w="100" w:type="dxa"/>
-              <w:end w:w="100" w:type="dxa"/>
-            </w:tcMar>
+            <w:tcW w:type="dxa" w:w="2520"/>
             <w:vAlign w:val="center"/>
           </w:tcPr>
           <w:p>
             <w:pPr>
-              <w:spacing w:after="0"/>
+              <w:spacing w:after="0" w:line="276" w:lineRule="auto"/>
             </w:pPr>
-            <w:r/>
             <w:r>
               <w:rPr>
-                <w:rFonts w:ascii="Arial" w:hAnsi="Arial" w:eastAsia="Apple SD Gothic Neo"/>
+                <w:rFonts w:ascii="Pretendard" w:hAnsi="Pretendard" w:eastAsia="Pretendard"/>
                 <w:b w:val="0"/>
-                <w:sz w:val="16"/>
+                <w:sz w:val="18"/>
               </w:rPr>
-              <w:t>앱: 오늘의 한마디</w:t>
+              <w:t>오늘의 한마디</w:t>
             </w:r>
           </w:p>
         </w:tc>
         <w:tc>
           <w:tcPr>
             <w:tcW w:type="dxa" w:w="1440"/>
-            <w:tcMar>
-              <w:top w:w="80" w:type="dxa"/>
-              <w:bottom w:w="80" w:type="dxa"/>
-              <w:start w:w="100" w:type="dxa"/>
-              <w:end w:w="100" w:type="dxa"/>
-            </w:tcMar>
             <w:vAlign w:val="center"/>
-            <w:shd w:fill="DFF2E6"/>
           </w:tcPr>
           <w:p>
             <w:pPr>
-              <w:spacing w:after="0"/>
+              <w:spacing w:after="0" w:line="276" w:lineRule="auto"/>
             </w:pPr>
-            <w:r/>
             <w:r>
               <w:rPr>
-                <w:rFonts w:ascii="Arial" w:hAnsi="Arial" w:eastAsia="Apple SD Gothic Neo"/>
-                <w:b/>
-                <w:sz w:val="17"/>
+                <w:rFonts w:ascii="Pretendard" w:hAnsi="Pretendard" w:eastAsia="Pretendard"/>
+                <w:b w:val="0"/>
+                <w:sz w:val="18"/>
               </w:rPr>
               <w:t>수정 가능</w:t>
             </w:r>
@@ -1349,25 +1033,18 @@
         </w:tc>
         <w:tc>
           <w:tcPr>
-            <w:tcW w:type="dxa" w:w="3024"/>
-            <w:tcMar>
-              <w:top w:w="80" w:type="dxa"/>
-              <w:bottom w:w="80" w:type="dxa"/>
-              <w:start w:w="100" w:type="dxa"/>
-              <w:end w:w="100" w:type="dxa"/>
-            </w:tcMar>
+            <w:tcW w:type="dxa" w:w="2664"/>
             <w:vAlign w:val="center"/>
           </w:tcPr>
           <w:p>
             <w:pPr>
-              <w:spacing w:after="0"/>
+              <w:spacing w:after="0" w:line="276" w:lineRule="auto"/>
             </w:pPr>
-            <w:r/>
             <w:r>
               <w:rPr>
-                <w:rFonts w:ascii="Arial" w:hAnsi="Arial" w:eastAsia="Apple SD Gothic Neo"/>
+                <w:rFonts w:ascii="Pretendard" w:hAnsi="Pretendard" w:eastAsia="Pretendard"/>
                 <w:b w:val="0"/>
-                <w:sz w:val="16"/>
+                <w:sz w:val="18"/>
               </w:rPr>
               <w:t>공통 풀 &gt; 홈 위안 풀</w:t>
             </w:r>
@@ -1375,27 +1052,20 @@
         </w:tc>
         <w:tc>
           <w:tcPr>
-            <w:tcW w:type="dxa" w:w="3312"/>
-            <w:tcMar>
-              <w:top w:w="80" w:type="dxa"/>
-              <w:bottom w:w="80" w:type="dxa"/>
-              <w:start w:w="100" w:type="dxa"/>
-              <w:end w:w="100" w:type="dxa"/>
-            </w:tcMar>
+            <w:tcW w:type="dxa" w:w="3168"/>
             <w:vAlign w:val="center"/>
           </w:tcPr>
           <w:p>
             <w:pPr>
-              <w:spacing w:after="0"/>
+              <w:spacing w:after="0" w:line="276" w:lineRule="auto"/>
             </w:pPr>
-            <w:r/>
             <w:r>
               <w:rPr>
-                <w:rFonts w:ascii="Arial" w:hAnsi="Arial" w:eastAsia="Apple SD Gothic Neo"/>
+                <w:rFonts w:ascii="Pretendard" w:hAnsi="Pretendard" w:eastAsia="Pretendard"/>
                 <w:b w:val="0"/>
-                <w:sz w:val="16"/>
+                <w:sz w:val="18"/>
               </w:rPr>
-              <w:t>오늘의 한마디 위치 문구 수정</w:t>
+              <w:t>홈 카드 안의 한마디 문구가 바뀌는지 확인</w:t>
             </w:r>
           </w:p>
         </w:tc>
@@ -1403,52 +1073,37 @@
       <w:tr>
         <w:tc>
           <w:tcPr>
-            <w:tcW w:type="dxa" w:w="2448"/>
-            <w:tcMar>
-              <w:top w:w="80" w:type="dxa"/>
-              <w:bottom w:w="80" w:type="dxa"/>
-              <w:start w:w="100" w:type="dxa"/>
-              <w:end w:w="100" w:type="dxa"/>
-            </w:tcMar>
+            <w:tcW w:type="dxa" w:w="2520"/>
             <w:vAlign w:val="center"/>
           </w:tcPr>
           <w:p>
             <w:pPr>
-              <w:spacing w:after="0"/>
+              <w:spacing w:after="0" w:line="276" w:lineRule="auto"/>
             </w:pPr>
-            <w:r/>
             <w:r>
               <w:rPr>
-                <w:rFonts w:ascii="Arial" w:hAnsi="Arial" w:eastAsia="Apple SD Gothic Neo"/>
+                <w:rFonts w:ascii="Pretendard" w:hAnsi="Pretendard" w:eastAsia="Pretendard"/>
                 <w:b w:val="0"/>
-                <w:sz w:val="16"/>
+                <w:sz w:val="18"/>
               </w:rPr>
-              <w:t>앱: 공통 위안 문구</w:t>
+              <w:t>공통 위안 문구</w:t>
             </w:r>
           </w:p>
         </w:tc>
         <w:tc>
           <w:tcPr>
             <w:tcW w:type="dxa" w:w="1440"/>
-            <w:tcMar>
-              <w:top w:w="80" w:type="dxa"/>
-              <w:bottom w:w="80" w:type="dxa"/>
-              <w:start w:w="100" w:type="dxa"/>
-              <w:end w:w="100" w:type="dxa"/>
-            </w:tcMar>
             <w:vAlign w:val="center"/>
-            <w:shd w:fill="DFF2E6"/>
           </w:tcPr>
           <w:p>
             <w:pPr>
-              <w:spacing w:after="0"/>
+              <w:spacing w:after="0" w:line="276" w:lineRule="auto"/>
             </w:pPr>
-            <w:r/>
             <w:r>
               <w:rPr>
-                <w:rFonts w:ascii="Arial" w:hAnsi="Arial" w:eastAsia="Apple SD Gothic Neo"/>
-                <w:b/>
-                <w:sz w:val="17"/>
+                <w:rFonts w:ascii="Pretendard" w:hAnsi="Pretendard" w:eastAsia="Pretendard"/>
+                <w:b w:val="0"/>
+                <w:sz w:val="18"/>
               </w:rPr>
               <w:t>수정 가능</w:t>
             </w:r>
@@ -1456,25 +1111,18 @@
         </w:tc>
         <w:tc>
           <w:tcPr>
-            <w:tcW w:type="dxa" w:w="3024"/>
-            <w:tcMar>
-              <w:top w:w="80" w:type="dxa"/>
-              <w:bottom w:w="80" w:type="dxa"/>
-              <w:start w:w="100" w:type="dxa"/>
-              <w:end w:w="100" w:type="dxa"/>
-            </w:tcMar>
+            <w:tcW w:type="dxa" w:w="2664"/>
             <w:vAlign w:val="center"/>
           </w:tcPr>
           <w:p>
             <w:pPr>
-              <w:spacing w:after="0"/>
+              <w:spacing w:after="0" w:line="276" w:lineRule="auto"/>
             </w:pPr>
-            <w:r/>
             <w:r>
               <w:rPr>
-                <w:rFonts w:ascii="Arial" w:hAnsi="Arial" w:eastAsia="Apple SD Gothic Neo"/>
+                <w:rFonts w:ascii="Pretendard" w:hAnsi="Pretendard" w:eastAsia="Pretendard"/>
                 <w:b w:val="0"/>
-                <w:sz w:val="16"/>
+                <w:sz w:val="18"/>
               </w:rPr>
               <w:t>공통 풀 &gt; 아기 위안 풀</w:t>
             </w:r>
@@ -1482,33 +1130,30 @@
         </w:tc>
         <w:tc>
           <w:tcPr>
-            <w:tcW w:type="dxa" w:w="3312"/>
-            <w:tcMar>
-              <w:top w:w="80" w:type="dxa"/>
-              <w:bottom w:w="80" w:type="dxa"/>
-              <w:start w:w="100" w:type="dxa"/>
-              <w:end w:w="100" w:type="dxa"/>
-            </w:tcMar>
+            <w:tcW w:type="dxa" w:w="3168"/>
             <w:vAlign w:val="center"/>
           </w:tcPr>
           <w:p>
             <w:pPr>
-              <w:spacing w:after="0"/>
+              <w:spacing w:after="0" w:line="276" w:lineRule="auto"/>
             </w:pPr>
-            <w:r/>
             <w:r>
               <w:rPr>
-                <w:rFonts w:ascii="Arial" w:hAnsi="Arial" w:eastAsia="Apple SD Gothic Neo"/>
+                <w:rFonts w:ascii="Pretendard" w:hAnsi="Pretendard" w:eastAsia="Pretendard"/>
                 <w:b w:val="0"/>
-                <w:sz w:val="16"/>
+                <w:sz w:val="18"/>
               </w:rPr>
-              <w:t>주차/기분 태그 기반 문구 관리</w:t>
+              <w:t>주차와 기분 조건에 맞춰 문구를 관리할 수 있는지 확인</w:t>
             </w:r>
           </w:p>
         </w:tc>
       </w:tr>
     </w:tbl>
-    <w:p/>
+    <w:p>
+      <w:pPr>
+        <w:spacing w:after="80"/>
+      </w:pPr>
+    </w:p>
     <w:p>
       <w:r>
         <w:br w:type="page"/>
@@ -1517,22 +1162,20 @@
     <w:p>
       <w:pPr>
         <w:pStyle w:val="Heading1"/>
+        <w:spacing w:before="160" w:after="160"/>
       </w:pPr>
       <w:r>
-        <w:rPr>
-          <w:rFonts w:ascii="Arial" w:hAnsi="Arial" w:eastAsia="Apple SD Gothic Neo"/>
-          <w:b/>
-          <w:color w:val="2E5C96"/>
-          <w:sz w:val="30"/>
-        </w:rPr>
         <w:t>3. 대화 엔진 &gt; 워크플로우</w:t>
       </w:r>
     </w:p>
     <w:p>
+      <w:pPr>
+        <w:jc w:val="center"/>
+      </w:pPr>
       <w:r>
         <w:drawing>
           <wp:inline xmlns:a="http://schemas.openxmlformats.org/drawingml/2006/main" xmlns:pic="http://schemas.openxmlformats.org/drawingml/2006/picture">
-            <wp:extent cx="6035040" cy="4149090"/>
+            <wp:extent cx="6172200" cy="4243388"/>
             <wp:docPr id="3" name="Picture 3"/>
             <wp:cNvGraphicFramePr>
               <a:graphicFrameLocks noChangeAspect="1"/>
@@ -1553,7 +1196,7 @@
                   <pic:spPr>
                     <a:xfrm>
                       <a:off x="0" y="0"/>
-                      <a:ext cx="6035040" cy="4149090"/>
+                      <a:ext cx="6172200" cy="4243388"/>
                     </a:xfrm>
                     <a:prstGeom prst="rect"/>
                   </pic:spPr>
@@ -1566,73 +1209,53 @@
     </w:p>
     <w:tbl>
       <w:tblPr>
+        <w:tblStyle w:val="TableGrid"/>
         <w:tblW w:type="auto" w:w="0"/>
-        <w:jc w:val="left"/>
-        <w:tblLayout w:type="fixed"/>
+        <w:jc w:val="center"/>
         <w:tblLook w:firstColumn="1" w:firstRow="1" w:lastColumn="0" w:lastRow="0" w:noHBand="0" w:noVBand="1" w:val="04A0"/>
-        <w:tblBorders>
-          <w:top w:val="single" w:sz="4" w:space="0" w:color="DADCE0"/>
-          <w:left w:val="single" w:sz="4" w:space="0" w:color="DADCE0"/>
-          <w:bottom w:val="single" w:sz="4" w:space="0" w:color="DADCE0"/>
-          <w:right w:val="single" w:sz="4" w:space="0" w:color="DADCE0"/>
-          <w:insideH w:val="single" w:sz="4" w:space="0" w:color="DADCE0"/>
-          <w:insideV w:val="single" w:sz="4" w:space="0" w:color="DADCE0"/>
-        </w:tblBorders>
       </w:tblPr>
       <w:tblGrid>
-        <w:gridCol w:w="2556"/>
-        <w:gridCol w:w="2556"/>
-        <w:gridCol w:w="2556"/>
-        <w:gridCol w:w="2556"/>
+        <w:gridCol w:w="2520"/>
+        <w:gridCol w:w="2520"/>
+        <w:gridCol w:w="2520"/>
+        <w:gridCol w:w="2520"/>
       </w:tblGrid>
       <w:tr>
         <w:tc>
           <w:tcPr>
-            <w:tcW w:type="dxa" w:w="2448"/>
-            <w:tcMar>
-              <w:top w:w="80" w:type="dxa"/>
-              <w:bottom w:w="80" w:type="dxa"/>
-              <w:start w:w="100" w:type="dxa"/>
-              <w:end w:w="100" w:type="dxa"/>
-            </w:tcMar>
-            <w:shd w:fill="F3F4F6"/>
+            <w:tcW w:type="dxa" w:w="2520"/>
+            <w:vAlign w:val="center"/>
+            <w:shd w:fill="EEF3F8"/>
           </w:tcPr>
           <w:p>
             <w:pPr>
-              <w:spacing w:after="0"/>
+              <w:spacing w:after="0" w:line="276" w:lineRule="auto"/>
             </w:pPr>
-            <w:r/>
             <w:r>
               <w:rPr>
-                <w:rFonts w:ascii="Arial" w:hAnsi="Arial" w:eastAsia="Apple SD Gothic Neo"/>
+                <w:rFonts w:ascii="Pretendard" w:hAnsi="Pretendard" w:eastAsia="Pretendard"/>
                 <w:b/>
-                <w:sz w:val="17"/>
+                <w:sz w:val="18"/>
               </w:rPr>
-              <w:t>앱 반영 영역</w:t>
+              <w:t>앱에서 보이는 영역</w:t>
             </w:r>
           </w:p>
         </w:tc>
         <w:tc>
           <w:tcPr>
             <w:tcW w:type="dxa" w:w="1440"/>
-            <w:tcMar>
-              <w:top w:w="80" w:type="dxa"/>
-              <w:bottom w:w="80" w:type="dxa"/>
-              <w:start w:w="100" w:type="dxa"/>
-              <w:end w:w="100" w:type="dxa"/>
-            </w:tcMar>
-            <w:shd w:fill="F3F4F6"/>
+            <w:vAlign w:val="center"/>
+            <w:shd w:fill="EEF3F8"/>
           </w:tcPr>
           <w:p>
             <w:pPr>
-              <w:spacing w:after="0"/>
+              <w:spacing w:after="0" w:line="276" w:lineRule="auto"/>
             </w:pPr>
-            <w:r/>
             <w:r>
               <w:rPr>
-                <w:rFonts w:ascii="Arial" w:hAnsi="Arial" w:eastAsia="Apple SD Gothic Neo"/>
+                <w:rFonts w:ascii="Pretendard" w:hAnsi="Pretendard" w:eastAsia="Pretendard"/>
                 <w:b/>
-                <w:sz w:val="17"/>
+                <w:sz w:val="18"/>
               </w:rPr>
               <w:t>판정</w:t>
             </w:r>
@@ -1640,53 +1263,41 @@
         </w:tc>
         <w:tc>
           <w:tcPr>
-            <w:tcW w:type="dxa" w:w="3024"/>
-            <w:tcMar>
-              <w:top w:w="80" w:type="dxa"/>
-              <w:bottom w:w="80" w:type="dxa"/>
-              <w:start w:w="100" w:type="dxa"/>
-              <w:end w:w="100" w:type="dxa"/>
-            </w:tcMar>
-            <w:shd w:fill="F3F4F6"/>
+            <w:tcW w:type="dxa" w:w="2664"/>
+            <w:vAlign w:val="center"/>
+            <w:shd w:fill="EEF3F8"/>
           </w:tcPr>
           <w:p>
             <w:pPr>
-              <w:spacing w:after="0"/>
+              <w:spacing w:after="0" w:line="276" w:lineRule="auto"/>
             </w:pPr>
-            <w:r/>
             <w:r>
               <w:rPr>
-                <w:rFonts w:ascii="Arial" w:hAnsi="Arial" w:eastAsia="Apple SD Gothic Neo"/>
+                <w:rFonts w:ascii="Pretendard" w:hAnsi="Pretendard" w:eastAsia="Pretendard"/>
                 <w:b/>
-                <w:sz w:val="17"/>
+                <w:sz w:val="18"/>
               </w:rPr>
-              <w:t>관리자 웹 수정 위치</w:t>
+              <w:t>관리자 화면 위치</w:t>
             </w:r>
           </w:p>
         </w:tc>
         <w:tc>
           <w:tcPr>
-            <w:tcW w:type="dxa" w:w="3312"/>
-            <w:tcMar>
-              <w:top w:w="80" w:type="dxa"/>
-              <w:bottom w:w="80" w:type="dxa"/>
-              <w:start w:w="100" w:type="dxa"/>
-              <w:end w:w="100" w:type="dxa"/>
-            </w:tcMar>
-            <w:shd w:fill="F3F4F6"/>
+            <w:tcW w:type="dxa" w:w="3168"/>
+            <w:vAlign w:val="center"/>
+            <w:shd w:fill="EEF3F8"/>
           </w:tcPr>
           <w:p>
             <w:pPr>
-              <w:spacing w:after="0"/>
+              <w:spacing w:after="0" w:line="276" w:lineRule="auto"/>
             </w:pPr>
-            <w:r/>
             <w:r>
               <w:rPr>
-                <w:rFonts w:ascii="Arial" w:hAnsi="Arial" w:eastAsia="Apple SD Gothic Neo"/>
+                <w:rFonts w:ascii="Pretendard" w:hAnsi="Pretendard" w:eastAsia="Pretendard"/>
                 <w:b/>
-                <w:sz w:val="17"/>
+                <w:sz w:val="18"/>
               </w:rPr>
-              <w:t>외주사 구현/확인 사항</w:t>
+              <w:t>관리자가 확인할 내용</w:t>
             </w:r>
           </w:p>
         </w:tc>
@@ -1694,52 +1305,37 @@
       <w:tr>
         <w:tc>
           <w:tcPr>
-            <w:tcW w:type="dxa" w:w="2448"/>
-            <w:tcMar>
-              <w:top w:w="80" w:type="dxa"/>
-              <w:bottom w:w="80" w:type="dxa"/>
-              <w:start w:w="100" w:type="dxa"/>
-              <w:end w:w="100" w:type="dxa"/>
-            </w:tcMar>
+            <w:tcW w:type="dxa" w:w="2520"/>
             <w:vAlign w:val="center"/>
           </w:tcPr>
           <w:p>
             <w:pPr>
-              <w:spacing w:after="0"/>
+              <w:spacing w:after="0" w:line="276" w:lineRule="auto"/>
             </w:pPr>
-            <w:r/>
             <w:r>
               <w:rPr>
-                <w:rFonts w:ascii="Arial" w:hAnsi="Arial" w:eastAsia="Apple SD Gothic Neo"/>
+                <w:rFonts w:ascii="Pretendard" w:hAnsi="Pretendard" w:eastAsia="Pretendard"/>
                 <w:b w:val="0"/>
-                <w:sz w:val="16"/>
+                <w:sz w:val="18"/>
               </w:rPr>
-              <w:t>앱: 기분 첫 질문/버튼</w:t>
+              <w:t>기분 첫 질문 / 선택 버튼</w:t>
             </w:r>
           </w:p>
         </w:tc>
         <w:tc>
           <w:tcPr>
             <w:tcW w:type="dxa" w:w="1440"/>
-            <w:tcMar>
-              <w:top w:w="80" w:type="dxa"/>
-              <w:bottom w:w="80" w:type="dxa"/>
-              <w:start w:w="100" w:type="dxa"/>
-              <w:end w:w="100" w:type="dxa"/>
-            </w:tcMar>
             <w:vAlign w:val="center"/>
-            <w:shd w:fill="DFF2E6"/>
           </w:tcPr>
           <w:p>
             <w:pPr>
-              <w:spacing w:after="0"/>
+              <w:spacing w:after="0" w:line="276" w:lineRule="auto"/>
             </w:pPr>
-            <w:r/>
             <w:r>
               <w:rPr>
-                <w:rFonts w:ascii="Arial" w:hAnsi="Arial" w:eastAsia="Apple SD Gothic Neo"/>
-                <w:b/>
-                <w:sz w:val="17"/>
+                <w:rFonts w:ascii="Pretendard" w:hAnsi="Pretendard" w:eastAsia="Pretendard"/>
+                <w:b w:val="0"/>
+                <w:sz w:val="18"/>
               </w:rPr>
               <w:t>수정 가능</w:t>
             </w:r>
@@ -1747,25 +1343,18 @@
         </w:tc>
         <w:tc>
           <w:tcPr>
-            <w:tcW w:type="dxa" w:w="3024"/>
-            <w:tcMar>
-              <w:top w:w="80" w:type="dxa"/>
-              <w:bottom w:w="80" w:type="dxa"/>
-              <w:start w:w="100" w:type="dxa"/>
-              <w:end w:w="100" w:type="dxa"/>
-            </w:tcMar>
+            <w:tcW w:type="dxa" w:w="2664"/>
             <w:vAlign w:val="center"/>
           </w:tcPr>
           <w:p>
             <w:pPr>
-              <w:spacing w:after="0"/>
+              <w:spacing w:after="0" w:line="276" w:lineRule="auto"/>
             </w:pPr>
-            <w:r/>
             <w:r>
               <w:rPr>
-                <w:rFonts w:ascii="Arial" w:hAnsi="Arial" w:eastAsia="Apple SD Gothic Neo"/>
+                <w:rFonts w:ascii="Pretendard" w:hAnsi="Pretendard" w:eastAsia="Pretendard"/>
                 <w:b w:val="0"/>
-                <w:sz w:val="16"/>
+                <w:sz w:val="18"/>
               </w:rPr>
               <w:t>워크플로우</w:t>
             </w:r>
@@ -1773,27 +1362,20 @@
         </w:tc>
         <w:tc>
           <w:tcPr>
-            <w:tcW w:type="dxa" w:w="3312"/>
-            <w:tcMar>
-              <w:top w:w="80" w:type="dxa"/>
-              <w:bottom w:w="80" w:type="dxa"/>
-              <w:start w:w="100" w:type="dxa"/>
-              <w:end w:w="100" w:type="dxa"/>
-            </w:tcMar>
+            <w:tcW w:type="dxa" w:w="3168"/>
             <w:vAlign w:val="center"/>
           </w:tcPr>
           <w:p>
             <w:pPr>
-              <w:spacing w:after="0"/>
+              <w:spacing w:after="0" w:line="276" w:lineRule="auto"/>
             </w:pPr>
-            <w:r/>
             <w:r>
               <w:rPr>
-                <w:rFonts w:ascii="Arial" w:hAnsi="Arial" w:eastAsia="Apple SD Gothic Neo"/>
+                <w:rFonts w:ascii="Pretendard" w:hAnsi="Pretendard" w:eastAsia="Pretendard"/>
                 <w:b w:val="0"/>
-                <w:sz w:val="16"/>
+                <w:sz w:val="18"/>
               </w:rPr>
-              <w:t>질문 문구와 버튼 라벨 수정</w:t>
+              <w:t>질문 문구와 버튼 이름을 관리자 화면에서 바꿀 수 있는지 확인</w:t>
             </w:r>
           </w:p>
         </w:tc>
@@ -1801,52 +1383,37 @@
       <w:tr>
         <w:tc>
           <w:tcPr>
-            <w:tcW w:type="dxa" w:w="2448"/>
-            <w:tcMar>
-              <w:top w:w="80" w:type="dxa"/>
-              <w:bottom w:w="80" w:type="dxa"/>
-              <w:start w:w="100" w:type="dxa"/>
-              <w:end w:w="100" w:type="dxa"/>
-            </w:tcMar>
+            <w:tcW w:type="dxa" w:w="2520"/>
             <w:vAlign w:val="center"/>
           </w:tcPr>
           <w:p>
             <w:pPr>
-              <w:spacing w:after="0"/>
+              <w:spacing w:after="0" w:line="276" w:lineRule="auto"/>
             </w:pPr>
-            <w:r/>
             <w:r>
               <w:rPr>
-                <w:rFonts w:ascii="Arial" w:hAnsi="Arial" w:eastAsia="Apple SD Gothic Neo"/>
+                <w:rFonts w:ascii="Pretendard" w:hAnsi="Pretendard" w:eastAsia="Pretendard"/>
                 <w:b w:val="0"/>
-                <w:sz w:val="16"/>
+                <w:sz w:val="18"/>
               </w:rPr>
-              <w:t>앱: 주차 정보 제안</w:t>
+              <w:t>주차 정보 제안</w:t>
             </w:r>
           </w:p>
         </w:tc>
         <w:tc>
           <w:tcPr>
             <w:tcW w:type="dxa" w:w="1440"/>
-            <w:tcMar>
-              <w:top w:w="80" w:type="dxa"/>
-              <w:bottom w:w="80" w:type="dxa"/>
-              <w:start w:w="100" w:type="dxa"/>
-              <w:end w:w="100" w:type="dxa"/>
-            </w:tcMar>
             <w:vAlign w:val="center"/>
-            <w:shd w:fill="DFF2E6"/>
           </w:tcPr>
           <w:p>
             <w:pPr>
-              <w:spacing w:after="0"/>
+              <w:spacing w:after="0" w:line="276" w:lineRule="auto"/>
             </w:pPr>
-            <w:r/>
             <w:r>
               <w:rPr>
-                <w:rFonts w:ascii="Arial" w:hAnsi="Arial" w:eastAsia="Apple SD Gothic Neo"/>
-                <w:b/>
-                <w:sz w:val="17"/>
+                <w:rFonts w:ascii="Pretendard" w:hAnsi="Pretendard" w:eastAsia="Pretendard"/>
+                <w:b w:val="0"/>
+                <w:sz w:val="18"/>
               </w:rPr>
               <w:t>수정 가능</w:t>
             </w:r>
@@ -1854,25 +1421,18 @@
         </w:tc>
         <w:tc>
           <w:tcPr>
-            <w:tcW w:type="dxa" w:w="3024"/>
-            <w:tcMar>
-              <w:top w:w="80" w:type="dxa"/>
-              <w:bottom w:w="80" w:type="dxa"/>
-              <w:start w:w="100" w:type="dxa"/>
-              <w:end w:w="100" w:type="dxa"/>
-            </w:tcMar>
+            <w:tcW w:type="dxa" w:w="2664"/>
             <w:vAlign w:val="center"/>
           </w:tcPr>
           <w:p>
             <w:pPr>
-              <w:spacing w:after="0"/>
+              <w:spacing w:after="0" w:line="276" w:lineRule="auto"/>
             </w:pPr>
-            <w:r/>
             <w:r>
               <w:rPr>
-                <w:rFonts w:ascii="Arial" w:hAnsi="Arial" w:eastAsia="Apple SD Gothic Neo"/>
+                <w:rFonts w:ascii="Pretendard" w:hAnsi="Pretendard" w:eastAsia="Pretendard"/>
                 <w:b w:val="0"/>
-                <w:sz w:val="16"/>
+                <w:sz w:val="18"/>
               </w:rPr>
               <w:t>워크플로우</w:t>
             </w:r>
@@ -1880,27 +1440,20 @@
         </w:tc>
         <w:tc>
           <w:tcPr>
-            <w:tcW w:type="dxa" w:w="3312"/>
-            <w:tcMar>
-              <w:top w:w="80" w:type="dxa"/>
-              <w:bottom w:w="80" w:type="dxa"/>
-              <w:start w:w="100" w:type="dxa"/>
-              <w:end w:w="100" w:type="dxa"/>
-            </w:tcMar>
+            <w:tcW w:type="dxa" w:w="3168"/>
             <w:vAlign w:val="center"/>
           </w:tcPr>
           <w:p>
             <w:pPr>
-              <w:spacing w:after="0"/>
+              <w:spacing w:after="0" w:line="276" w:lineRule="auto"/>
             </w:pPr>
-            <w:r/>
             <w:r>
               <w:rPr>
-                <w:rFonts w:ascii="Arial" w:hAnsi="Arial" w:eastAsia="Apple SD Gothic Neo"/>
+                <w:rFonts w:ascii="Pretendard" w:hAnsi="Pretendard" w:eastAsia="Pretendard"/>
                 <w:b w:val="0"/>
-                <w:sz w:val="16"/>
+                <w:sz w:val="18"/>
               </w:rPr>
-              <w:t>네/나중에요 버튼과 제안 문구 수정</w:t>
+              <w:t>네/나중에요 버튼과 제안 문구가 바뀌는지 확인</w:t>
             </w:r>
           </w:p>
         </w:tc>
@@ -1908,52 +1461,37 @@
       <w:tr>
         <w:tc>
           <w:tcPr>
-            <w:tcW w:type="dxa" w:w="2448"/>
-            <w:tcMar>
-              <w:top w:w="80" w:type="dxa"/>
-              <w:bottom w:w="80" w:type="dxa"/>
-              <w:start w:w="100" w:type="dxa"/>
-              <w:end w:w="100" w:type="dxa"/>
-            </w:tcMar>
+            <w:tcW w:type="dxa" w:w="2520"/>
             <w:vAlign w:val="center"/>
           </w:tcPr>
           <w:p>
             <w:pPr>
-              <w:spacing w:after="0"/>
+              <w:spacing w:after="0" w:line="276" w:lineRule="auto"/>
             </w:pPr>
-            <w:r/>
             <w:r>
               <w:rPr>
-                <w:rFonts w:ascii="Arial" w:hAnsi="Arial" w:eastAsia="Apple SD Gothic Neo"/>
+                <w:rFonts w:ascii="Pretendard" w:hAnsi="Pretendard" w:eastAsia="Pretendard"/>
                 <w:b w:val="0"/>
-                <w:sz w:val="16"/>
+                <w:sz w:val="18"/>
               </w:rPr>
-              <w:t>앱: 기분 -&gt; 질문 -&gt; 자유대화 흐름</w:t>
+              <w:t>기분 -&gt; 질문 -&gt; 자유대화 흐름</w:t>
             </w:r>
           </w:p>
         </w:tc>
         <w:tc>
           <w:tcPr>
             <w:tcW w:type="dxa" w:w="1440"/>
-            <w:tcMar>
-              <w:top w:w="80" w:type="dxa"/>
-              <w:bottom w:w="80" w:type="dxa"/>
-              <w:start w:w="100" w:type="dxa"/>
-              <w:end w:w="100" w:type="dxa"/>
-            </w:tcMar>
             <w:vAlign w:val="center"/>
-            <w:shd w:fill="FFF0D9"/>
           </w:tcPr>
           <w:p>
             <w:pPr>
-              <w:spacing w:after="0"/>
+              <w:spacing w:after="0" w:line="276" w:lineRule="auto"/>
             </w:pPr>
-            <w:r/>
             <w:r>
               <w:rPr>
-                <w:rFonts w:ascii="Arial" w:hAnsi="Arial" w:eastAsia="Apple SD Gothic Neo"/>
-                <w:b/>
-                <w:sz w:val="17"/>
+                <w:rFonts w:ascii="Pretendard" w:hAnsi="Pretendard" w:eastAsia="Pretendard"/>
+                <w:b w:val="0"/>
+                <w:sz w:val="18"/>
               </w:rPr>
               <w:t>보완 필요</w:t>
             </w:r>
@@ -1961,25 +1499,18 @@
         </w:tc>
         <w:tc>
           <w:tcPr>
-            <w:tcW w:type="dxa" w:w="3024"/>
-            <w:tcMar>
-              <w:top w:w="80" w:type="dxa"/>
-              <w:bottom w:w="80" w:type="dxa"/>
-              <w:start w:w="100" w:type="dxa"/>
-              <w:end w:w="100" w:type="dxa"/>
-            </w:tcMar>
+            <w:tcW w:type="dxa" w:w="2664"/>
             <w:vAlign w:val="center"/>
           </w:tcPr>
           <w:p>
             <w:pPr>
-              <w:spacing w:after="0"/>
+              <w:spacing w:after="0" w:line="276" w:lineRule="auto"/>
             </w:pPr>
-            <w:r/>
             <w:r>
               <w:rPr>
-                <w:rFonts w:ascii="Arial" w:hAnsi="Arial" w:eastAsia="Apple SD Gothic Neo"/>
+                <w:rFonts w:ascii="Pretendard" w:hAnsi="Pretendard" w:eastAsia="Pretendard"/>
                 <w:b w:val="0"/>
-                <w:sz w:val="16"/>
+                <w:sz w:val="18"/>
               </w:rPr>
               <w:t>워크플로우</w:t>
             </w:r>
@@ -1987,33 +1518,30 @@
         </w:tc>
         <w:tc>
           <w:tcPr>
-            <w:tcW w:type="dxa" w:w="3312"/>
-            <w:tcMar>
-              <w:top w:w="80" w:type="dxa"/>
-              <w:bottom w:w="80" w:type="dxa"/>
-              <w:start w:w="100" w:type="dxa"/>
-              <w:end w:w="100" w:type="dxa"/>
-            </w:tcMar>
+            <w:tcW w:type="dxa" w:w="3168"/>
             <w:vAlign w:val="center"/>
           </w:tcPr>
           <w:p>
             <w:pPr>
-              <w:spacing w:after="0"/>
+              <w:spacing w:after="0" w:line="276" w:lineRule="auto"/>
             </w:pPr>
-            <w:r/>
             <w:r>
               <w:rPr>
-                <w:rFonts w:ascii="Arial" w:hAnsi="Arial" w:eastAsia="Apple SD Gothic Neo"/>
+                <w:rFonts w:ascii="Pretendard" w:hAnsi="Pretendard" w:eastAsia="Pretendard"/>
                 <w:b w:val="0"/>
-                <w:sz w:val="16"/>
+                <w:sz w:val="18"/>
               </w:rPr>
-              <w:t>단계별 앱 미리보기와 노출 위치 매핑 필요</w:t>
+              <w:t>각 단계가 앱의 어느 화면에 보이는지 관리자 화면에서 바로 확인할 수 있어야 함</w:t>
             </w:r>
           </w:p>
         </w:tc>
       </w:tr>
     </w:tbl>
-    <w:p/>
+    <w:p>
+      <w:pPr>
+        <w:spacing w:after="80"/>
+      </w:pPr>
+    </w:p>
     <w:p>
       <w:r>
         <w:br w:type="page"/>
@@ -2022,22 +1550,20 @@
     <w:p>
       <w:pPr>
         <w:pStyle w:val="Heading1"/>
+        <w:spacing w:before="160" w:after="160"/>
       </w:pPr>
       <w:r>
-        <w:rPr>
-          <w:rFonts w:ascii="Arial" w:hAnsi="Arial" w:eastAsia="Apple SD Gothic Neo"/>
-          <w:b/>
-          <w:color w:val="2E5C96"/>
-          <w:sz w:val="30"/>
-        </w:rPr>
         <w:t>4. 대화 엔진 &gt; 기분별 변주</w:t>
       </w:r>
     </w:p>
     <w:p>
+      <w:pPr>
+        <w:jc w:val="center"/>
+      </w:pPr>
       <w:r>
         <w:drawing>
           <wp:inline xmlns:a="http://schemas.openxmlformats.org/drawingml/2006/main" xmlns:pic="http://schemas.openxmlformats.org/drawingml/2006/picture">
-            <wp:extent cx="6035040" cy="4149090"/>
+            <wp:extent cx="6172200" cy="4243388"/>
             <wp:docPr id="4" name="Picture 4"/>
             <wp:cNvGraphicFramePr>
               <a:graphicFrameLocks noChangeAspect="1"/>
@@ -2058,7 +1584,7 @@
                   <pic:spPr>
                     <a:xfrm>
                       <a:off x="0" y="0"/>
-                      <a:ext cx="6035040" cy="4149090"/>
+                      <a:ext cx="6172200" cy="4243388"/>
                     </a:xfrm>
                     <a:prstGeom prst="rect"/>
                   </pic:spPr>
@@ -2071,73 +1597,53 @@
     </w:p>
     <w:tbl>
       <w:tblPr>
+        <w:tblStyle w:val="TableGrid"/>
         <w:tblW w:type="auto" w:w="0"/>
-        <w:jc w:val="left"/>
-        <w:tblLayout w:type="fixed"/>
+        <w:jc w:val="center"/>
         <w:tblLook w:firstColumn="1" w:firstRow="1" w:lastColumn="0" w:lastRow="0" w:noHBand="0" w:noVBand="1" w:val="04A0"/>
-        <w:tblBorders>
-          <w:top w:val="single" w:sz="4" w:space="0" w:color="DADCE0"/>
-          <w:left w:val="single" w:sz="4" w:space="0" w:color="DADCE0"/>
-          <w:bottom w:val="single" w:sz="4" w:space="0" w:color="DADCE0"/>
-          <w:right w:val="single" w:sz="4" w:space="0" w:color="DADCE0"/>
-          <w:insideH w:val="single" w:sz="4" w:space="0" w:color="DADCE0"/>
-          <w:insideV w:val="single" w:sz="4" w:space="0" w:color="DADCE0"/>
-        </w:tblBorders>
       </w:tblPr>
       <w:tblGrid>
-        <w:gridCol w:w="2556"/>
-        <w:gridCol w:w="2556"/>
-        <w:gridCol w:w="2556"/>
-        <w:gridCol w:w="2556"/>
+        <w:gridCol w:w="2520"/>
+        <w:gridCol w:w="2520"/>
+        <w:gridCol w:w="2520"/>
+        <w:gridCol w:w="2520"/>
       </w:tblGrid>
       <w:tr>
         <w:tc>
           <w:tcPr>
-            <w:tcW w:type="dxa" w:w="2448"/>
-            <w:tcMar>
-              <w:top w:w="80" w:type="dxa"/>
-              <w:bottom w:w="80" w:type="dxa"/>
-              <w:start w:w="100" w:type="dxa"/>
-              <w:end w:w="100" w:type="dxa"/>
-            </w:tcMar>
-            <w:shd w:fill="F3F4F6"/>
+            <w:tcW w:type="dxa" w:w="2520"/>
+            <w:vAlign w:val="center"/>
+            <w:shd w:fill="EEF3F8"/>
           </w:tcPr>
           <w:p>
             <w:pPr>
-              <w:spacing w:after="0"/>
+              <w:spacing w:after="0" w:line="276" w:lineRule="auto"/>
             </w:pPr>
-            <w:r/>
             <w:r>
               <w:rPr>
-                <w:rFonts w:ascii="Arial" w:hAnsi="Arial" w:eastAsia="Apple SD Gothic Neo"/>
+                <w:rFonts w:ascii="Pretendard" w:hAnsi="Pretendard" w:eastAsia="Pretendard"/>
                 <w:b/>
-                <w:sz w:val="17"/>
+                <w:sz w:val="18"/>
               </w:rPr>
-              <w:t>앱 반영 영역</w:t>
+              <w:t>앱에서 보이는 영역</w:t>
             </w:r>
           </w:p>
         </w:tc>
         <w:tc>
           <w:tcPr>
             <w:tcW w:type="dxa" w:w="1440"/>
-            <w:tcMar>
-              <w:top w:w="80" w:type="dxa"/>
-              <w:bottom w:w="80" w:type="dxa"/>
-              <w:start w:w="100" w:type="dxa"/>
-              <w:end w:w="100" w:type="dxa"/>
-            </w:tcMar>
-            <w:shd w:fill="F3F4F6"/>
+            <w:vAlign w:val="center"/>
+            <w:shd w:fill="EEF3F8"/>
           </w:tcPr>
           <w:p>
             <w:pPr>
-              <w:spacing w:after="0"/>
+              <w:spacing w:after="0" w:line="276" w:lineRule="auto"/>
             </w:pPr>
-            <w:r/>
             <w:r>
               <w:rPr>
-                <w:rFonts w:ascii="Arial" w:hAnsi="Arial" w:eastAsia="Apple SD Gothic Neo"/>
+                <w:rFonts w:ascii="Pretendard" w:hAnsi="Pretendard" w:eastAsia="Pretendard"/>
                 <w:b/>
-                <w:sz w:val="17"/>
+                <w:sz w:val="18"/>
               </w:rPr>
               <w:t>판정</w:t>
             </w:r>
@@ -2145,53 +1651,41 @@
         </w:tc>
         <w:tc>
           <w:tcPr>
-            <w:tcW w:type="dxa" w:w="3024"/>
-            <w:tcMar>
-              <w:top w:w="80" w:type="dxa"/>
-              <w:bottom w:w="80" w:type="dxa"/>
-              <w:start w:w="100" w:type="dxa"/>
-              <w:end w:w="100" w:type="dxa"/>
-            </w:tcMar>
-            <w:shd w:fill="F3F4F6"/>
+            <w:tcW w:type="dxa" w:w="2664"/>
+            <w:vAlign w:val="center"/>
+            <w:shd w:fill="EEF3F8"/>
           </w:tcPr>
           <w:p>
             <w:pPr>
-              <w:spacing w:after="0"/>
+              <w:spacing w:after="0" w:line="276" w:lineRule="auto"/>
             </w:pPr>
-            <w:r/>
             <w:r>
               <w:rPr>
-                <w:rFonts w:ascii="Arial" w:hAnsi="Arial" w:eastAsia="Apple SD Gothic Neo"/>
+                <w:rFonts w:ascii="Pretendard" w:hAnsi="Pretendard" w:eastAsia="Pretendard"/>
                 <w:b/>
-                <w:sz w:val="17"/>
+                <w:sz w:val="18"/>
               </w:rPr>
-              <w:t>관리자 웹 수정 위치</w:t>
+              <w:t>관리자 화면 위치</w:t>
             </w:r>
           </w:p>
         </w:tc>
         <w:tc>
           <w:tcPr>
-            <w:tcW w:type="dxa" w:w="3312"/>
-            <w:tcMar>
-              <w:top w:w="80" w:type="dxa"/>
-              <w:bottom w:w="80" w:type="dxa"/>
-              <w:start w:w="100" w:type="dxa"/>
-              <w:end w:w="100" w:type="dxa"/>
-            </w:tcMar>
-            <w:shd w:fill="F3F4F6"/>
+            <w:tcW w:type="dxa" w:w="3168"/>
+            <w:vAlign w:val="center"/>
+            <w:shd w:fill="EEF3F8"/>
           </w:tcPr>
           <w:p>
             <w:pPr>
-              <w:spacing w:after="0"/>
+              <w:spacing w:after="0" w:line="276" w:lineRule="auto"/>
             </w:pPr>
-            <w:r/>
             <w:r>
               <w:rPr>
-                <w:rFonts w:ascii="Arial" w:hAnsi="Arial" w:eastAsia="Apple SD Gothic Neo"/>
+                <w:rFonts w:ascii="Pretendard" w:hAnsi="Pretendard" w:eastAsia="Pretendard"/>
                 <w:b/>
-                <w:sz w:val="17"/>
+                <w:sz w:val="18"/>
               </w:rPr>
-              <w:t>외주사 구현/확인 사항</w:t>
+              <w:t>관리자가 확인할 내용</w:t>
             </w:r>
           </w:p>
         </w:tc>
@@ -2199,52 +1693,37 @@
       <w:tr>
         <w:tc>
           <w:tcPr>
-            <w:tcW w:type="dxa" w:w="2448"/>
-            <w:tcMar>
-              <w:top w:w="80" w:type="dxa"/>
-              <w:bottom w:w="80" w:type="dxa"/>
-              <w:start w:w="100" w:type="dxa"/>
-              <w:end w:w="100" w:type="dxa"/>
-            </w:tcMar>
+            <w:tcW w:type="dxa" w:w="2520"/>
             <w:vAlign w:val="center"/>
           </w:tcPr>
           <w:p>
             <w:pPr>
-              <w:spacing w:after="0"/>
+              <w:spacing w:after="0" w:line="276" w:lineRule="auto"/>
             </w:pPr>
-            <w:r/>
             <w:r>
               <w:rPr>
-                <w:rFonts w:ascii="Arial" w:hAnsi="Arial" w:eastAsia="Apple SD Gothic Neo"/>
+                <w:rFonts w:ascii="Pretendard" w:hAnsi="Pretendard" w:eastAsia="Pretendard"/>
                 <w:b w:val="0"/>
-                <w:sz w:val="16"/>
+                <w:sz w:val="18"/>
               </w:rPr>
-              <w:t>앱: 기분 선택 후 공감 문장</w:t>
+              <w:t>기분 선택 후 공감 문장</w:t>
             </w:r>
           </w:p>
         </w:tc>
         <w:tc>
           <w:tcPr>
             <w:tcW w:type="dxa" w:w="1440"/>
-            <w:tcMar>
-              <w:top w:w="80" w:type="dxa"/>
-              <w:bottom w:w="80" w:type="dxa"/>
-              <w:start w:w="100" w:type="dxa"/>
-              <w:end w:w="100" w:type="dxa"/>
-            </w:tcMar>
             <w:vAlign w:val="center"/>
-            <w:shd w:fill="DFF2E6"/>
           </w:tcPr>
           <w:p>
             <w:pPr>
-              <w:spacing w:after="0"/>
+              <w:spacing w:after="0" w:line="276" w:lineRule="auto"/>
             </w:pPr>
-            <w:r/>
             <w:r>
               <w:rPr>
-                <w:rFonts w:ascii="Arial" w:hAnsi="Arial" w:eastAsia="Apple SD Gothic Neo"/>
-                <w:b/>
-                <w:sz w:val="17"/>
+                <w:rFonts w:ascii="Pretendard" w:hAnsi="Pretendard" w:eastAsia="Pretendard"/>
+                <w:b w:val="0"/>
+                <w:sz w:val="18"/>
               </w:rPr>
               <w:t>수정 가능</w:t>
             </w:r>
@@ -2252,25 +1731,18 @@
         </w:tc>
         <w:tc>
           <w:tcPr>
-            <w:tcW w:type="dxa" w:w="3024"/>
-            <w:tcMar>
-              <w:top w:w="80" w:type="dxa"/>
-              <w:bottom w:w="80" w:type="dxa"/>
-              <w:start w:w="100" w:type="dxa"/>
-              <w:end w:w="100" w:type="dxa"/>
-            </w:tcMar>
+            <w:tcW w:type="dxa" w:w="2664"/>
             <w:vAlign w:val="center"/>
           </w:tcPr>
           <w:p>
             <w:pPr>
-              <w:spacing w:after="0"/>
+              <w:spacing w:after="0" w:line="276" w:lineRule="auto"/>
             </w:pPr>
-            <w:r/>
             <w:r>
               <w:rPr>
-                <w:rFonts w:ascii="Arial" w:hAnsi="Arial" w:eastAsia="Apple SD Gothic Neo"/>
+                <w:rFonts w:ascii="Pretendard" w:hAnsi="Pretendard" w:eastAsia="Pretendard"/>
                 <w:b w:val="0"/>
-                <w:sz w:val="16"/>
+                <w:sz w:val="18"/>
               </w:rPr>
               <w:t>기분별 변주</w:t>
             </w:r>
@@ -2278,27 +1750,20 @@
         </w:tc>
         <w:tc>
           <w:tcPr>
-            <w:tcW w:type="dxa" w:w="3312"/>
-            <w:tcMar>
-              <w:top w:w="80" w:type="dxa"/>
-              <w:bottom w:w="80" w:type="dxa"/>
-              <w:start w:w="100" w:type="dxa"/>
-              <w:end w:w="100" w:type="dxa"/>
-            </w:tcMar>
+            <w:tcW w:type="dxa" w:w="3168"/>
             <w:vAlign w:val="center"/>
           </w:tcPr>
           <w:p>
             <w:pPr>
-              <w:spacing w:after="0"/>
+              <w:spacing w:after="0" w:line="276" w:lineRule="auto"/>
             </w:pPr>
-            <w:r/>
             <w:r>
               <w:rPr>
-                <w:rFonts w:ascii="Arial" w:hAnsi="Arial" w:eastAsia="Apple SD Gothic Neo"/>
+                <w:rFonts w:ascii="Pretendard" w:hAnsi="Pretendard" w:eastAsia="Pretendard"/>
                 <w:b w:val="0"/>
-                <w:sz w:val="16"/>
+                <w:sz w:val="18"/>
               </w:rPr>
-              <w:t>mood_intake 행의 기분별 응답 후보 수정</w:t>
+              <w:t>선택한 기분에 따라 나가는 공감 문장을 수정할 수 있는지 확인</w:t>
             </w:r>
           </w:p>
         </w:tc>
@@ -2306,52 +1771,37 @@
       <w:tr>
         <w:tc>
           <w:tcPr>
-            <w:tcW w:type="dxa" w:w="2448"/>
-            <w:tcMar>
-              <w:top w:w="80" w:type="dxa"/>
-              <w:bottom w:w="80" w:type="dxa"/>
-              <w:start w:w="100" w:type="dxa"/>
-              <w:end w:w="100" w:type="dxa"/>
-            </w:tcMar>
+            <w:tcW w:type="dxa" w:w="2520"/>
             <w:vAlign w:val="center"/>
           </w:tcPr>
           <w:p>
             <w:pPr>
-              <w:spacing w:after="0"/>
+              <w:spacing w:after="0" w:line="276" w:lineRule="auto"/>
             </w:pPr>
-            <w:r/>
             <w:r>
               <w:rPr>
-                <w:rFonts w:ascii="Arial" w:hAnsi="Arial" w:eastAsia="Apple SD Gothic Neo"/>
+                <w:rFonts w:ascii="Pretendard" w:hAnsi="Pretendard" w:eastAsia="Pretendard"/>
                 <w:b w:val="0"/>
-                <w:sz w:val="16"/>
+                <w:sz w:val="18"/>
               </w:rPr>
-              <w:t>앱: 기분별 톤 보정</w:t>
+              <w:t>기분별 말투 조정</w:t>
             </w:r>
           </w:p>
         </w:tc>
         <w:tc>
           <w:tcPr>
             <w:tcW w:type="dxa" w:w="1440"/>
-            <w:tcMar>
-              <w:top w:w="80" w:type="dxa"/>
-              <w:bottom w:w="80" w:type="dxa"/>
-              <w:start w:w="100" w:type="dxa"/>
-              <w:end w:w="100" w:type="dxa"/>
-            </w:tcMar>
             <w:vAlign w:val="center"/>
-            <w:shd w:fill="DFF2E6"/>
           </w:tcPr>
           <w:p>
             <w:pPr>
-              <w:spacing w:after="0"/>
+              <w:spacing w:after="0" w:line="276" w:lineRule="auto"/>
             </w:pPr>
-            <w:r/>
             <w:r>
               <w:rPr>
-                <w:rFonts w:ascii="Arial" w:hAnsi="Arial" w:eastAsia="Apple SD Gothic Neo"/>
-                <w:b/>
-                <w:sz w:val="17"/>
+                <w:rFonts w:ascii="Pretendard" w:hAnsi="Pretendard" w:eastAsia="Pretendard"/>
+                <w:b w:val="0"/>
+                <w:sz w:val="18"/>
               </w:rPr>
               <w:t>수정 가능</w:t>
             </w:r>
@@ -2359,25 +1809,18 @@
         </w:tc>
         <w:tc>
           <w:tcPr>
-            <w:tcW w:type="dxa" w:w="3024"/>
-            <w:tcMar>
-              <w:top w:w="80" w:type="dxa"/>
-              <w:bottom w:w="80" w:type="dxa"/>
-              <w:start w:w="100" w:type="dxa"/>
-              <w:end w:w="100" w:type="dxa"/>
-            </w:tcMar>
+            <w:tcW w:type="dxa" w:w="2664"/>
             <w:vAlign w:val="center"/>
           </w:tcPr>
           <w:p>
             <w:pPr>
-              <w:spacing w:after="0"/>
+              <w:spacing w:after="0" w:line="276" w:lineRule="auto"/>
             </w:pPr>
-            <w:r/>
             <w:r>
               <w:rPr>
-                <w:rFonts w:ascii="Arial" w:hAnsi="Arial" w:eastAsia="Apple SD Gothic Neo"/>
+                <w:rFonts w:ascii="Pretendard" w:hAnsi="Pretendard" w:eastAsia="Pretendard"/>
                 <w:b w:val="0"/>
-                <w:sz w:val="16"/>
+                <w:sz w:val="18"/>
               </w:rPr>
               <w:t>기분별 변주</w:t>
             </w:r>
@@ -2385,33 +1828,30 @@
         </w:tc>
         <w:tc>
           <w:tcPr>
-            <w:tcW w:type="dxa" w:w="3312"/>
-            <w:tcMar>
-              <w:top w:w="80" w:type="dxa"/>
-              <w:bottom w:w="80" w:type="dxa"/>
-              <w:start w:w="100" w:type="dxa"/>
-              <w:end w:w="100" w:type="dxa"/>
-            </w:tcMar>
+            <w:tcW w:type="dxa" w:w="3168"/>
             <w:vAlign w:val="center"/>
           </w:tcPr>
           <w:p>
             <w:pPr>
-              <w:spacing w:after="0"/>
+              <w:spacing w:after="0" w:line="276" w:lineRule="auto"/>
             </w:pPr>
-            <w:r/>
             <w:r>
               <w:rPr>
-                <w:rFonts w:ascii="Arial" w:hAnsi="Arial" w:eastAsia="Apple SD Gothic Neo"/>
+                <w:rFonts w:ascii="Pretendard" w:hAnsi="Pretendard" w:eastAsia="Pretendard"/>
                 <w:b w:val="0"/>
-                <w:sz w:val="16"/>
+                <w:sz w:val="18"/>
               </w:rPr>
-              <w:t>기쁨/걱정/슬픔 등 톤별 문구 관리</w:t>
+              <w:t>기쁨/걱정/슬픔 등 상태별 말투가 관리자 화면에서 관리되는지 확인</w:t>
             </w:r>
           </w:p>
         </w:tc>
       </w:tr>
     </w:tbl>
-    <w:p/>
+    <w:p>
+      <w:pPr>
+        <w:spacing w:after="80"/>
+      </w:pPr>
+    </w:p>
     <w:p>
       <w:r>
         <w:br w:type="page"/>
@@ -2420,22 +1860,20 @@
     <w:p>
       <w:pPr>
         <w:pStyle w:val="Heading1"/>
+        <w:spacing w:before="160" w:after="160"/>
       </w:pPr>
       <w:r>
-        <w:rPr>
-          <w:rFonts w:ascii="Arial" w:hAnsi="Arial" w:eastAsia="Apple SD Gothic Neo"/>
-          <w:b/>
-          <w:color w:val="2E5C96"/>
-          <w:sz w:val="30"/>
-        </w:rPr>
         <w:t>5. 시스템 운영 &gt; 브랜딩</w:t>
       </w:r>
     </w:p>
     <w:p>
+      <w:pPr>
+        <w:jc w:val="center"/>
+      </w:pPr>
       <w:r>
         <w:drawing>
           <wp:inline xmlns:a="http://schemas.openxmlformats.org/drawingml/2006/main" xmlns:pic="http://schemas.openxmlformats.org/drawingml/2006/picture">
-            <wp:extent cx="6035040" cy="4149090"/>
+            <wp:extent cx="6172200" cy="4243388"/>
             <wp:docPr id="5" name="Picture 5"/>
             <wp:cNvGraphicFramePr>
               <a:graphicFrameLocks noChangeAspect="1"/>
@@ -2456,7 +1894,7 @@
                   <pic:spPr>
                     <a:xfrm>
                       <a:off x="0" y="0"/>
-                      <a:ext cx="6035040" cy="4149090"/>
+                      <a:ext cx="6172200" cy="4243388"/>
                     </a:xfrm>
                     <a:prstGeom prst="rect"/>
                   </pic:spPr>
@@ -2469,73 +1907,53 @@
     </w:p>
     <w:tbl>
       <w:tblPr>
+        <w:tblStyle w:val="TableGrid"/>
         <w:tblW w:type="auto" w:w="0"/>
-        <w:jc w:val="left"/>
-        <w:tblLayout w:type="fixed"/>
+        <w:jc w:val="center"/>
         <w:tblLook w:firstColumn="1" w:firstRow="1" w:lastColumn="0" w:lastRow="0" w:noHBand="0" w:noVBand="1" w:val="04A0"/>
-        <w:tblBorders>
-          <w:top w:val="single" w:sz="4" w:space="0" w:color="DADCE0"/>
-          <w:left w:val="single" w:sz="4" w:space="0" w:color="DADCE0"/>
-          <w:bottom w:val="single" w:sz="4" w:space="0" w:color="DADCE0"/>
-          <w:right w:val="single" w:sz="4" w:space="0" w:color="DADCE0"/>
-          <w:insideH w:val="single" w:sz="4" w:space="0" w:color="DADCE0"/>
-          <w:insideV w:val="single" w:sz="4" w:space="0" w:color="DADCE0"/>
-        </w:tblBorders>
       </w:tblPr>
       <w:tblGrid>
-        <w:gridCol w:w="2556"/>
-        <w:gridCol w:w="2556"/>
-        <w:gridCol w:w="2556"/>
-        <w:gridCol w:w="2556"/>
+        <w:gridCol w:w="2520"/>
+        <w:gridCol w:w="2520"/>
+        <w:gridCol w:w="2520"/>
+        <w:gridCol w:w="2520"/>
       </w:tblGrid>
       <w:tr>
         <w:tc>
           <w:tcPr>
-            <w:tcW w:type="dxa" w:w="2448"/>
-            <w:tcMar>
-              <w:top w:w="80" w:type="dxa"/>
-              <w:bottom w:w="80" w:type="dxa"/>
-              <w:start w:w="100" w:type="dxa"/>
-              <w:end w:w="100" w:type="dxa"/>
-            </w:tcMar>
-            <w:shd w:fill="F3F4F6"/>
+            <w:tcW w:type="dxa" w:w="2520"/>
+            <w:vAlign w:val="center"/>
+            <w:shd w:fill="EEF3F8"/>
           </w:tcPr>
           <w:p>
             <w:pPr>
-              <w:spacing w:after="0"/>
+              <w:spacing w:after="0" w:line="276" w:lineRule="auto"/>
             </w:pPr>
-            <w:r/>
             <w:r>
               <w:rPr>
-                <w:rFonts w:ascii="Arial" w:hAnsi="Arial" w:eastAsia="Apple SD Gothic Neo"/>
+                <w:rFonts w:ascii="Pretendard" w:hAnsi="Pretendard" w:eastAsia="Pretendard"/>
                 <w:b/>
-                <w:sz w:val="17"/>
+                <w:sz w:val="18"/>
               </w:rPr>
-              <w:t>앱 반영 영역</w:t>
+              <w:t>앱에서 보이는 영역</w:t>
             </w:r>
           </w:p>
         </w:tc>
         <w:tc>
           <w:tcPr>
             <w:tcW w:type="dxa" w:w="1440"/>
-            <w:tcMar>
-              <w:top w:w="80" w:type="dxa"/>
-              <w:bottom w:w="80" w:type="dxa"/>
-              <w:start w:w="100" w:type="dxa"/>
-              <w:end w:w="100" w:type="dxa"/>
-            </w:tcMar>
-            <w:shd w:fill="F3F4F6"/>
+            <w:vAlign w:val="center"/>
+            <w:shd w:fill="EEF3F8"/>
           </w:tcPr>
           <w:p>
             <w:pPr>
-              <w:spacing w:after="0"/>
+              <w:spacing w:after="0" w:line="276" w:lineRule="auto"/>
             </w:pPr>
-            <w:r/>
             <w:r>
               <w:rPr>
-                <w:rFonts w:ascii="Arial" w:hAnsi="Arial" w:eastAsia="Apple SD Gothic Neo"/>
+                <w:rFonts w:ascii="Pretendard" w:hAnsi="Pretendard" w:eastAsia="Pretendard"/>
                 <w:b/>
-                <w:sz w:val="17"/>
+                <w:sz w:val="18"/>
               </w:rPr>
               <w:t>판정</w:t>
             </w:r>
@@ -2543,53 +1961,41 @@
         </w:tc>
         <w:tc>
           <w:tcPr>
-            <w:tcW w:type="dxa" w:w="3024"/>
-            <w:tcMar>
-              <w:top w:w="80" w:type="dxa"/>
-              <w:bottom w:w="80" w:type="dxa"/>
-              <w:start w:w="100" w:type="dxa"/>
-              <w:end w:w="100" w:type="dxa"/>
-            </w:tcMar>
-            <w:shd w:fill="F3F4F6"/>
+            <w:tcW w:type="dxa" w:w="2664"/>
+            <w:vAlign w:val="center"/>
+            <w:shd w:fill="EEF3F8"/>
           </w:tcPr>
           <w:p>
             <w:pPr>
-              <w:spacing w:after="0"/>
+              <w:spacing w:after="0" w:line="276" w:lineRule="auto"/>
             </w:pPr>
-            <w:r/>
             <w:r>
               <w:rPr>
-                <w:rFonts w:ascii="Arial" w:hAnsi="Arial" w:eastAsia="Apple SD Gothic Neo"/>
+                <w:rFonts w:ascii="Pretendard" w:hAnsi="Pretendard" w:eastAsia="Pretendard"/>
                 <w:b/>
-                <w:sz w:val="17"/>
+                <w:sz w:val="18"/>
               </w:rPr>
-              <w:t>관리자 웹 수정 위치</w:t>
+              <w:t>관리자 화면 위치</w:t>
             </w:r>
           </w:p>
         </w:tc>
         <w:tc>
           <w:tcPr>
-            <w:tcW w:type="dxa" w:w="3312"/>
-            <w:tcMar>
-              <w:top w:w="80" w:type="dxa"/>
-              <w:bottom w:w="80" w:type="dxa"/>
-              <w:start w:w="100" w:type="dxa"/>
-              <w:end w:w="100" w:type="dxa"/>
-            </w:tcMar>
-            <w:shd w:fill="F3F4F6"/>
+            <w:tcW w:type="dxa" w:w="3168"/>
+            <w:vAlign w:val="center"/>
+            <w:shd w:fill="EEF3F8"/>
           </w:tcPr>
           <w:p>
             <w:pPr>
-              <w:spacing w:after="0"/>
+              <w:spacing w:after="0" w:line="276" w:lineRule="auto"/>
             </w:pPr>
-            <w:r/>
             <w:r>
               <w:rPr>
-                <w:rFonts w:ascii="Arial" w:hAnsi="Arial" w:eastAsia="Apple SD Gothic Neo"/>
+                <w:rFonts w:ascii="Pretendard" w:hAnsi="Pretendard" w:eastAsia="Pretendard"/>
                 <w:b/>
-                <w:sz w:val="17"/>
+                <w:sz w:val="18"/>
               </w:rPr>
-              <w:t>외주사 구현/확인 사항</w:t>
+              <w:t>관리자가 확인할 내용</w:t>
             </w:r>
           </w:p>
         </w:tc>
@@ -2597,52 +2003,37 @@
       <w:tr>
         <w:tc>
           <w:tcPr>
-            <w:tcW w:type="dxa" w:w="2448"/>
-            <w:tcMar>
-              <w:top w:w="80" w:type="dxa"/>
-              <w:bottom w:w="80" w:type="dxa"/>
-              <w:start w:w="100" w:type="dxa"/>
-              <w:end w:w="100" w:type="dxa"/>
-            </w:tcMar>
+            <w:tcW w:type="dxa" w:w="2520"/>
             <w:vAlign w:val="center"/>
           </w:tcPr>
           <w:p>
             <w:pPr>
-              <w:spacing w:after="0"/>
+              <w:spacing w:after="0" w:line="276" w:lineRule="auto"/>
             </w:pPr>
-            <w:r/>
             <w:r>
               <w:rPr>
-                <w:rFonts w:ascii="Arial" w:hAnsi="Arial" w:eastAsia="Apple SD Gothic Neo"/>
+                <w:rFonts w:ascii="Pretendard" w:hAnsi="Pretendard" w:eastAsia="Pretendard"/>
                 <w:b w:val="0"/>
-                <w:sz w:val="16"/>
+                <w:sz w:val="18"/>
               </w:rPr>
-              <w:t>앱: 외부 설문 버튼</w:t>
+              <w:t>외부 설문 버튼</w:t>
             </w:r>
           </w:p>
         </w:tc>
         <w:tc>
           <w:tcPr>
             <w:tcW w:type="dxa" w:w="1440"/>
-            <w:tcMar>
-              <w:top w:w="80" w:type="dxa"/>
-              <w:bottom w:w="80" w:type="dxa"/>
-              <w:start w:w="100" w:type="dxa"/>
-              <w:end w:w="100" w:type="dxa"/>
-            </w:tcMar>
             <w:vAlign w:val="center"/>
-            <w:shd w:fill="DFF2E6"/>
           </w:tcPr>
           <w:p>
             <w:pPr>
-              <w:spacing w:after="0"/>
+              <w:spacing w:after="0" w:line="276" w:lineRule="auto"/>
             </w:pPr>
-            <w:r/>
             <w:r>
               <w:rPr>
-                <w:rFonts w:ascii="Arial" w:hAnsi="Arial" w:eastAsia="Apple SD Gothic Neo"/>
-                <w:b/>
-                <w:sz w:val="17"/>
+                <w:rFonts w:ascii="Pretendard" w:hAnsi="Pretendard" w:eastAsia="Pretendard"/>
+                <w:b w:val="0"/>
+                <w:sz w:val="18"/>
               </w:rPr>
               <w:t>수정 가능</w:t>
             </w:r>
@@ -2650,25 +2041,18 @@
         </w:tc>
         <w:tc>
           <w:tcPr>
-            <w:tcW w:type="dxa" w:w="3024"/>
-            <w:tcMar>
-              <w:top w:w="80" w:type="dxa"/>
-              <w:bottom w:w="80" w:type="dxa"/>
-              <w:start w:w="100" w:type="dxa"/>
-              <w:end w:w="100" w:type="dxa"/>
-            </w:tcMar>
+            <w:tcW w:type="dxa" w:w="2664"/>
             <w:vAlign w:val="center"/>
           </w:tcPr>
           <w:p>
             <w:pPr>
-              <w:spacing w:after="0"/>
+              <w:spacing w:after="0" w:line="276" w:lineRule="auto"/>
             </w:pPr>
-            <w:r/>
             <w:r>
               <w:rPr>
-                <w:rFonts w:ascii="Arial" w:hAnsi="Arial" w:eastAsia="Apple SD Gothic Neo"/>
+                <w:rFonts w:ascii="Pretendard" w:hAnsi="Pretendard" w:eastAsia="Pretendard"/>
                 <w:b w:val="0"/>
-                <w:sz w:val="16"/>
+                <w:sz w:val="18"/>
               </w:rPr>
               <w:t>브랜딩 &gt; 외부 설문 노출</w:t>
             </w:r>
@@ -2676,27 +2060,20 @@
         </w:tc>
         <w:tc>
           <w:tcPr>
-            <w:tcW w:type="dxa" w:w="3312"/>
-            <w:tcMar>
-              <w:top w:w="80" w:type="dxa"/>
-              <w:bottom w:w="80" w:type="dxa"/>
-              <w:start w:w="100" w:type="dxa"/>
-              <w:end w:w="100" w:type="dxa"/>
-            </w:tcMar>
+            <w:tcW w:type="dxa" w:w="3168"/>
             <w:vAlign w:val="center"/>
           </w:tcPr>
           <w:p>
             <w:pPr>
-              <w:spacing w:after="0"/>
+              <w:spacing w:after="0" w:line="276" w:lineRule="auto"/>
             </w:pPr>
-            <w:r/>
             <w:r>
               <w:rPr>
-                <w:rFonts w:ascii="Arial" w:hAnsi="Arial" w:eastAsia="Apple SD Gothic Neo"/>
+                <w:rFonts w:ascii="Pretendard" w:hAnsi="Pretendard" w:eastAsia="Pretendard"/>
                 <w:b w:val="0"/>
-                <w:sz w:val="16"/>
+                <w:sz w:val="18"/>
               </w:rPr>
-              <w:t>버튼명, 링크, 보이기/가림 처리</w:t>
+              <w:t>버튼명, 연결 주소, 보임/가림 상태를 바꿀 수 있는지 확인</w:t>
             </w:r>
           </w:p>
         </w:tc>
@@ -2704,52 +2081,37 @@
       <w:tr>
         <w:tc>
           <w:tcPr>
-            <w:tcW w:type="dxa" w:w="2448"/>
-            <w:tcMar>
-              <w:top w:w="80" w:type="dxa"/>
-              <w:bottom w:w="80" w:type="dxa"/>
-              <w:start w:w="100" w:type="dxa"/>
-              <w:end w:w="100" w:type="dxa"/>
-            </w:tcMar>
+            <w:tcW w:type="dxa" w:w="2520"/>
             <w:vAlign w:val="center"/>
           </w:tcPr>
           <w:p>
             <w:pPr>
-              <w:spacing w:after="0"/>
+              <w:spacing w:after="0" w:line="276" w:lineRule="auto"/>
             </w:pPr>
-            <w:r/>
             <w:r>
               <w:rPr>
-                <w:rFonts w:ascii="Arial" w:hAnsi="Arial" w:eastAsia="Apple SD Gothic Neo"/>
+                <w:rFonts w:ascii="Pretendard" w:hAnsi="Pretendard" w:eastAsia="Pretendard"/>
                 <w:b w:val="0"/>
-                <w:sz w:val="16"/>
+                <w:sz w:val="18"/>
               </w:rPr>
-              <w:t>앱: 마스코트/브랜딩 이미지</w:t>
+              <w:t>마스코트 / 브랜딩 이미지</w:t>
             </w:r>
           </w:p>
         </w:tc>
         <w:tc>
           <w:tcPr>
             <w:tcW w:type="dxa" w:w="1440"/>
-            <w:tcMar>
-              <w:top w:w="80" w:type="dxa"/>
-              <w:bottom w:w="80" w:type="dxa"/>
-              <w:start w:w="100" w:type="dxa"/>
-              <w:end w:w="100" w:type="dxa"/>
-            </w:tcMar>
             <w:vAlign w:val="center"/>
-            <w:shd w:fill="DFF2E6"/>
           </w:tcPr>
           <w:p>
             <w:pPr>
-              <w:spacing w:after="0"/>
+              <w:spacing w:after="0" w:line="276" w:lineRule="auto"/>
             </w:pPr>
-            <w:r/>
             <w:r>
               <w:rPr>
-                <w:rFonts w:ascii="Arial" w:hAnsi="Arial" w:eastAsia="Apple SD Gothic Neo"/>
-                <w:b/>
-                <w:sz w:val="17"/>
+                <w:rFonts w:ascii="Pretendard" w:hAnsi="Pretendard" w:eastAsia="Pretendard"/>
+                <w:b w:val="0"/>
+                <w:sz w:val="18"/>
               </w:rPr>
               <w:t>수정 가능</w:t>
             </w:r>
@@ -2757,25 +2119,18 @@
         </w:tc>
         <w:tc>
           <w:tcPr>
-            <w:tcW w:type="dxa" w:w="3024"/>
-            <w:tcMar>
-              <w:top w:w="80" w:type="dxa"/>
-              <w:bottom w:w="80" w:type="dxa"/>
-              <w:start w:w="100" w:type="dxa"/>
-              <w:end w:w="100" w:type="dxa"/>
-            </w:tcMar>
+            <w:tcW w:type="dxa" w:w="2664"/>
             <w:vAlign w:val="center"/>
           </w:tcPr>
           <w:p>
             <w:pPr>
-              <w:spacing w:after="0"/>
+              <w:spacing w:after="0" w:line="276" w:lineRule="auto"/>
             </w:pPr>
-            <w:r/>
             <w:r>
               <w:rPr>
-                <w:rFonts w:ascii="Arial" w:hAnsi="Arial" w:eastAsia="Apple SD Gothic Neo"/>
+                <w:rFonts w:ascii="Pretendard" w:hAnsi="Pretendard" w:eastAsia="Pretendard"/>
                 <w:b w:val="0"/>
-                <w:sz w:val="16"/>
+                <w:sz w:val="18"/>
               </w:rPr>
               <w:t>브랜딩</w:t>
             </w:r>
@@ -2783,27 +2138,20 @@
         </w:tc>
         <w:tc>
           <w:tcPr>
-            <w:tcW w:type="dxa" w:w="3312"/>
-            <w:tcMar>
-              <w:top w:w="80" w:type="dxa"/>
-              <w:bottom w:w="80" w:type="dxa"/>
-              <w:start w:w="100" w:type="dxa"/>
-              <w:end w:w="100" w:type="dxa"/>
-            </w:tcMar>
+            <w:tcW w:type="dxa" w:w="3168"/>
             <w:vAlign w:val="center"/>
           </w:tcPr>
           <w:p>
             <w:pPr>
-              <w:spacing w:after="0"/>
+              <w:spacing w:after="0" w:line="276" w:lineRule="auto"/>
             </w:pPr>
-            <w:r/>
             <w:r>
               <w:rPr>
-                <w:rFonts w:ascii="Arial" w:hAnsi="Arial" w:eastAsia="Apple SD Gothic Neo"/>
+                <w:rFonts w:ascii="Pretendard" w:hAnsi="Pretendard" w:eastAsia="Pretendard"/>
                 <w:b w:val="0"/>
-                <w:sz w:val="16"/>
+                <w:sz w:val="18"/>
               </w:rPr>
-              <w:t>이미지 업로드/교체</w:t>
+              <w:t>이미지를 업로드하거나 교체할 수 있는지 확인</w:t>
             </w:r>
           </w:p>
         </w:tc>
@@ -2811,52 +2159,37 @@
       <w:tr>
         <w:tc>
           <w:tcPr>
-            <w:tcW w:type="dxa" w:w="2448"/>
-            <w:tcMar>
-              <w:top w:w="80" w:type="dxa"/>
-              <w:bottom w:w="80" w:type="dxa"/>
-              <w:start w:w="100" w:type="dxa"/>
-              <w:end w:w="100" w:type="dxa"/>
-            </w:tcMar>
+            <w:tcW w:type="dxa" w:w="2520"/>
             <w:vAlign w:val="center"/>
           </w:tcPr>
           <w:p>
             <w:pPr>
-              <w:spacing w:after="0"/>
+              <w:spacing w:after="0" w:line="276" w:lineRule="auto"/>
             </w:pPr>
-            <w:r/>
             <w:r>
               <w:rPr>
-                <w:rFonts w:ascii="Arial" w:hAnsi="Arial" w:eastAsia="Apple SD Gothic Neo"/>
+                <w:rFonts w:ascii="Pretendard" w:hAnsi="Pretendard" w:eastAsia="Pretendard"/>
                 <w:b w:val="0"/>
-                <w:sz w:val="16"/>
+                <w:sz w:val="18"/>
               </w:rPr>
-              <w:t>앱: 사용설명서 보기</w:t>
+              <w:t>사용설명서 보기</w:t>
             </w:r>
           </w:p>
         </w:tc>
         <w:tc>
           <w:tcPr>
             <w:tcW w:type="dxa" w:w="1440"/>
-            <w:tcMar>
-              <w:top w:w="80" w:type="dxa"/>
-              <w:bottom w:w="80" w:type="dxa"/>
-              <w:start w:w="100" w:type="dxa"/>
-              <w:end w:w="100" w:type="dxa"/>
-            </w:tcMar>
             <w:vAlign w:val="center"/>
-            <w:shd w:fill="FFF0D9"/>
           </w:tcPr>
           <w:p>
             <w:pPr>
-              <w:spacing w:after="0"/>
+              <w:spacing w:after="0" w:line="276" w:lineRule="auto"/>
             </w:pPr>
-            <w:r/>
             <w:r>
               <w:rPr>
-                <w:rFonts w:ascii="Arial" w:hAnsi="Arial" w:eastAsia="Apple SD Gothic Neo"/>
-                <w:b/>
-                <w:sz w:val="17"/>
+                <w:rFonts w:ascii="Pretendard" w:hAnsi="Pretendard" w:eastAsia="Pretendard"/>
+                <w:b w:val="0"/>
+                <w:sz w:val="18"/>
               </w:rPr>
               <w:t>보완 필요</w:t>
             </w:r>
@@ -2864,59 +2197,49 @@
         </w:tc>
         <w:tc>
           <w:tcPr>
-            <w:tcW w:type="dxa" w:w="3024"/>
-            <w:tcMar>
-              <w:top w:w="80" w:type="dxa"/>
-              <w:bottom w:w="80" w:type="dxa"/>
-              <w:start w:w="100" w:type="dxa"/>
-              <w:end w:w="100" w:type="dxa"/>
-            </w:tcMar>
+            <w:tcW w:type="dxa" w:w="2664"/>
             <w:vAlign w:val="center"/>
           </w:tcPr>
           <w:p>
             <w:pPr>
-              <w:spacing w:after="0"/>
+              <w:spacing w:after="0" w:line="276" w:lineRule="auto"/>
             </w:pPr>
-            <w:r/>
             <w:r>
               <w:rPr>
-                <w:rFonts w:ascii="Arial" w:hAnsi="Arial" w:eastAsia="Apple SD Gothic Neo"/>
+                <w:rFonts w:ascii="Pretendard" w:hAnsi="Pretendard" w:eastAsia="Pretendard"/>
                 <w:b w:val="0"/>
-                <w:sz w:val="16"/>
+                <w:sz w:val="18"/>
               </w:rPr>
-              <w:t>브랜딩 또는 앱 UI 문구 관리</w:t>
+              <w:t>브랜딩 또는 문서 관리 화면</w:t>
             </w:r>
           </w:p>
         </w:tc>
         <w:tc>
           <w:tcPr>
-            <w:tcW w:type="dxa" w:w="3312"/>
-            <w:tcMar>
-              <w:top w:w="80" w:type="dxa"/>
-              <w:bottom w:w="80" w:type="dxa"/>
-              <w:start w:w="100" w:type="dxa"/>
-              <w:end w:w="100" w:type="dxa"/>
-            </w:tcMar>
+            <w:tcW w:type="dxa" w:w="3168"/>
             <w:vAlign w:val="center"/>
           </w:tcPr>
           <w:p>
             <w:pPr>
-              <w:spacing w:after="0"/>
+              <w:spacing w:after="0" w:line="276" w:lineRule="auto"/>
             </w:pPr>
-            <w:r/>
             <w:r>
               <w:rPr>
-                <w:rFonts w:ascii="Arial" w:hAnsi="Arial" w:eastAsia="Apple SD Gothic Neo"/>
+                <w:rFonts w:ascii="Pretendard" w:hAnsi="Pretendard" w:eastAsia="Pretendard"/>
                 <w:b w:val="0"/>
-                <w:sz w:val="16"/>
+                <w:sz w:val="18"/>
               </w:rPr>
-              <w:t>사용설명서 문서 URL/파일 교체 기능 필요</w:t>
+              <w:t>사용설명서 파일이나 연결 주소를 관리자 화면에서 바꿀 수 있어야 함</w:t>
             </w:r>
           </w:p>
         </w:tc>
       </w:tr>
     </w:tbl>
-    <w:p/>
+    <w:p>
+      <w:pPr>
+        <w:spacing w:after="80"/>
+      </w:pPr>
+    </w:p>
     <w:p>
       <w:r>
         <w:br w:type="page"/>
@@ -2925,22 +2248,20 @@
     <w:p>
       <w:pPr>
         <w:pStyle w:val="Heading1"/>
+        <w:spacing w:before="160" w:after="160"/>
       </w:pPr>
       <w:r>
-        <w:rPr>
-          <w:rFonts w:ascii="Arial" w:hAnsi="Arial" w:eastAsia="Apple SD Gothic Neo"/>
-          <w:b/>
-          <w:color w:val="2E5C96"/>
-          <w:sz w:val="30"/>
-        </w:rPr>
         <w:t>6. 시스템 운영 &gt; 사용자 운영 액션</w:t>
       </w:r>
     </w:p>
     <w:p>
+      <w:pPr>
+        <w:jc w:val="center"/>
+      </w:pPr>
       <w:r>
         <w:drawing>
           <wp:inline xmlns:a="http://schemas.openxmlformats.org/drawingml/2006/main" xmlns:pic="http://schemas.openxmlformats.org/drawingml/2006/picture">
-            <wp:extent cx="6035040" cy="4149090"/>
+            <wp:extent cx="6172200" cy="4243388"/>
             <wp:docPr id="6" name="Picture 6"/>
             <wp:cNvGraphicFramePr>
               <a:graphicFrameLocks noChangeAspect="1"/>
@@ -2961,7 +2282,7 @@
                   <pic:spPr>
                     <a:xfrm>
                       <a:off x="0" y="0"/>
-                      <a:ext cx="6035040" cy="4149090"/>
+                      <a:ext cx="6172200" cy="4243388"/>
                     </a:xfrm>
                     <a:prstGeom prst="rect"/>
                   </pic:spPr>
@@ -2974,73 +2295,53 @@
     </w:p>
     <w:tbl>
       <w:tblPr>
+        <w:tblStyle w:val="TableGrid"/>
         <w:tblW w:type="auto" w:w="0"/>
-        <w:jc w:val="left"/>
-        <w:tblLayout w:type="fixed"/>
+        <w:jc w:val="center"/>
         <w:tblLook w:firstColumn="1" w:firstRow="1" w:lastColumn="0" w:lastRow="0" w:noHBand="0" w:noVBand="1" w:val="04A0"/>
-        <w:tblBorders>
-          <w:top w:val="single" w:sz="4" w:space="0" w:color="DADCE0"/>
-          <w:left w:val="single" w:sz="4" w:space="0" w:color="DADCE0"/>
-          <w:bottom w:val="single" w:sz="4" w:space="0" w:color="DADCE0"/>
-          <w:right w:val="single" w:sz="4" w:space="0" w:color="DADCE0"/>
-          <w:insideH w:val="single" w:sz="4" w:space="0" w:color="DADCE0"/>
-          <w:insideV w:val="single" w:sz="4" w:space="0" w:color="DADCE0"/>
-        </w:tblBorders>
       </w:tblPr>
       <w:tblGrid>
-        <w:gridCol w:w="2556"/>
-        <w:gridCol w:w="2556"/>
-        <w:gridCol w:w="2556"/>
-        <w:gridCol w:w="2556"/>
+        <w:gridCol w:w="2520"/>
+        <w:gridCol w:w="2520"/>
+        <w:gridCol w:w="2520"/>
+        <w:gridCol w:w="2520"/>
       </w:tblGrid>
       <w:tr>
         <w:tc>
           <w:tcPr>
-            <w:tcW w:type="dxa" w:w="2448"/>
-            <w:tcMar>
-              <w:top w:w="80" w:type="dxa"/>
-              <w:bottom w:w="80" w:type="dxa"/>
-              <w:start w:w="100" w:type="dxa"/>
-              <w:end w:w="100" w:type="dxa"/>
-            </w:tcMar>
-            <w:shd w:fill="F3F4F6"/>
+            <w:tcW w:type="dxa" w:w="2520"/>
+            <w:vAlign w:val="center"/>
+            <w:shd w:fill="EEF3F8"/>
           </w:tcPr>
           <w:p>
             <w:pPr>
-              <w:spacing w:after="0"/>
+              <w:spacing w:after="0" w:line="276" w:lineRule="auto"/>
             </w:pPr>
-            <w:r/>
             <w:r>
               <w:rPr>
-                <w:rFonts w:ascii="Arial" w:hAnsi="Arial" w:eastAsia="Apple SD Gothic Neo"/>
+                <w:rFonts w:ascii="Pretendard" w:hAnsi="Pretendard" w:eastAsia="Pretendard"/>
                 <w:b/>
-                <w:sz w:val="17"/>
+                <w:sz w:val="18"/>
               </w:rPr>
-              <w:t>앱 반영 영역</w:t>
+              <w:t>앱에서 보이는 영역</w:t>
             </w:r>
           </w:p>
         </w:tc>
         <w:tc>
           <w:tcPr>
             <w:tcW w:type="dxa" w:w="1440"/>
-            <w:tcMar>
-              <w:top w:w="80" w:type="dxa"/>
-              <w:bottom w:w="80" w:type="dxa"/>
-              <w:start w:w="100" w:type="dxa"/>
-              <w:end w:w="100" w:type="dxa"/>
-            </w:tcMar>
-            <w:shd w:fill="F3F4F6"/>
+            <w:vAlign w:val="center"/>
+            <w:shd w:fill="EEF3F8"/>
           </w:tcPr>
           <w:p>
             <w:pPr>
-              <w:spacing w:after="0"/>
+              <w:spacing w:after="0" w:line="276" w:lineRule="auto"/>
             </w:pPr>
-            <w:r/>
             <w:r>
               <w:rPr>
-                <w:rFonts w:ascii="Arial" w:hAnsi="Arial" w:eastAsia="Apple SD Gothic Neo"/>
+                <w:rFonts w:ascii="Pretendard" w:hAnsi="Pretendard" w:eastAsia="Pretendard"/>
                 <w:b/>
-                <w:sz w:val="17"/>
+                <w:sz w:val="18"/>
               </w:rPr>
               <w:t>판정</w:t>
             </w:r>
@@ -3048,53 +2349,41 @@
         </w:tc>
         <w:tc>
           <w:tcPr>
-            <w:tcW w:type="dxa" w:w="3024"/>
-            <w:tcMar>
-              <w:top w:w="80" w:type="dxa"/>
-              <w:bottom w:w="80" w:type="dxa"/>
-              <w:start w:w="100" w:type="dxa"/>
-              <w:end w:w="100" w:type="dxa"/>
-            </w:tcMar>
-            <w:shd w:fill="F3F4F6"/>
+            <w:tcW w:type="dxa" w:w="2664"/>
+            <w:vAlign w:val="center"/>
+            <w:shd w:fill="EEF3F8"/>
           </w:tcPr>
           <w:p>
             <w:pPr>
-              <w:spacing w:after="0"/>
+              <w:spacing w:after="0" w:line="276" w:lineRule="auto"/>
             </w:pPr>
-            <w:r/>
             <w:r>
               <w:rPr>
-                <w:rFonts w:ascii="Arial" w:hAnsi="Arial" w:eastAsia="Apple SD Gothic Neo"/>
+                <w:rFonts w:ascii="Pretendard" w:hAnsi="Pretendard" w:eastAsia="Pretendard"/>
                 <w:b/>
-                <w:sz w:val="17"/>
+                <w:sz w:val="18"/>
               </w:rPr>
-              <w:t>관리자 웹 수정 위치</w:t>
+              <w:t>관리자 화면 위치</w:t>
             </w:r>
           </w:p>
         </w:tc>
         <w:tc>
           <w:tcPr>
-            <w:tcW w:type="dxa" w:w="3312"/>
-            <w:tcMar>
-              <w:top w:w="80" w:type="dxa"/>
-              <w:bottom w:w="80" w:type="dxa"/>
-              <w:start w:w="100" w:type="dxa"/>
-              <w:end w:w="100" w:type="dxa"/>
-            </w:tcMar>
-            <w:shd w:fill="F3F4F6"/>
+            <w:tcW w:type="dxa" w:w="3168"/>
+            <w:vAlign w:val="center"/>
+            <w:shd w:fill="EEF3F8"/>
           </w:tcPr>
           <w:p>
             <w:pPr>
-              <w:spacing w:after="0"/>
+              <w:spacing w:after="0" w:line="276" w:lineRule="auto"/>
             </w:pPr>
-            <w:r/>
             <w:r>
               <w:rPr>
-                <w:rFonts w:ascii="Arial" w:hAnsi="Arial" w:eastAsia="Apple SD Gothic Neo"/>
+                <w:rFonts w:ascii="Pretendard" w:hAnsi="Pretendard" w:eastAsia="Pretendard"/>
                 <w:b/>
-                <w:sz w:val="17"/>
+                <w:sz w:val="18"/>
               </w:rPr>
-              <w:t>외주사 구현/확인 사항</w:t>
+              <w:t>관리자가 확인할 내용</w:t>
             </w:r>
           </w:p>
         </w:tc>
@@ -3102,52 +2391,37 @@
       <w:tr>
         <w:tc>
           <w:tcPr>
-            <w:tcW w:type="dxa" w:w="2448"/>
-            <w:tcMar>
-              <w:top w:w="80" w:type="dxa"/>
-              <w:bottom w:w="80" w:type="dxa"/>
-              <w:start w:w="100" w:type="dxa"/>
-              <w:end w:w="100" w:type="dxa"/>
-            </w:tcMar>
+            <w:tcW w:type="dxa" w:w="2520"/>
             <w:vAlign w:val="center"/>
           </w:tcPr>
           <w:p>
             <w:pPr>
-              <w:spacing w:after="0"/>
+              <w:spacing w:after="0" w:line="276" w:lineRule="auto"/>
             </w:pPr>
-            <w:r/>
             <w:r>
               <w:rPr>
-                <w:rFonts w:ascii="Arial" w:hAnsi="Arial" w:eastAsia="Apple SD Gothic Neo"/>
+                <w:rFonts w:ascii="Pretendard" w:hAnsi="Pretendard" w:eastAsia="Pretendard"/>
                 <w:b w:val="0"/>
-                <w:sz w:val="16"/>
+                <w:sz w:val="18"/>
               </w:rPr>
-              <w:t>앱: 15주 2일/임신일수/남은일수</w:t>
+              <w:t>15주 2일 / 임신일수 / 남은일수</w:t>
             </w:r>
           </w:p>
         </w:tc>
         <w:tc>
           <w:tcPr>
             <w:tcW w:type="dxa" w:w="1440"/>
-            <w:tcMar>
-              <w:top w:w="80" w:type="dxa"/>
-              <w:bottom w:w="80" w:type="dxa"/>
-              <w:start w:w="100" w:type="dxa"/>
-              <w:end w:w="100" w:type="dxa"/>
-            </w:tcMar>
             <w:vAlign w:val="center"/>
-            <w:shd w:fill="E4ECFF"/>
           </w:tcPr>
           <w:p>
             <w:pPr>
-              <w:spacing w:after="0"/>
+              <w:spacing w:after="0" w:line="276" w:lineRule="auto"/>
             </w:pPr>
-            <w:r/>
             <w:r>
               <w:rPr>
-                <w:rFonts w:ascii="Arial" w:hAnsi="Arial" w:eastAsia="Apple SD Gothic Neo"/>
-                <w:b/>
-                <w:sz w:val="17"/>
+                <w:rFonts w:ascii="Pretendard" w:hAnsi="Pretendard" w:eastAsia="Pretendard"/>
+                <w:b w:val="0"/>
+                <w:sz w:val="18"/>
               </w:rPr>
               <w:t>자동 계산/보정</w:t>
             </w:r>
@@ -3155,53 +2429,39 @@
         </w:tc>
         <w:tc>
           <w:tcPr>
-            <w:tcW w:type="dxa" w:w="3024"/>
-            <w:tcMar>
-              <w:top w:w="80" w:type="dxa"/>
-              <w:bottom w:w="80" w:type="dxa"/>
-              <w:start w:w="100" w:type="dxa"/>
-              <w:end w:w="100" w:type="dxa"/>
-            </w:tcMar>
+            <w:tcW w:type="dxa" w:w="2664"/>
             <w:vAlign w:val="center"/>
           </w:tcPr>
           <w:p>
             <w:pPr>
-              <w:spacing w:after="0"/>
+              <w:spacing w:after="0" w:line="276" w:lineRule="auto"/>
             </w:pPr>
-            <w:r/>
             <w:r>
               <w:rPr>
-                <w:rFonts w:ascii="Arial" w:hAnsi="Arial" w:eastAsia="Apple SD Gothic Neo"/>
+                <w:rFonts w:ascii="Pretendard" w:hAnsi="Pretendard" w:eastAsia="Pretendard"/>
                 <w:b w:val="0"/>
-                <w:sz w:val="16"/>
+                <w:sz w:val="18"/>
               </w:rPr>
-              <w:t>사용자 운영 액션 또는 계정 &gt; 사용자 상세</w:t>
+              <w:t>사용자 운영 액션 또는 사용자 상세</w:t>
             </w:r>
           </w:p>
         </w:tc>
         <w:tc>
           <w:tcPr>
-            <w:tcW w:type="dxa" w:w="3312"/>
-            <w:tcMar>
-              <w:top w:w="80" w:type="dxa"/>
-              <w:bottom w:w="80" w:type="dxa"/>
-              <w:start w:w="100" w:type="dxa"/>
-              <w:end w:w="100" w:type="dxa"/>
-            </w:tcMar>
+            <w:tcW w:type="dxa" w:w="3168"/>
             <w:vAlign w:val="center"/>
           </w:tcPr>
           <w:p>
             <w:pPr>
-              <w:spacing w:after="0"/>
+              <w:spacing w:after="0" w:line="276" w:lineRule="auto"/>
             </w:pPr>
-            <w:r/>
             <w:r>
               <w:rPr>
-                <w:rFonts w:ascii="Arial" w:hAnsi="Arial" w:eastAsia="Apple SD Gothic Neo"/>
+                <w:rFonts w:ascii="Pretendard" w:hAnsi="Pretendard" w:eastAsia="Pretendard"/>
                 <w:b w:val="0"/>
-                <w:sz w:val="16"/>
+                <w:sz w:val="18"/>
               </w:rPr>
-              <w:t>출산예정일/주차 기준값 보정 필드 필요</w:t>
+              <w:t>출산예정일 또는 임신 시작 기준일을 관리자 화면에서 확인/수정할 수 있어야 함</w:t>
             </w:r>
           </w:p>
         </w:tc>
@@ -3209,52 +2469,37 @@
       <w:tr>
         <w:tc>
           <w:tcPr>
-            <w:tcW w:type="dxa" w:w="2448"/>
-            <w:tcMar>
-              <w:top w:w="80" w:type="dxa"/>
-              <w:bottom w:w="80" w:type="dxa"/>
-              <w:start w:w="100" w:type="dxa"/>
-              <w:end w:w="100" w:type="dxa"/>
-            </w:tcMar>
+            <w:tcW w:type="dxa" w:w="2520"/>
             <w:vAlign w:val="center"/>
           </w:tcPr>
           <w:p>
             <w:pPr>
-              <w:spacing w:after="0"/>
+              <w:spacing w:after="0" w:line="276" w:lineRule="auto"/>
             </w:pPr>
-            <w:r/>
             <w:r>
               <w:rPr>
-                <w:rFonts w:ascii="Arial" w:hAnsi="Arial" w:eastAsia="Apple SD Gothic Neo"/>
+                <w:rFonts w:ascii="Pretendard" w:hAnsi="Pretendard" w:eastAsia="Pretendard"/>
                 <w:b w:val="0"/>
-                <w:sz w:val="16"/>
+                <w:sz w:val="18"/>
               </w:rPr>
-              <w:t>앱: 사용자 상태/접근 제어</w:t>
+              <w:t>사용자 상태 / 접근 제어</w:t>
             </w:r>
           </w:p>
         </w:tc>
         <w:tc>
           <w:tcPr>
             <w:tcW w:type="dxa" w:w="1440"/>
-            <w:tcMar>
-              <w:top w:w="80" w:type="dxa"/>
-              <w:bottom w:w="80" w:type="dxa"/>
-              <w:start w:w="100" w:type="dxa"/>
-              <w:end w:w="100" w:type="dxa"/>
-            </w:tcMar>
             <w:vAlign w:val="center"/>
-            <w:shd w:fill="E4ECFF"/>
           </w:tcPr>
           <w:p>
             <w:pPr>
-              <w:spacing w:after="0"/>
+              <w:spacing w:after="0" w:line="276" w:lineRule="auto"/>
             </w:pPr>
-            <w:r/>
             <w:r>
               <w:rPr>
-                <w:rFonts w:ascii="Arial" w:hAnsi="Arial" w:eastAsia="Apple SD Gothic Neo"/>
-                <w:b/>
-                <w:sz w:val="17"/>
+                <w:rFonts w:ascii="Pretendard" w:hAnsi="Pretendard" w:eastAsia="Pretendard"/>
+                <w:b w:val="0"/>
+                <w:sz w:val="18"/>
               </w:rPr>
               <w:t>현재 있음</w:t>
             </w:r>
@@ -3262,25 +2507,18 @@
         </w:tc>
         <w:tc>
           <w:tcPr>
-            <w:tcW w:type="dxa" w:w="3024"/>
-            <w:tcMar>
-              <w:top w:w="80" w:type="dxa"/>
-              <w:bottom w:w="80" w:type="dxa"/>
-              <w:start w:w="100" w:type="dxa"/>
-              <w:end w:w="100" w:type="dxa"/>
-            </w:tcMar>
+            <w:tcW w:type="dxa" w:w="2664"/>
             <w:vAlign w:val="center"/>
           </w:tcPr>
           <w:p>
             <w:pPr>
-              <w:spacing w:after="0"/>
+              <w:spacing w:after="0" w:line="276" w:lineRule="auto"/>
             </w:pPr>
-            <w:r/>
             <w:r>
               <w:rPr>
-                <w:rFonts w:ascii="Arial" w:hAnsi="Arial" w:eastAsia="Apple SD Gothic Neo"/>
+                <w:rFonts w:ascii="Pretendard" w:hAnsi="Pretendard" w:eastAsia="Pretendard"/>
                 <w:b w:val="0"/>
-                <w:sz w:val="16"/>
+                <w:sz w:val="18"/>
               </w:rPr>
               <w:t>사용자 운영 액션</w:t>
             </w:r>
@@ -3288,88 +2526,66 @@
         </w:tc>
         <w:tc>
           <w:tcPr>
-            <w:tcW w:type="dxa" w:w="3312"/>
-            <w:tcMar>
-              <w:top w:w="80" w:type="dxa"/>
-              <w:bottom w:w="80" w:type="dxa"/>
-              <w:start w:w="100" w:type="dxa"/>
-              <w:end w:w="100" w:type="dxa"/>
-            </w:tcMar>
+            <w:tcW w:type="dxa" w:w="3168"/>
             <w:vAlign w:val="center"/>
           </w:tcPr>
           <w:p>
             <w:pPr>
-              <w:spacing w:after="0"/>
+              <w:spacing w:after="0" w:line="276" w:lineRule="auto"/>
             </w:pPr>
-            <w:r/>
             <w:r>
               <w:rPr>
-                <w:rFonts w:ascii="Arial" w:hAnsi="Arial" w:eastAsia="Apple SD Gothic Neo"/>
+                <w:rFonts w:ascii="Pretendard" w:hAnsi="Pretendard" w:eastAsia="Pretendard"/>
                 <w:b w:val="0"/>
-                <w:sz w:val="16"/>
+                <w:sz w:val="18"/>
               </w:rPr>
-              <w:t>계정 상태 조회/운영 조치</w:t>
+              <w:t>계정 상태를 조회하고 필요한 운영 조치를 할 수 있는지 확인</w:t>
             </w:r>
           </w:p>
         </w:tc>
       </w:tr>
     </w:tbl>
-    <w:p/>
+    <w:p>
+      <w:pPr>
+        <w:spacing w:after="80"/>
+      </w:pPr>
+    </w:p>
     <w:p>
       <w:pPr>
         <w:pStyle w:val="Heading1"/>
+        <w:spacing w:before="160" w:after="160"/>
       </w:pPr>
       <w:r>
-        <w:rPr>
-          <w:rFonts w:ascii="Arial" w:hAnsi="Arial" w:eastAsia="Apple SD Gothic Neo"/>
-          <w:b/>
-          <w:color w:val="2E5C96"/>
-          <w:sz w:val="30"/>
-        </w:rPr>
-        <w:t>외주사 검수 요구</w:t>
+        <w:t>관리자 검수 기준</w:t>
       </w:r>
     </w:p>
     <w:tbl>
       <w:tblPr>
+        <w:tblStyle w:val="TableGrid"/>
         <w:tblW w:type="auto" w:w="0"/>
-        <w:jc w:val="left"/>
-        <w:tblLayout w:type="fixed"/>
+        <w:jc w:val="center"/>
         <w:tblLook w:firstColumn="1" w:firstRow="1" w:lastColumn="0" w:lastRow="0" w:noHBand="0" w:noVBand="1" w:val="04A0"/>
-        <w:tblBorders>
-          <w:top w:val="single" w:sz="4" w:space="0" w:color="DADCE0"/>
-          <w:left w:val="single" w:sz="4" w:space="0" w:color="DADCE0"/>
-          <w:bottom w:val="single" w:sz="4" w:space="0" w:color="DADCE0"/>
-          <w:right w:val="single" w:sz="4" w:space="0" w:color="DADCE0"/>
-          <w:insideH w:val="single" w:sz="4" w:space="0" w:color="DADCE0"/>
-          <w:insideV w:val="single" w:sz="4" w:space="0" w:color="DADCE0"/>
-        </w:tblBorders>
       </w:tblPr>
       <w:tblGrid>
-        <w:gridCol w:w="5112"/>
-        <w:gridCol w:w="5112"/>
+        <w:gridCol w:w="5040"/>
+        <w:gridCol w:w="5040"/>
       </w:tblGrid>
       <w:tr>
         <w:tc>
           <w:tcPr>
-            <w:tcW w:type="dxa" w:w="2160"/>
-            <w:tcMar>
-              <w:top w:w="80" w:type="dxa"/>
-              <w:bottom w:w="80" w:type="dxa"/>
-              <w:start w:w="100" w:type="dxa"/>
-              <w:end w:w="100" w:type="dxa"/>
-            </w:tcMar>
-            <w:shd w:fill="F3F4F6"/>
+            <w:tcW w:type="dxa" w:w="2880"/>
+            <w:vAlign w:val="center"/>
+            <w:shd w:fill="EEF3F8"/>
           </w:tcPr>
           <w:p>
             <w:pPr>
-              <w:spacing w:after="0"/>
+              <w:spacing w:after="0" w:line="276" w:lineRule="auto"/>
             </w:pPr>
-            <w:r/>
             <w:r>
               <w:rPr>
-                <w:rFonts w:ascii="Arial" w:hAnsi="Arial" w:eastAsia="Apple SD Gothic Neo"/>
+                <w:rFonts w:ascii="Pretendard" w:hAnsi="Pretendard" w:eastAsia="Pretendard"/>
                 <w:b/>
-                <w:sz w:val="17"/>
+                <w:sz w:val="18"/>
               </w:rPr>
               <w:t>항목</w:t>
             </w:r>
@@ -3377,27 +2593,21 @@
         </w:tc>
         <w:tc>
           <w:tcPr>
-            <w:tcW w:type="dxa" w:w="8064"/>
-            <w:tcMar>
-              <w:top w:w="80" w:type="dxa"/>
-              <w:bottom w:w="80" w:type="dxa"/>
-              <w:start w:w="100" w:type="dxa"/>
-              <w:end w:w="100" w:type="dxa"/>
-            </w:tcMar>
-            <w:shd w:fill="F3F4F6"/>
+            <w:tcW w:type="dxa" w:w="6912"/>
+            <w:vAlign w:val="center"/>
+            <w:shd w:fill="EEF3F8"/>
           </w:tcPr>
           <w:p>
             <w:pPr>
-              <w:spacing w:after="0"/>
+              <w:spacing w:after="0" w:line="276" w:lineRule="auto"/>
             </w:pPr>
-            <w:r/>
             <w:r>
               <w:rPr>
-                <w:rFonts w:ascii="Arial" w:hAnsi="Arial" w:eastAsia="Apple SD Gothic Neo"/>
+                <w:rFonts w:ascii="Pretendard" w:hAnsi="Pretendard" w:eastAsia="Pretendard"/>
                 <w:b/>
-                <w:sz w:val="17"/>
+                <w:sz w:val="18"/>
               </w:rPr>
-              <w:t>요구사항</w:t>
+              <w:t>확인 기준</w:t>
             </w:r>
           </w:p>
         </w:tc>
@@ -3405,25 +2615,18 @@
       <w:tr>
         <w:tc>
           <w:tcPr>
-            <w:tcW w:type="dxa" w:w="2160"/>
-            <w:tcMar>
-              <w:top w:w="80" w:type="dxa"/>
-              <w:bottom w:w="80" w:type="dxa"/>
-              <w:start w:w="100" w:type="dxa"/>
-              <w:end w:w="100" w:type="dxa"/>
-            </w:tcMar>
+            <w:tcW w:type="dxa" w:w="2880"/>
             <w:vAlign w:val="center"/>
           </w:tcPr>
           <w:p>
             <w:pPr>
-              <w:spacing w:after="0"/>
+              <w:spacing w:after="0" w:line="276" w:lineRule="auto"/>
             </w:pPr>
-            <w:r/>
             <w:r>
               <w:rPr>
-                <w:rFonts w:ascii="Arial" w:hAnsi="Arial" w:eastAsia="Apple SD Gothic Neo"/>
+                <w:rFonts w:ascii="Pretendard" w:hAnsi="Pretendard" w:eastAsia="Pretendard"/>
                 <w:b w:val="0"/>
-                <w:sz w:val="16"/>
+                <w:sz w:val="18"/>
               </w:rPr>
               <w:t>관리자 화면 증빙</w:t>
             </w:r>
@@ -3431,27 +2634,20 @@
         </w:tc>
         <w:tc>
           <w:tcPr>
-            <w:tcW w:type="dxa" w:w="8064"/>
-            <w:tcMar>
-              <w:top w:w="80" w:type="dxa"/>
-              <w:bottom w:w="80" w:type="dxa"/>
-              <w:start w:w="100" w:type="dxa"/>
-              <w:end w:w="100" w:type="dxa"/>
-            </w:tcMar>
+            <w:tcW w:type="dxa" w:w="6912"/>
             <w:vAlign w:val="center"/>
           </w:tcPr>
           <w:p>
             <w:pPr>
-              <w:spacing w:after="0"/>
+              <w:spacing w:after="0" w:line="276" w:lineRule="auto"/>
             </w:pPr>
-            <w:r/>
             <w:r>
               <w:rPr>
-                <w:rFonts w:ascii="Arial" w:hAnsi="Arial" w:eastAsia="Apple SD Gothic Neo"/>
+                <w:rFonts w:ascii="Pretendard" w:hAnsi="Pretendard" w:eastAsia="Pretendard"/>
                 <w:b w:val="0"/>
-                <w:sz w:val="16"/>
+                <w:sz w:val="18"/>
               </w:rPr>
-              <w:t>각 수정 항목마다 관리자 웹 경로와 저장 화면 캡처를 제출해야 합니다.</w:t>
+              <w:t>각 수정 항목마다 관리자 웹 경로와 저장 화면 캡처가 있어야 합니다.</w:t>
             </w:r>
           </w:p>
         </w:tc>
@@ -3459,25 +2655,18 @@
       <w:tr>
         <w:tc>
           <w:tcPr>
-            <w:tcW w:type="dxa" w:w="2160"/>
-            <w:tcMar>
-              <w:top w:w="80" w:type="dxa"/>
-              <w:bottom w:w="80" w:type="dxa"/>
-              <w:start w:w="100" w:type="dxa"/>
-              <w:end w:w="100" w:type="dxa"/>
-            </w:tcMar>
+            <w:tcW w:type="dxa" w:w="2880"/>
             <w:vAlign w:val="center"/>
           </w:tcPr>
           <w:p>
             <w:pPr>
-              <w:spacing w:after="0"/>
+              <w:spacing w:after="0" w:line="276" w:lineRule="auto"/>
             </w:pPr>
-            <w:r/>
             <w:r>
               <w:rPr>
-                <w:rFonts w:ascii="Arial" w:hAnsi="Arial" w:eastAsia="Apple SD Gothic Neo"/>
+                <w:rFonts w:ascii="Pretendard" w:hAnsi="Pretendard" w:eastAsia="Pretendard"/>
                 <w:b w:val="0"/>
-                <w:sz w:val="16"/>
+                <w:sz w:val="18"/>
               </w:rPr>
               <w:t>앱 반영 증빙</w:t>
             </w:r>
@@ -3485,27 +2674,20 @@
         </w:tc>
         <w:tc>
           <w:tcPr>
-            <w:tcW w:type="dxa" w:w="8064"/>
-            <w:tcMar>
-              <w:top w:w="80" w:type="dxa"/>
-              <w:bottom w:w="80" w:type="dxa"/>
-              <w:start w:w="100" w:type="dxa"/>
-              <w:end w:w="100" w:type="dxa"/>
-            </w:tcMar>
+            <w:tcW w:type="dxa" w:w="6912"/>
             <w:vAlign w:val="center"/>
           </w:tcPr>
           <w:p>
             <w:pPr>
-              <w:spacing w:after="0"/>
+              <w:spacing w:after="0" w:line="276" w:lineRule="auto"/>
             </w:pPr>
-            <w:r/>
             <w:r>
               <w:rPr>
-                <w:rFonts w:ascii="Arial" w:hAnsi="Arial" w:eastAsia="Apple SD Gothic Neo"/>
+                <w:rFonts w:ascii="Pretendard" w:hAnsi="Pretendard" w:eastAsia="Pretendard"/>
                 <w:b w:val="0"/>
-                <w:sz w:val="16"/>
+                <w:sz w:val="18"/>
               </w:rPr>
-              <w:t>저장 후 앱 화면에서 실제 문구/노출 상태가 바뀐 캡처를 제출해야 합니다.</w:t>
+              <w:t>저장 후 앱 화면에서 실제 문구 또는 노출 상태가 바뀐 캡처가 있어야 합니다.</w:t>
             </w:r>
           </w:p>
         </w:tc>
@@ -3513,25 +2695,18 @@
       <w:tr>
         <w:tc>
           <w:tcPr>
-            <w:tcW w:type="dxa" w:w="2160"/>
-            <w:tcMar>
-              <w:top w:w="80" w:type="dxa"/>
-              <w:bottom w:w="80" w:type="dxa"/>
-              <w:start w:w="100" w:type="dxa"/>
-              <w:end w:w="100" w:type="dxa"/>
-            </w:tcMar>
+            <w:tcW w:type="dxa" w:w="2880"/>
             <w:vAlign w:val="center"/>
           </w:tcPr>
           <w:p>
             <w:pPr>
-              <w:spacing w:after="0"/>
+              <w:spacing w:after="0" w:line="276" w:lineRule="auto"/>
             </w:pPr>
-            <w:r/>
             <w:r>
               <w:rPr>
-                <w:rFonts w:ascii="Arial" w:hAnsi="Arial" w:eastAsia="Apple SD Gothic Neo"/>
+                <w:rFonts w:ascii="Pretendard" w:hAnsi="Pretendard" w:eastAsia="Pretendard"/>
                 <w:b w:val="0"/>
-                <w:sz w:val="16"/>
+                <w:sz w:val="18"/>
               </w:rPr>
               <w:t>보완 필요 항목</w:t>
             </w:r>
@@ -3539,27 +2714,20 @@
         </w:tc>
         <w:tc>
           <w:tcPr>
-            <w:tcW w:type="dxa" w:w="8064"/>
-            <w:tcMar>
-              <w:top w:w="80" w:type="dxa"/>
-              <w:bottom w:w="80" w:type="dxa"/>
-              <w:start w:w="100" w:type="dxa"/>
-              <w:end w:w="100" w:type="dxa"/>
-            </w:tcMar>
+            <w:tcW w:type="dxa" w:w="6912"/>
             <w:vAlign w:val="center"/>
           </w:tcPr>
           <w:p>
             <w:pPr>
-              <w:spacing w:after="0"/>
+              <w:spacing w:after="0" w:line="276" w:lineRule="auto"/>
             </w:pPr>
-            <w:r/>
             <w:r>
               <w:rPr>
-                <w:rFonts w:ascii="Arial" w:hAnsi="Arial" w:eastAsia="Apple SD Gothic Neo"/>
+                <w:rFonts w:ascii="Pretendard" w:hAnsi="Pretendard" w:eastAsia="Pretendard"/>
                 <w:b w:val="0"/>
-                <w:sz w:val="16"/>
+                <w:sz w:val="18"/>
               </w:rPr>
-              <w:t>새 필드 또는 화면을 추가하고, 기존 고정 문구로 남기지 않아야 합니다.</w:t>
+              <w:t>관리자 화면에서 직접 바꿀 수 있는 메뉴나 입력칸이 있어야 하며, 고정 문구로 남기면 안 됩니다.</w:t>
             </w:r>
           </w:p>
         </w:tc>
@@ -3567,25 +2735,18 @@
       <w:tr>
         <w:tc>
           <w:tcPr>
-            <w:tcW w:type="dxa" w:w="2160"/>
-            <w:tcMar>
-              <w:top w:w="80" w:type="dxa"/>
-              <w:bottom w:w="80" w:type="dxa"/>
-              <w:start w:w="100" w:type="dxa"/>
-              <w:end w:w="100" w:type="dxa"/>
-            </w:tcMar>
+            <w:tcW w:type="dxa" w:w="2880"/>
             <w:vAlign w:val="center"/>
           </w:tcPr>
           <w:p>
             <w:pPr>
-              <w:spacing w:after="0"/>
+              <w:spacing w:after="0" w:line="276" w:lineRule="auto"/>
             </w:pPr>
-            <w:r/>
             <w:r>
               <w:rPr>
-                <w:rFonts w:ascii="Arial" w:hAnsi="Arial" w:eastAsia="Apple SD Gothic Neo"/>
+                <w:rFonts w:ascii="Pretendard" w:hAnsi="Pretendard" w:eastAsia="Pretendard"/>
                 <w:b w:val="0"/>
-                <w:sz w:val="16"/>
+                <w:sz w:val="18"/>
               </w:rPr>
               <w:t>자동 계산/보정 항목</w:t>
             </w:r>
@@ -3593,36 +2754,33 @@
         </w:tc>
         <w:tc>
           <w:tcPr>
-            <w:tcW w:type="dxa" w:w="8064"/>
-            <w:tcMar>
-              <w:top w:w="80" w:type="dxa"/>
-              <w:bottom w:w="80" w:type="dxa"/>
-              <w:start w:w="100" w:type="dxa"/>
-              <w:end w:w="100" w:type="dxa"/>
-            </w:tcMar>
+            <w:tcW w:type="dxa" w:w="6912"/>
             <w:vAlign w:val="center"/>
           </w:tcPr>
           <w:p>
             <w:pPr>
-              <w:spacing w:after="0"/>
+              <w:spacing w:after="0" w:line="276" w:lineRule="auto"/>
             </w:pPr>
-            <w:r/>
             <w:r>
               <w:rPr>
-                <w:rFonts w:ascii="Arial" w:hAnsi="Arial" w:eastAsia="Apple SD Gothic Neo"/>
+                <w:rFonts w:ascii="Pretendard" w:hAnsi="Pretendard" w:eastAsia="Pretendard"/>
                 <w:b w:val="0"/>
-                <w:sz w:val="16"/>
+                <w:sz w:val="18"/>
               </w:rPr>
-              <w:t>콘텐츠 CMS가 아니라 사용자 상세/운영 액션에서 기준값 보정이 가능해야 합니다.</w:t>
+              <w:t>사용자 상세 또는 운영 화면에서 기준일을 확인하고 보정할 수 있어야 합니다.</w:t>
             </w:r>
           </w:p>
         </w:tc>
       </w:tr>
     </w:tbl>
-    <w:p/>
+    <w:p>
+      <w:pPr>
+        <w:spacing w:after="80"/>
+      </w:pPr>
+    </w:p>
     <w:sectPr>
       <w:pgSz w:w="12240" w:h="15840"/>
-      <w:pgMar w:top="1008" w:right="1008" w:bottom="1008" w:left="1008" w:header="720" w:footer="720" w:gutter="0"/>
+      <w:pgMar w:top="936" w:right="1080" w:bottom="936" w:left="1080" w:header="720" w:footer="720" w:gutter="0"/>
       <w:cols w:space="720"/>
       <w:docGrid w:linePitch="360"/>
     </w:sectPr>
@@ -3993,12 +3151,9 @@
     <w:name w:val="Normal"/>
     <w:qFormat/>
     <w:rsid w:val="00FC693F"/>
-    <w:pPr>
-      <w:spacing w:after="100"/>
-    </w:pPr>
     <w:rPr>
-      <w:rFonts w:ascii="Arial" w:hAnsi="Arial" w:eastAsia="Apple SD Gothic Neo"/>
-      <w:sz w:val="20"/>
+      <w:rFonts w:ascii="Pretendard" w:hAnsi="Pretendard" w:eastAsia="Pretendard"/>
+      <w:sz w:val="21"/>
     </w:rPr>
   </w:style>
   <w:style w:type="paragraph" w:styleId="Header">
@@ -4060,11 +3215,11 @@
       <w:outlineLvl w:val="0"/>
     </w:pPr>
     <w:rPr>
-      <w:rFonts w:asciiTheme="majorHAnsi" w:eastAsiaTheme="majorEastAsia" w:hAnsiTheme="majorHAnsi" w:cstheme="majorBidi" w:ascii="Arial" w:hAnsi="Arial" w:eastAsia="Apple SD Gothic Neo"/>
+      <w:rFonts w:asciiTheme="majorHAnsi" w:eastAsiaTheme="majorEastAsia" w:hAnsiTheme="majorHAnsi" w:cstheme="majorBidi" w:ascii="Pretendard" w:hAnsi="Pretendard" w:eastAsia="Pretendard"/>
       <w:b/>
       <w:bCs/>
-      <w:color w:val="365F91" w:themeColor="accent1" w:themeShade="BF"/>
-      <w:sz w:val="30"/>
+      <w:color w:val="245C9B"/>
+      <w:sz w:val="34"/>
       <w:szCs w:val="28"/>
     </w:rPr>
   </w:style>
@@ -4084,11 +3239,11 @@
       <w:outlineLvl w:val="1"/>
     </w:pPr>
     <w:rPr>
-      <w:rFonts w:asciiTheme="majorHAnsi" w:eastAsiaTheme="majorEastAsia" w:hAnsiTheme="majorHAnsi" w:cstheme="majorBidi" w:ascii="Arial" w:hAnsi="Arial" w:eastAsia="Apple SD Gothic Neo"/>
+      <w:rFonts w:asciiTheme="majorHAnsi" w:eastAsiaTheme="majorEastAsia" w:hAnsiTheme="majorHAnsi" w:cstheme="majorBidi" w:ascii="Pretendard" w:hAnsi="Pretendard" w:eastAsia="Pretendard"/>
       <w:b/>
       <w:bCs/>
-      <w:color w:val="4F81BD" w:themeColor="accent1"/>
-      <w:sz w:val="24"/>
+      <w:color w:val="173B66"/>
+      <w:sz w:val="26"/>
       <w:szCs w:val="26"/>
     </w:rPr>
   </w:style>
@@ -4349,11 +3504,12 @@
       <w:contextualSpacing/>
     </w:pPr>
     <w:rPr>
-      <w:rFonts w:asciiTheme="majorHAnsi" w:eastAsiaTheme="majorEastAsia" w:hAnsiTheme="majorHAnsi" w:cstheme="majorBidi" w:ascii="Arial" w:hAnsi="Arial" w:eastAsia="Apple SD Gothic Neo"/>
-      <w:color w:val="17365D" w:themeColor="text2" w:themeShade="BF"/>
+      <w:rFonts w:asciiTheme="majorHAnsi" w:eastAsiaTheme="majorEastAsia" w:hAnsiTheme="majorHAnsi" w:cstheme="majorBidi" w:ascii="Pretendard" w:hAnsi="Pretendard" w:eastAsia="Pretendard"/>
+      <w:b/>
+      <w:color w:val="173B66"/>
       <w:spacing w:val="5"/>
       <w:kern w:val="28"/>
-      <w:sz w:val="44"/>
+      <w:sz w:val="48"/>
       <w:szCs w:val="52"/>
     </w:rPr>
   </w:style>
@@ -4386,12 +3542,13 @@
       </w:numPr>
     </w:pPr>
     <w:rPr>
-      <w:rFonts w:asciiTheme="majorHAnsi" w:eastAsiaTheme="majorEastAsia" w:hAnsiTheme="majorHAnsi" w:cstheme="majorBidi"/>
+      <w:rFonts w:asciiTheme="majorHAnsi" w:eastAsiaTheme="majorEastAsia" w:hAnsiTheme="majorHAnsi" w:cstheme="majorBidi" w:ascii="Pretendard" w:hAnsi="Pretendard" w:eastAsia="Pretendard"/>
+      <w:b/>
       <w:i/>
       <w:iCs/>
-      <w:color w:val="4F81BD" w:themeColor="accent1"/>
+      <w:color w:val="555555"/>
       <w:spacing w:val="15"/>
-      <w:sz w:val="24"/>
+      <w:sz w:val="26"/>
       <w:szCs w:val="24"/>
     </w:rPr>
   </w:style>

</xml_diff>